<commit_message>
Fix field name in tests
</commit_message>
<xml_diff>
--- a/src/Apps/W1/Subcontracting/App/src/Process/Reports/SubcDispatchingList.docx
+++ b/src/Apps/W1/Subcontracting/App/src/Process/Reports/SubcDispatchingList.docx
@@ -17712,6 +17712,1485 @@
  < / N a v W o r d R e p o r t X m l P a r t > 
 </file>
 
+<file path=customXml/item4.xml>��< ? x m l   v e r s i o n = " 1 . 0 "   e n c o d i n g = " u t f - 1 6 " ? > + 
+ < N a v W o r d R e p o r t X m l P a r t   x m l n s = " u r n : m i c r o s o f t - d y n a m i c s - b u s i n e s s c e n t r a l / i n t e r n a l / e x t e n d e d / r e p o r t s / S u b c _ D i s p a t c h i n g _ L i s t / 9 9 0 0 1 5 0 4 / " > + 
+     < B C R e p o r t I n f o r m a t i o n > + 
+         < R e p o r t M e t a d a t a > + 
+             < E x t e n s i o n I d > E x t e n s i o n   I D < / E x t e n s i o n I d > + 
+             < E x t e n s i o n N a m e > E x t e n s i o n   N a m e < / E x t e n s i o n N a m e > + 
+             < E x t e n s i o n P u b l i s h e r > E x t e n s i o n   P u b l i s h e r < / E x t e n s i o n P u b l i s h e r > + 
+             < E x t e n s i o n V e r s i o n > E x t e n s i o n   V e r s i o n < / E x t e n s i o n V e r s i o n > + 
+             < R e p o r t I d > R e p o r t   I D < / R e p o r t I d > + 
+             < R e p o r t N a m e > R e p o r t   N a m e < / R e p o r t N a m e > + 
+             < A b o u t T h i s R e p o r t T i t l e > A b o u t   T h i s   R e p o r t   T i t l e < / A b o u t T h i s R e p o r t T i t l e > + 
+             < A b o u t T h i s R e p o r t T e x t > A b o u t   T h i s   R e p o r t   T e x t < / A b o u t T h i s R e p o r t T e x t > + 
+             < R e p o r t H e l p L i n k > R e p o r t   H e l p   L i n k < / R e p o r t H e l p L i n k > + 
+         < / R e p o r t M e t a d a t a > + 
+         < R e p o r t R e q u e s t > + 
+             < T e n a n t E n t r a I d > T e n a n t   E n t r a   I d < / T e n a n t E n t r a I d > + 
+             < E n v i r o n m e n t N a m e > E n v i r o n m e n t   N a m e < / E n v i r o n m e n t N a m e > + 
+             < E n v i r o n m e n t T y p e > E n v i r o n m e n t   T y p e < / E n v i r o n m e n t T y p e > + 
+             < C o m p a n y N a m e > C o m p a n y   N a m e < / C o m p a n y N a m e > + 
+             < C o m p a n y D i s p l a y N a m e > C o m p a n y   D i s p l a y   N a m e < / C o m p a n y D i s p l a y N a m e > + 
+             < C o m p a n y I d > C o m p a n y   I D < / C o m p a n y I d > + 
+             < U s e r N a m e > U s e r   N a m e < / U s e r N a m e > + 
+             < D a t e A n d T i m e > D a t e   a n d   T i m e < / D a t e A n d T i m e > + 
+             < L a n g u a g e > L a n g u a g e < / L a n g u a g e > + 
+             < F o r m a t R e g i o n > F o r m a t   R e g i o n < / F o r m a t R e g i o n > + 
+             < D a t e T i m e V a l u e s > + 
+                 < Y e a r > Y e a r < / Y e a r > + 
+                 < M o n t h N u m b e r > M o n t h   N u m b e r < / M o n t h N u m b e r > + 
+                 < D a y N u m b e r > D a y   N u m b e r < / D a y N u m b e r > + 
+                 < H o u r > H o u r < / H o u r > + 
+                 < M i n u t e > M i n u t e < / M i n u t e > + 
+             < / D a t e T i m e V a l u e s > + 
+         < / R e p o r t R e q u e s t > + 
+     < / B C R e p o r t I n f o r m a t i o n > + 
+     < T o o l t i p s > + 
+         < T o o l t i p   c o l u m n = " B u y F r m V e n d N o _ P u r c h H e a d e r "   E l e m e n t I d = " 1 1 4 1 1 5 6 0 2 " > + 
+             < T o o l t i p T e x t   l a n g = " e n - U S " > S p e c i f i e s   t h e   v e n d o r   w h o   w i l l   d e l i v e r   t h e   g o o d s   o r   s e r v i c e s .   E a c h   v e n d o r   h a s   a   u n i q u e   n u m b e r   t o   h e l p   y o u   t r a c k   r e l a t e d   d o c u m e n t s .   T h e   n u m b e r   c a n   c o m e   f r o m   a   n u m b e r   s e r i e s   o r   b e   a d d e d   m a n u a l l y . < / T o o l t i p T e x t > + 
+         < / T o o l t i p > + 
+         < T o o l t i p   c o l u m n = " B u y F r o m C o n t a c t E m a i l "   E l e m e n t I d = " 1 4 6 0 8 4 1 4 4 9 " > + 
+             < T o o l t i p T e x t   l a n g = " e n - U S " > S p e c i f i e s   t h e   e m a i l   a d d r e s s   o f   t h e   c o n t a c t . < / T o o l t i p T e x t > + 
+         < / T o o l t i p > + 
+         < T o o l t i p   c o l u m n = " B u y F r o m C o n t a c t M o b i l e P h o n e N o "   E l e m e n t I d = " 6 8 2 3 8 6 3 9 2 " > + 
+             < T o o l t i p T e x t   l a n g = " e n - U S " > S p e c i f i e s   t h e   c o n t a c t ' s   m o b i l e   t e l e p h o n e   n u m b e r . < / T o o l t i p T e x t > + 
+         < / T o o l t i p > + 
+         < T o o l t i p   c o l u m n = " B u y F r o m C o n t a c t P h o n e N o "   E l e m e n t I d = " 1 6 2 4 1 1 6 4 9 6 " > + 
+             < T o o l t i p T e x t   l a n g = " e n - U S " > S p e c i f i e s   t h e   c o n t a c t ' s   p h o n e   n u m b e r . < / T o o l t i p T e x t > + 
+         < / T o o l t i p > + 
+         < T o o l t i p   c o l u m n = " C o m p a n y B a n k A c c o u n t N o "   E l e m e n t I d = " 3 0 1 4 0 2 0 4 " > + 
+             < T o o l t i p T e x t   l a n g = " e n - U S " > S p e c i f i e s   t h e   c o m p a n y ' s   b a n k   a c c o u n t   n u m b e r . < / T o o l t i p T e x t > + 
+         < / T o o l t i p > + 
+         < T o o l t i p   c o l u m n = " C o m p a n y B a n k B r a n c h N o "   E l e m e n t I d = " 7 9 3 1 3 3 0 5 7 " > + 
+             < T o o l t i p T e x t   l a n g = " e n - U S " > S p e c i f i e s   t h e   b a n k ' s   b r a n c h   n u m b e r . < / T o o l t i p T e x t > + 
+         < / T o o l t i p > + 
+         < T o o l t i p   c o l u m n = " C o m p a n y B a n k N a m e "   E l e m e n t I d = " 1 5 3 4 9 0 5 6 0 5 " > + 
+             < T o o l t i p T e x t   l a n g = " e n - U S " > S p e c i f i e s   t h e   n a m e   o f   t h e   b a n k   t h e   c o m p a n y   u s e s . < / T o o l t i p T e x t > + 
+         < / T o o l t i p > + 
+         < T o o l t i p   c o l u m n = " C o m p a n y E M a i l "   E l e m e n t I d = " 1 6 7 7 0 7 4 0 5 8 " > + 
+             < T o o l t i p T e x t   l a n g = " e n - U S " > S p e c i f i e s   t h e   c o m p a n y ' s   e m a i l   a d d r e s s . < / T o o l t i p T e x t > + 
+         < / T o o l t i p > + 
+         < T o o l t i p   c o l u m n = " C o m p a n y G i r o N o "   E l e m e n t I d = " 1 3 6 0 1 9 6 3 2 0 " > + 
+             < T o o l t i p T e x t   l a n g = " e n - U S " > S p e c i f i e s   t h e   c o m p a n y ' s   g i r o   n u m b e r . < / T o o l t i p T e x t > + 
+         < / T o o l t i p > + 
+         < T o o l t i p   c o l u m n = " C o m p a n y H o m e P a g e "   E l e m e n t I d = " 1 9 8 9 1 8 8 7 0 " > + 
+             < T o o l t i p T e x t   l a n g = " e n - U S " > S p e c i f i e s   y o u r   c o m p a n y ' s   w e b   s i t e . < / T o o l t i p T e x t > + 
+         < / T o o l t i p > + 
+         < T o o l t i p   c o l u m n = " C o m p a n y I B A N "   E l e m e n t I d = " 9 0 6 5 4 9 1 8 2 " > + 
+             < T o o l t i p T e x t   l a n g = " e n - U S " > S p e c i f i e s   t h e   i n t e r n a t i o n a l   b a n k   a c c o u n t   n u m b e r   o f   y o u r   p r i m a r y   b a n k   a c c o u n t . < / T o o l t i p T e x t > + 
+         < / T o o l t i p > + 
+         < T o o l t i p   c o l u m n = " C o m p a n y P h o n e N o "   E l e m e n t I d = " 2 5 0 4 4 0 6 5 5 " > + 
+             < T o o l t i p T e x t   l a n g = " e n - U S " > S p e c i f i e s   t h e   c o m p a n y ' s   t e l e p h o n e   n u m b e r . < / T o o l t i p T e x t > + 
+         < / T o o l t i p > + 
+         < T o o l t i p   c o l u m n = " C o m p a n y P i c t u r e "   E l e m e n t I d = " 1 3 9 7 4 1 1 0 7 4 " > + 
+             < T o o l t i p T e x t   l a n g = " e n - U S " > S p e c i f i e s   t h e   p i c t u r e   t h a t   h a s   b e e n   s e t   u p   f o r   t h e   c o m p a n y ,   s u c h   a s   a   c o m p a n y   l o g o . < / T o o l t i p T e x t > + 
+         < / T o o l t i p > + 
+         < T o o l t i p   c o l u m n = " C o m p a n y S W I F T "   E l e m e n t I d = " 6 6 8 2 5 0 2 4 5 " > + 
+             < T o o l t i p T e x t   l a n g = " e n - U S " > S p e c i f i e s   t h e   S W I F T   c o d e   ( i n t e r n a t i o n a l   b a n k   i d e n t i f i e r   c o d e )   o f   y o u r   p r i m a r y   b a n k . < / T o o l t i p T e x t > + 
+         < / T o o l t i p > + 
+         < T o o l t i p   c o l u m n = " S u b c B a r c o d e B a s e "   E l e m e n t I d = " 7 0 5 6 0 9 3 7 1 " > + 
+             < T o o l t i p T e x t   l a n g = " e n - U S " > S p e c i f i e s   t h e   p i c t u r e   t h a t   h a s   b e e n   s e t   u p   f o r   t h e   c o m p a n y ,   s u c h   a s   a   c o m p a n y   l o g o . < / T o o l t i p T e x t > + 
+         < / T o o l t i p > + 
+         < T o o l t i p   c o l u m n = " S u b c C o m p a n y I n f o 1 P i c t u r e "   E l e m e n t I d = " 1 0 5 2 1 8 7 7 9 8 " > + 
+             < T o o l t i p T e x t   l a n g = " e n - U S " > S p e c i f i e s   t h e   p i c t u r e   t h a t   h a s   b e e n   s e t   u p   f o r   t h e   c o m p a n y ,   s u c h   a s   a   c o m p a n y   l o g o . < / T o o l t i p T e x t > + 
+         < / T o o l t i p > + 
+         < T o o l t i p   c o l u m n = " S u b c C o m p a n y I n f o 2 P i c t u r e "   E l e m e n t I d = " 6 3 9 9 3 6 3 7 " > + 
+             < T o o l t i p T e x t   l a n g = " e n - U S " > S p e c i f i e s   t h e   p i c t u r e   t h a t   h a s   b e e n   s e t   u p   f o r   t h e   c o m p a n y ,   s u c h   a s   a   c o m p a n y   l o g o . < / T o o l t i p T e x t > + 
+         < / T o o l t i p > + 
+         < T o o l t i p   c o l u m n = " S u b c C o m p a n y I n f o P i c t u r e "   E l e m e n t I d = " 1 7 1 6 9 3 2 0 4 9 " > + 
+             < T o o l t i p T e x t   l a n g = " e n - U S " > S p e c i f i e s   t h e   p i c t u r e   t h a t   h a s   b e e n   s e t   u p   f o r   t h e   c o m p a n y ,   s u c h   a s   a   c o m p a n y   l o g o . < / T o o l t i p T e x t > + 
+         < / T o o l t i p > + 
+         < T o o l t i p   c o l u m n = " S u b c P u r c h D o c N u m "   E l e m e n t I d = " 4 6 3 0 2 3 5 6 8 " > + 
+             < T o o l t i p T e x t   l a n g = " e n - U S " > S p e c i f i e s   a   u n i q u e   n u m b e r   t h a t   i d e n t i f i e s   t h e   p u r c h a s e   o r d e r .   T h e   n u m b e r   c a n   b e   g e n e r a t e d   a u t o m a t i c a l l y   f r o m   a   n u m b e r   s e r i e s ,   o r   y o u   c a n   n u m b e r   e a c h   o f   t h e m   m a n u a l l y . < / T o o l t i p T e x t > + 
+         < / T o o l t i p > + 
+         < T o o l t i p   c o l u m n = " S u b c S a l e s p e r s o n "   E l e m e n t I d = " 1 7 0 8 9 4 8 1 9 1 " > + 
+             < T o o l t i p T e x t   l a n g = " e n - U S " > S p e c i f i e s   t h e   n a m e   o f   t h e   s a l e s p e r s o n   o r   p u r c h a s e r . < / T o o l t i p T e x t > + 
+         < / T o o l t i p > + 
+         < T o o l t i p   c o l u m n = " S u b c S a l e s P e r s o n E m a i l "   E l e m e n t I d = " 1 8 6 7 8 0 7 7 9 7 " > + 
+             < T o o l t i p T e x t   l a n g = " e n - U S " > S p e c i f i e s   t h e   s a l e s p e r s o n ' s   e m a i l   a d d r e s s . < / T o o l t i p T e x t > + 
+         < / T o o l t i p > + 
+         < T o o l t i p   c o l u m n = " S u b c S h p t M e t h o d D e s c "   E l e m e n t I d = " 1 8 7 7 3 0 1 7 7 1 " > + 
+             < T o o l t i p T e x t   l a n g = " e n - U S " > S p e c i f i e s   a   d e s c r i p t i o n   o f   t h e   s h i p m e n t   m e t h o d . < / T o o l t i p T e x t > + 
+         < / T o o l t i p > + 
+         < T o o l t i p   c o l u m n = " S u b c V e n d o r N o "   E l e m e n t I d = " 1 9 2 8 6 5 0 6 9 5 " > + 
+             < T o o l t i p T e x t   l a n g = " e n - U S " > S p e c i f i e s   t h e   v e n d o r   w h o   w i l l   d e l i v e r   t h e   g o o d s   o r   s e r v i c e s .   E a c h   v e n d o r   h a s   a   u n i q u e   n u m b e r   t o   h e l p   y o u   t r a c k   r e l a t e d   d o c u m e n t s .   T h e   n u m b e r   c a n   c o m e   f r o m   a   n u m b e r   s e r i e s   o r   b e   a d d e d   m a n u a l l y . < / T o o l t i p T e x t > + 
+         < / T o o l t i p > + 
+         < T o o l t i p   c o l u m n = " N o _ P u r c h H e a d e r "   E l e m e n t I d = " 5 2 0 3 3 9 3 5 2 " > + 
+             < T o o l t i p T e x t   l a n g = " e n - U S " > S p e c i f i e s   a   u n i q u e   n u m b e r   t h a t   i d e n t i f i e s   t h e   p u r c h a s e   o r d e r .   T h e   n u m b e r   c a n   b e   g e n e r a t e d   a u t o m a t i c a l l y   f r o m   a   n u m b e r   s e r i e s ,   o r   y o u   c a n   n u m b e r   e a c h   o f   t h e m   m a n u a l l y . < / T o o l t i p T e x t > + 
+         < / T o o l t i p > + 
+         < T o o l t i p   c o l u m n = " P a y T o C o n t a c t E m a i l "   E l e m e n t I d = " 1 9 8 4 8 9 3 3 1 0 " > + 
+             < T o o l t i p T e x t   l a n g = " e n - U S " > S p e c i f i e s   t h e   e m a i l   a d d r e s s   o f   t h e   c o n t a c t . < / T o o l t i p T e x t > + 
+         < / T o o l t i p > + 
+         < T o o l t i p   c o l u m n = " P a y T o C o n t a c t M o b i l e P h o n e N o "   E l e m e n t I d = " 1 9 0 1 4 6 6 0 5 " > + 
+             < T o o l t i p T e x t   l a n g = " e n - U S " > S p e c i f i e s   t h e   c o n t a c t ' s   m o b i l e   t e l e p h o n e   n u m b e r . < / T o o l t i p T e x t > + 
+         < / T o o l t i p > + 
+         < T o o l t i p   c o l u m n = " P a y T o C o n t a c t P h o n e N o "   E l e m e n t I d = " 1 9 2 3 7 9 6 7 0 9 " > + 
+             < T o o l t i p T e x t   l a n g = " e n - U S " > S p e c i f i e s   t h e   c o n t a c t ' s   p h o n e   n u m b e r . < / T o o l t i p T e x t > + 
+         < / T o o l t i p > + 
+         < T o o l t i p   c o l u m n = " P a y T o V e n d N o _ P u r c h H e a d e r "   E l e m e n t I d = " 6 3 5 5 6 4 4 9 8 " > + 
+             < T o o l t i p T e x t   l a n g = " e n - U S " > S p e c i f i e s   t h e   n u m b e r   o f   t h e   v e n d o r   t h a t   y o u   r e c e i v e d   t h e   i n v o i c e   f r o m . < / T o o l t i p T e x t > + 
+         < / T o o l t i p > + 
+         < T o o l t i p   c o l u m n = " P r e p m t P a y m e n t T e r m s D e s c "   E l e m e n t I d = " 4 2 9 7 6 4 9 1 " > + 
+             < T o o l t i p T e x t   l a n g = " e n - U S " > S p e c i f i e s   a n   e x p l a n a t i o n   o f   t h e   p a y m e n t   t e r m s . < / T o o l t i p T e x t > + 
+         < / T o o l t i p > + 
+         < T o o l t i p   c o l u m n = " P r i c e s I n c l V A T _ P u r c h H e a d e r "   E l e m e n t I d = " 1 8 0 5 5 0 7 9 8 0 " > + 
+             < T o o l t i p T e x t   l a n g = " e n - U S " > S p e c i f i e s   i f   t h e   U n i t   P r i c e   a n d   L i n e   A m o u n t   f i e l d s   o n   d o c u m e n t   l i n e s   s h o u l d   b e   s h o w n   w i t h   o r   w i t h o u t   V A T . < / T o o l t i p T e x t > + 
+         < / T o o l t i p > + 
+         < T o o l t i p   c o l u m n = " S a l e s P u r c h P e r s o n N a m e "   E l e m e n t I d = " 1 3 7 3 7 6 8 5 5 7 " > + 
+             < T o o l t i p T e x t   l a n g = " e n - U S " > S p e c i f i e s   t h e   n a m e   o f   t h e   s a l e s p e r s o n   o r   p u r c h a s e r . < / T o o l t i p T e x t > + 
+         < / T o o l t i p > + 
+         < T o o l t i p   c o l u m n = " S e l l T o C u s t N o _ P u r c h H e a d e r "   E l e m e n t I d = " 9 6 4 8 7 3 2 0 4 " > + 
+             < T o o l t i p T e x t   l a n g = " e n - U S " > S p e c i f i e s   t h e   n u m b e r   o f   t h e   c u s t o m e r   t h a t   t h e   i t e m s   a r e   s h i p p e d   t o   d i r e c t l y   f r o m   y o u r   v e n d o r ,   a s   a   d r o p   s h i p m e n t . < / T o o l t i p T e x t > + 
+         < / T o o l t i p > + 
+         < T o o l t i p   c o l u m n = " S h i p m e n t M e t h o d D e s c "   E l e m e n t I d = " 6 8 6 3 4 3 1 7 9 " > + 
+             < T o o l t i p T e x t   l a n g = " e n - U S " > S p e c i f i e s   a   d e s c r i p t i o n   o f   t h e   s h i p m e n t   m e t h o d . < / T o o l t i p T e x t > + 
+         < / T o o l t i p > + 
+         < T o o l t i p   c o l u m n = " V e n d o r I n v o i c e N o "   E l e m e n t I d = " 8 8 7 3 7 6 2 2 5 " > + 
+             < T o o l t i p T e x t   l a n g = " e n - U S " > S p e c i f i e s   t h e   d o c u m e n t   n u m b e r   o f   t h e   o r i g i n a l   d o c u m e n t   y o u   r e c e i v e d   f r o m   t h e   v e n d o r .   Y o u   c a n   r e q u i r e   t h e   d o c u m e n t   n u m b e r   f o r   p o s t i n g ,   o r   l e t   i t   b e   o p t i o n a l .   B y   d e f a u l t ,   i t ' s   r e q u i r e d ,   s o   t h a t   t h i s   d o c u m e n t   r e f e r e n c e s   t h e   o r i g i n a l .   M a k i n g   d o c u m e n t   n u m b e r s   o p t i o n a l   r e m o v e s   a   s t e p   f r o m   t h e   p o s t i n g   p r o c e s s .   F o r   e x a m p l e ,   i f   y o u   a t t a c h   t h e   o r i g i n a l   i n v o i c e   a s   a   P D F ,   y o u   m i g h t   n o t   n e e d   t o   e n t e r   t h e   d o c u m e n t   n u m b e r .   T o   s p e c i f y   w h e t h e r   d o c u m e n t   n u m b e r s   a r e   r e q u i r e d ,   i n   t h e   P u r c h a s e s   & a m p ;   P a y a b l e s   S e t u p   w i n d o w ,   s e l e c t   o r   c l e a r   t h e   E x t .   D o c .   N o .   M a n d a t o r y   f i e l d . < / T o o l t i p T e x t > + 
+         < / T o o l t i p > + 
+         < T o o l t i p   c o l u m n = " V e n d o r O r d e r N o "   E l e m e n t I d = " 1 6 4 1 9 6 8 4 4 6 " > + 
+             < T o o l t i p T e x t   l a n g = " e n - U S " > S p e c i f i e s   t h e   v e n d o r ' s   o r d e r   n u m b e r . < / T o o l t i p T e x t > + 
+         < / T o o l t i p > + 
+         < T o o l t i p   c o l u m n = " Y o u r R e f _ P u r c h H e a d e r "   E l e m e n t I d = " 1 9 8 5 3 6 8 6 3 1 " > + 
+             < T o o l t i p T e x t   l a n g = " e n - U S " > S p e c i f i e s   t h e   v e n d o r ' s   r e f e r e n c e . < / T o o l t i p T e x t > + 
+         < / T o o l t i p > + 
+         < T o o l t i p   c o l u m n = " A l l o w I n v D i s c _ P u r c h L i n e "   E l e m e n t I d = " 9 8 2 2 2 1 3 6 3 " > + 
+             < T o o l t i p T e x t   l a n g = " e n - U S " > S p e c i f i e s   i f   t h e   i n v o i c e   l i n e   i s   i n c l u d e d   w h e n   t h e   i n v o i c e   d i s c o u n t   i s   c a l c u l a t e d . < / T o o l t i p T e x t > + 
+         < / T o o l t i p > + 
+         < T o o l t i p   c o l u m n = " D e s c _ P u r c h L i n e "   E l e m e n t I d = " 1 1 6 1 7 0 2 0 8 9 " > + 
+             < T o o l t i p T e x t   l a n g = " e n - U S " > S p e c i f i e s   a   d e s c r i p t i o n   o f   t h e   e n t r y   o f   t h e   p r o d u c t   t o   b e   p u r c h a s e d .   T o   a d d   a   n o n - t r a n s a c t i o n a l   t e x t   l i n e ,   f i l l   i n   t h e   D e s c r i p t i o n   f i e l d   o n l y . < / T o o l t i p T e x t > + 
+         < / T o o l t i p > + 
+         < T o o l t i p   c o l u m n = " S u b c L i n e D e s c r i p t i o n 2 "   E l e m e n t I d = " 1 3 3 9 9 9 1 1 2 " > + 
+             < T o o l t i p T e x t   l a n g = " e n - U S " > S p e c i f i e s   i n f o r m a t i o n   i n   a d d i t i o n   t o   t h e   d e s c r i p t i o n . < / T o o l t i p T e x t > + 
+         < / T o o l t i p > + 
+         < T o o l t i p   c o l u m n = " S u b c P u r c h Q t y "   E l e m e n t I d = " 8 8 0 6 5 5 3 7 4 " > + 
+             < T o o l t i p T e x t   l a n g = " e n - U S " > S p e c i f i e s   t h e   n u m b e r   o f   u n i t s   o f   t h e   i t e m   s p e c i f i e d   o n   t h e   l i n e . < / T o o l t i p T e x t > + 
+         < / T o o l t i p > + 
+         < T o o l t i p   c o l u m n = " I t e m N o _ P u r c h L i n e "   E l e m e n t I d = " 1 0 5 7 2 2 4 1 4 0 " > + 
+             < T o o l t i p T e x t   l a n g = " e n - U S " > S p e c i f i e s   t h e   n u m b e r   o f   t h e   i n v o l v e d   e n t r y   o r   r e c o r d ,   a c c o r d i n g   t o   t h e   s p e c i f i e d   n u m b e r   s e r i e s . < / T o o l t i p T e x t > + 
+         < / T o o l t i p > + 
+         < T o o l t i p   c o l u m n = " I t e m R e f e r e n c e N o _ P u r c h L i n e "   E l e m e n t I d = " 1 1 5 8 3 9 2 0 3 1 " > + 
+             < T o o l t i p T e x t   l a n g = " e n - U S " > S p e c i f i e s   t h e   r e f e r e n c e d   i t e m   n u m b e r . < / T o o l t i p T e x t > + 
+         < / T o o l t i p > + 
+         < T o o l t i p   c o l u m n = " J o b N o _ P u r c h L i n e "   E l e m e n t I d = " 2 7 7 7 0 3 3 2 6 " > + 
+             < T o o l t i p T e x t   l a n g = " e n - U S " > S p e c i f i e s   t h e   n u m b e r   o f   t h e   r e l a t e d   p r o j e c t .   I f   y o u   f i l l   i n   t h i s   f i e l d   a n d   t h e   P r o j e c t   T a s k   N o .   f i e l d ,   t h e n   a   p r o j e c t   l e d g e r   e n t r y   w i l l   b e   p o s t e d   t o g e t h e r   w i t h   t h e   p u r c h a s e   l i n e . < / T o o l t i p T e x t > + 
+         < / T o o l t i p > + 
+         < T o o l t i p   c o l u m n = " J o b T a s k N o _ P u r c h L i n e "   E l e m e n t I d = " 7 2 6 6 6 9 0 1 1 " > + 
+             < T o o l t i p T e x t   l a n g = " e n - U S " > S p e c i f i e s   t h e   n u m b e r   o f   t h e   r e l a t e d   p r o j e c t   t a s k . < / T o o l t i p T e x t > + 
+         < / T o o l t i p > + 
+         < T o o l t i p   c o l u m n = " L i n e D i s c _ P u r c h L i n e "   E l e m e n t I d = " 2 1 3 3 2 3 3 9 7 3 " > + 
+             < T o o l t i p T e x t   l a n g = " e n - U S " > S p e c i f i e s   t h e   d i s c o u n t   p e r c e n t a g e   t h a t   i s   g r a n t e d   f o r   t h e   i t e m   o n   t h e   l i n e . < / T o o l t i p T e x t > + 
+         < / T o o l t i p > + 
+         < T o o l t i p   c o l u m n = " L i n e N o _ P u r c h L i n e "   E l e m e n t I d = " 1 7 4 8 8 4 8 6 5 " > + 
+             < T o o l t i p T e x t   l a n g = " e n - U S " > S p e c i f i e s   t h e   l i n e ' s   n u m b e r . < / T o o l t i p T e x t > + 
+         < / T o o l t i p > + 
+         < T o o l t i p   c o l u m n = " P u r c h a s e _ L i n e _ O u t s t a n d i n g _ Q t y "   E l e m e n t I d = " 2 1 2 3 0 1 5 5 8 3 " > + 
+             < T o o l t i p T e x t   l a n g = " e n - U S " > S p e c i f i e s   h o w   m a n y   u n i t s   o n   t h e   o r d e r   l i n e   h a v e   n o t   y e t   b e e n   r e c e i v e d . < / T o o l t i p T e x t > + 
+         < / T o o l t i p > + 
+         < T o o l t i p   c o l u m n = " U n i t P r i c e _ P u r c h L i n e "   E l e m e n t I d = " 2 0 6 3 2 5 9 8 1 9 " > + 
+             < T o o l t i p T e x t   l a n g = " e n - U S " > S p e c i f i e s   t h e   p r i c e ,   i n   L C Y ,   o f   o n e   u n i t   o f   t h e   i t e m   o r   r e s o u r c e .   Y o u   c a n   e n t e r   a   p r i c e   m a n u a l l y   o r   h a v e   i t   e n t e r e d   a c c o r d i n g   t o   t h e   P r i c e / P r o f i t   C a l c u l a t i o n   f i e l d   o n   t h e   r e l a t e d   c a r d . < / T o o l t i p T e x t > + 
+         < / T o o l t i p > + 
+         < T o o l t i p   c o l u m n = " U O M _ P u r c h L i n e "   E l e m e n t I d = " 4 4 1 1 3 9 0 4 9 " > + 
+             < T o o l t i p T e x t   l a n g = " e n - U S " > S p e c i f i e s   t h e   u n i t   o f   m e a s u r e . < / T o o l t i p T e x t > + 
+         < / T o o l t i p > + 
+         < T o o l t i p   c o l u m n = " P r o d _ _ O r d e r _ L i n e _ _ _ I t e m _ N o _ _ "   E l e m e n t I d = " 1 4 4 5 8 3 7 4 7 3 " > + 
+             < T o o l t i p T e x t   l a n g = " e n - U S " > S p e c i f i e s   t h e   n u m b e r   o f   t h e   i t e m   t h a t   i s   t o   b e   p r o d u c e d . < / T o o l t i p T e x t > + 
+         < / T o o l t i p > + 
+         < T o o l t i p   c o l u m n = " P r o d _ _ O r d e r _ L i n e _ _ _ U n i t _ o f _ M e a s u r e _ C o d e _ "   E l e m e n t I d = " 9 5 8 0 7 4 5 4 " > + 
+             < T o o l t i p T e x t   l a n g = " e n - U S " > S p e c i f i e s   h o w   e a c h   u n i t   o f   t h e   i t e m   i s   m e a s u r e d ,   s u c h   a s   i n   p i e c e s   o r   t o n s .   B y   d e f a u l t ,   t h e   v a l u e   i n   t h e   B a s e   U n i t   o f   M e a s u r e   f i e l d   o n   t h e   i t e m   c a r d   i s   i n s e r t e d .   I t   w i l l   b e   c h a n g e d   i f   y o u   s w i t c h   P r o d u c t   B O M   o r   P r o d u c t i o n   B O M   V e r s i o n . < / T o o l t i p T e x t > + 
+         < / T o o l t i p > + 
+         < T o o l t i p   c o l u m n = " P r o d _ _ O r d e r _ R o u t i n g _ L i n e _ _ O p e r a t i o n _ N o _ _ "   E l e m e n t I d = " 1 6 4 1 3 6 8 4 3 " > + 
+             < T o o l t i p T e x t   l a n g = " e n - U S " > S p e c i f i e s   t h e   o p e r a t i o n   n u m b e r . < / T o o l t i p T e x t > + 
+         < / T o o l t i p > + 
+         < T o o l t i p   c o l u m n = " P r o d _ _ O r d e r _ R o u t i n g _ L i n e _ _ P r o d _ _ O r d e r _ N o _ _ "   E l e m e n t I d = " 9 8 1 9 6 1 5 8 5 " > + 
+             < T o o l t i p T e x t   l a n g = " e n - U S " > S p e c i f i e s   t h e   n u m b e r   o f   t h e   r e l a t e d   p r o d u c t i o n   o r d e r . < / T o o l t i p T e x t > + 
+         < / T o o l t i p > + 
+         < T o o l t i p   c o l u m n = " P r o d _ _ O r d e r _ R o u t i n g _ L i n e _ D e s c r i p t i o n "   E l e m e n t I d = " 1 1 8 5 2 9 4 8 9 7 " > + 
+             < T o o l t i p T e x t   l a n g = " e n - U S " > S p e c i f i e s   t h e   d e s c r i p t i o n   o f   t h e   o p e r a t i o n . < / T o o l t i p T e x t > + 
+         < / T o o l t i p > + 
+         < T o o l t i p   c o l u m n = " P r o d _ _ O r d e r _ R o u t i n g _ L i n e _ D e s c r i p t i o n _ C o n t r o l 1 1 3 0 5 3 8 "   E l e m e n t I d = " 2 0 5 0 0 9 4 6 2 0 " > + 
+             < T o o l t i p T e x t   l a n g = " e n - U S " > S p e c i f i e s   t h e   d e s c r i p t i o n   o f   t h e   o p e r a t i o n . < / T o o l t i p T e x t > + 
+         < / T o o l t i p > + 
+         < T o o l t i p   c o l u m n = " P r o d _ _ O r d e r _ R o u t i n g _ L i n e _ R o u t i n g _ L i n k _ C o d e "   E l e m e n t I d = " 1 2 4 7 0 8 9 6 6 " > + 
+             < T o o l t i p T e x t   l a n g = " e n - U S " > S p e c i f i e s   a   r o u t i n g   l i n k   c o d e . < / T o o l t i p T e x t > + 
+         < / T o o l t i p > + 
+         < T o o l t i p   c o l u m n = " P r o d _ _ O r d e r _ R o u t i n g _ L i n e _ R o u t i n g _ N o _ "   E l e m e n t I d = " 1 0 6 0 7 5 6 5 4 " > + 
+             < T o o l t i p T e x t   l a n g = " e n - U S " > S p e c i f i e s   t h e   r o u t i n g   n u m b e r . < / T o o l t i p T e x t > + 
+         < / T o o l t i p > + 
+         < T o o l t i p   c o l u m n = " P r o d _ _ O r d e r _ R o u t i n g _ L i n e _ R o u t i n g _ R e f e r e n c e _ N o _ "   E l e m e n t I d = " 2 7 3 1 5 8 7 7 8 " > + 
+             < T o o l t i p T e x t   l a n g = " e n - U S " > S p e c i f i e s   t h a t   t h e   r o u t i n g   r e f e r e n c e   n u m b e r . < / T o o l t i p T e x t > + 
+         < / T o o l t i p > + 
+         < T o o l t i p   c o l u m n = " P r o d _ _ O r d e r _ R o u t i n g _ L i n e _ S t a t u s "   E l e m e n t I d = " 7 9 8 1 7 9 9 1 7 " > + 
+             < T o o l t i p T e x t   l a n g = " e n - U S " > S p e c i f i e s   t h e   s t a t u s   o f   t h e   r o u t i n g   l i n e . < / T o o l t i p T e x t > + 
+         < / T o o l t i p > + 
+         < T o o l t i p   c o l u m n = " P r o d _ _ O r d e r _ C o m p o n e n t _ _ I t e m _ N o _ _ "   E l e m e n t I d = " 6 2 8 6 8 6 0 8 7 " > + 
+             < T o o l t i p T e x t   l a n g = " e n - U S " > S p e c i f i e s   t h e   n u m b e r   o f   t h e   i t e m   t h a t   i s   a   c o m p o n e n t   i n   t h e   p r o d u c t i o n   o r d e r   c o m p o n e n t   l i s t . < / T o o l t i p T e x t > + 
+         < / T o o l t i p > + 
+         < T o o l t i p   c o l u m n = " P r o d _ _ O r d e r _ C o m p o n e n t _ _ Q t y _ _ i n _ T r a n s i t _ _ B a s e _ _ "   E l e m e n t I d = " 1 9 9 5 0 4 3 4 3 6 " > + 
+             < T o o l t i p T e x t   l a n g = " e n - U S " > S p e c i f i e s   t h e   i t e m s   t h a t   a r e   i n   t r a n s i t . < / T o o l t i p T e x t > + 
+         < / T o o l t i p > + 
+         < T o o l t i p   c o l u m n = " P r o d _ _ O r d e r _ C o m p o n e n t _ _ Q t y _ _ t r a n s f _ _ t o _ S u b c o n t r a c t o r _ "   E l e m e n t I d = " 7 7 0 6 9 1 9 7 8 " > + 
+             < T o o l t i p T e x t   l a n g = " e n - U S " > S p e c i f i e s   t h e   i t e m   a m o u n t   t r a n s f e r r e d   t o   t h e   s u b c o n t r a c t o r . < / T o o l t i p T e x t > + 
+         < / T o o l t i p > + 
+         < T o o l t i p   c o l u m n = " P r o d _ _ O r d e r _ C o m p o n e n t _ D e s c r i p t i o n "   E l e m e n t I d = " 1 3 0 9 7 4 4 4 3 " > + 
+             < T o o l t i p T e x t   l a n g = " e n - U S " > S p e c i f i e s   a   d e s c r i p t i o n   o f   t h e   i t e m   o n   t h e   l i n e . < / T o o l t i p T e x t > + 
+         < / T o o l t i p > + 
+         < T o o l t i p   c o l u m n = " P r o d _ _ O r d e r _ C o m p o n e n t _ P r o d _ _ O r d e r _ L i n e _ N o _ "   E l e m e n t I d = " 1 7 2 6 5 5 2 3 1 8 " > + 
+             < T o o l t i p T e x t   l a n g = " e n - U S " > S p e c i f i e s   t h e   n u m b e r   o f   t h e   p r o d u c t i o n   o r d e r   l i n e   t o   w h i c h   t h e   c o m p o n e n t   l i s t   b e l o n g s . < / T o o l t i p T e x t > + 
+         < / T o o l t i p > + 
+         < T o o l t i p   c o l u m n = " P r o d _ _ O r d e r _ C o m p o n e n t _ P r o d _ _ O r d e r _ N o _ "   E l e m e n t I d = " 1 4 6 7 3 5 3 9 2 5 " > + 
+             < T o o l t i p T e x t   l a n g = " e n - U S " > S p e c i f i e s   t h e   n u m b e r   o f   t h e   r e l a t e d   p r o d u c t i o n   o r d e r . < / T o o l t i p T e x t > + 
+         < / T o o l t i p > + 
+         < T o o l t i p   c o l u m n = " P r o d _ _ O r d e r _ C o m p o n e n t _ R o u t i n g _ L i n k _ C o d e "   E l e m e n t I d = " 2 0 6 8 1 8 6 1 8 0 " > + 
+             < T o o l t i p T e x t   l a n g = " e n - U S " > S p e c i f i e s   t h e   r o u t i n g   l i n k   c o d e   w h e n   y o u   c a l c u l a t e   t h e   p r o d u c t i o n   o r d e r . < / T o o l t i p T e x t > + 
+         < / T o o l t i p > + 
+         < T o o l t i p   c o l u m n = " P r o d _ _ O r d e r _ C o m p o n e n t _ S t a t u s "   E l e m e n t I d = " 6 0 3 9 0 9 7 0 3 " > + 
+             < T o o l t i p T e x t   l a n g = " e n - U S " > S p e c i f i e s   t h e   s t a t u s   o f   t h e   p r o d u c t i o n   o r d e r   t o   w h i c h   t h e   c o m p o n e n t   l i s t   b e l o n g s . < / T o o l t i p T e x t > + 
+         < / T o o l t i p > + 
+         < T o o l t i p   c o l u m n = " V A T A m t L i n e I n v D i s c A m t "   E l e m e n t I d = " 1 0 0 7 8 2 8 6 0 " > + 
+             < T o o l t i p T e x t   l a n g = " e n - U S " > S p e c i f i e s   t h e   i n v o i c e   d i s c o u n t   a m o u n t   f o r   a   s p e c i f i c   V A T   i d e n t i f i e r . < / T o o l t i p T e x t > + 
+         < / T o o l t i p > + 
+         < T o o l t i p   c o l u m n = " V A T A m t L i n e I n v D i s c B a s e A m t "   E l e m e n t I d = " 1 6 9 1 0 0 3 4 1 5 " > + 
+             < T o o l t i p T e x t   l a n g = " e n - U S " > S p e c i f i e s   t h e   i n v o i c e   d i s c o u n t   b a s e   a m o u n t . < / T o o l t i p T e x t > + 
+         < / T o o l t i p > + 
+         < T o o l t i p   c o l u m n = " V A T A m t L i n e L i n e A m t "   E l e m e n t I d = " 1 8 8 2 1 0 3 2 6 2 " > + 
+             < T o o l t i p T e x t   l a n g = " e n - U S " > S p e c i f i e s   t h e   t o t a l   a m o u n t   f o r   s a l e s   o r   p u r c h a s e   l i n e s   w i t h   a   s p e c i f i c   V A T   i d e n t i f i e r . < / T o o l t i p T e x t > + 
+         < / T o o l t i p > + 
+         < T o o l t i p   c o l u m n = " V A T A m t L i n e V A T "   E l e m e n t I d = " 2 9 9 0 4 8 9 2 5 " > + 
+             < T o o l t i p T e x t   l a n g = " e n - U S " > S p e c i f i e s   t h e   V A T   %   t h a t   w a s   u s e d   o n   t h e   s a l e s   o r   p u r c h a s e   l i n e s   w i t h   t h i s   V A T   I d e n t i f i e r . < / T o o l t i p T e x t > + 
+         < / T o o l t i p > + 
+         < T o o l t i p   c o l u m n = " V A T A m t L i n e V A T A m t "   E l e m e n t I d = " 8 4 9 9 7 4 3 4 1 " > + 
+             < T o o l t i p T e x t   l a n g = " e n - U S " > S p e c i f i e s   t h e   a m o u n t   o f   V A T   t h a t   i s   i n c l u d e d   i n   t h e   t o t a l   a m o u n t . < / T o o l t i p T e x t > + 
+         < / T o o l t i p > + 
+         < T o o l t i p   c o l u m n = " V A T A m t L i n e V A T B a s e "   E l e m e n t I d = " 1 4 1 9 8 1 6 2 1 8 " > + 
+             < T o o l t i p T e x t   l a n g = " e n - U S " > S p e c i f i e s   t h e   t o t a l   n e t   a m o u n t   ( a m o u n t   e x c l u d i n g   V A T )   f o r   s a l e s   o r   p u r c h a s e   l i n e s   w i t h   a   s p e c i f i c   V A T   I d e n t i f i e r . < / T o o l t i p T e x t > + 
+         < / T o o l t i p > + 
+         < T o o l t i p   c o l u m n = " V A T A m t L i n e V A T I d e n t i f i e r "   E l e m e n t I d = " 4 6 1 3 9 9 7 9 2 " > + 
+             < T o o l t i p T e x t   l a n g = " e n - U S " > S p e c i f i e s   t h e   V A T   I d e n t i f i e r   v a l u e . < / T o o l t i p T e x t > + 
+         < / T o o l t i p > + 
+         < T o o l t i p   c o l u m n = " P r e p m t V A T A m t L i n e L i n e A m t "   E l e m e n t I d = " 4 0 2 6 8 5 8 2 4 " > + 
+             < T o o l t i p T e x t   l a n g = " e n - U S " > S p e c i f i e s   t h e   t o t a l   a m o u n t   f o r   s a l e s   o r   p u r c h a s e   l i n e s   w i t h   a   s p e c i f i c   V A T   i d e n t i f i e r . < / T o o l t i p T e x t > + 
+         < / T o o l t i p > + 
+         < T o o l t i p   c o l u m n = " P r e p m t V A T A m t L i n e V A T "   E l e m e n t I d = " 1 9 1 5 4 9 4 8 5 " > + 
+             < T o o l t i p T e x t   l a n g = " e n - U S " > S p e c i f i e s   t h e   V A T   %   t h a t   w a s   u s e d   o n   t h e   s a l e s   o r   p u r c h a s e   l i n e s   w i t h   t h i s   V A T   I d e n t i f i e r . < / T o o l t i p T e x t > + 
+         < / T o o l t i p > + 
+         < T o o l t i p   c o l u m n = " P r e p m t V A T A m t L i n e V A T A m t "   E l e m e n t I d = " 1 8 7 1 3 0 1 8 2 9 " > + 
+             < T o o l t i p T e x t   l a n g = " e n - U S " > S p e c i f i e s   t h e   a m o u n t   o f   V A T   t h a t   i s   i n c l u d e d   i n   t h e   t o t a l   a m o u n t . < / T o o l t i p T e x t > + 
+         < / T o o l t i p > + 
+         < T o o l t i p   c o l u m n = " P r e p m t V A T A m t L i n e V A T B a s e "   E l e m e n t I d = " 1 2 2 6 9 0 4 6 9 6 " > + 
+             < T o o l t i p T e x t   l a n g = " e n - U S " > S p e c i f i e s   t h e   t o t a l   n e t   a m o u n t   ( a m o u n t   e x c l u d i n g   V A T )   f o r   s a l e s   o r   p u r c h a s e   l i n e s   w i t h   a   s p e c i f i c   V A T   I d e n t i f i e r . < / T o o l t i p T e x t > + 
+         < / T o o l t i p > + 
+         < T o o l t i p   c o l u m n = " P r e p m t V A T A m t L i n e V A T I d "   E l e m e n t I d = " 9 8 2 2 2 4 8 0 0 " > + 
+             < T o o l t i p T e x t   l a n g = " e n - U S " > S p e c i f i e s   t h e   V A T   I d e n t i f i e r   v a l u e . < / T o o l t i p T e x t > + 
+         < / T o o l t i p > + 
+         < T o o l t i p   c o l u m n = " S u b c I n v o i c e D i s c o u n t A m o u n t _ V A T A m o u n t L i n e "   E l e m e n t I d = " 8 7 9 9 1 1 6 2 8 " > + 
+             < T o o l t i p T e x t   l a n g = " e n - U S " > S p e c i f i e s   t h e   i n v o i c e   d i s c o u n t   a m o u n t   f o r   a   s p e c i f i c   V A T   i d e n t i f i e r . < / T o o l t i p T e x t > + 
+         < / T o o l t i p > + 
+         < T o o l t i p   c o l u m n = " S u b c I n v o i c e D i s c o u n t B a s e A m o u n t _ V A T A m o u n t L i n e "   E l e m e n t I d = " 1 2 5 3 7 7 7 4 6 5 " > + 
+             < T o o l t i p T e x t   l a n g = " e n - U S " > S p e c i f i e s   t h e   i n v o i c e   d i s c o u n t   b a s e   a m o u n t . < / T o o l t i p T e x t > + 
+         < / T o o l t i p > + 
+         < T o o l t i p   c o l u m n = " S u b c L i n e A m o u n t _ V a t A m o u n t L i n e "   E l e m e n t I d = " 8 9 2 6 1 3 9 2 2 " > + 
+             < T o o l t i p T e x t   l a n g = " e n - U S " > S p e c i f i e s   t h e   t o t a l   a m o u n t   f o r   s a l e s   o r   p u r c h a s e   l i n e s   w i t h   a   s p e c i f i c   V A T   i d e n t i f i e r . < / T o o l t i p T e x t > + 
+         < / T o o l t i p > + 
+         < T o o l t i p   c o l u m n = " S u b c V A T A m o u n t _ V a t A m o u n t L i n e "   E l e m e n t I d = " 1 1 9 8 7 6 5 5 8 1 " > + 
+             < T o o l t i p T e x t   l a n g = " e n - U S " > S p e c i f i e s   t h e   a m o u n t   o f   V A T   t h a t   i s   i n c l u d e d   i n   t h e   t o t a l   a m o u n t . < / T o o l t i p T e x t > + 
+         < / T o o l t i p > + 
+         < T o o l t i p   c o l u m n = " S u b c V A T B a s e _ V a t A m o u n t L i n e "   E l e m e n t I d = " 1 6 3 9 4 2 6 9 4 " > + 
+             < T o o l t i p T e x t   l a n g = " e n - U S " > S p e c i f i e s   t h e   t o t a l   n e t   a m o u n t   ( a m o u n t   e x c l u d i n g   V A T )   f o r   s a l e s   o r   p u r c h a s e   l i n e s   w i t h   a   s p e c i f i c   V A T   I d e n t i f i e r . < / T o o l t i p T e x t > + 
+         < / T o o l t i p > + 
+         < T o o l t i p   c o l u m n = " S u b c V A T C l a u s e 2 D e s c r i p t i o n "   E l e m e n t I d = " 1 0 7 3 5 6 6 6 1 6 " > + 
+             < T o o l t i p T e x t   l a n g = " e n - U S " > S p e c i f i e s   t h e   d e s c r i p t i v e   t e x t   t h a t   i s   a s s o c i a t e d   w i t h   a   V A T   c l a u s e . < / T o o l t i p T e x t > + 
+         < / T o o l t i p > + 
+         < T o o l t i p   c o l u m n = " S u b c V A T C l a u s e 2 D e s c r i p t i o n 2 "   E l e m e n t I d = " 1 1 4 1 9 2 6 6 7 8 " > + 
+             < T o o l t i p T e x t   l a n g = " e n - U S " > S p e c i f i e s   a n   a d d i t i o n a l   d e s c r i p t i o n   o f   a   V A T   c l a u s e . < / T o o l t i p T e x t > + 
+         < / T o o l t i p > + 
+         < T o o l t i p   c o l u m n = " S u b c V A T I d e n t i f i e r _ V a t A m o u n t L i n e "   E l e m e n t I d = " 1 3 2 9 3 9 5 5 3 2 " > + 
+             < T o o l t i p T e x t   l a n g = " e n - U S " > S p e c i f i e s   t h e   V A T   I d e n t i f i e r   v a l u e . < / T o o l t i p T e x t > + 
+         < / T o o l t i p > + 
+         < T o o l t i p   c o l u m n = " S u b c V A T P c t _ V a t A m o u n t L i n e "   E l e m e n t I d = " 1 8 7 3 8 8 6 8 3 2 " > + 
+             < T o o l t i p T e x t   l a n g = " e n - U S " > S p e c i f i e s   t h e   V A T   %   t h a t   w a s   u s e d   o n   t h e   s a l e s   o r   p u r c h a s e   l i n e s   w i t h   t h i s   V A T   I d e n t i f i e r . < / T o o l t i p T e x t > + 
+         < / T o o l t i p > + 
+         < T o o l t i p   c o l u m n = " T e m p S U B S h i p T o A d d r _ _ A d d r e s s "   E l e m e n t I d = " 7 1 1 0 9 2 3 4 3 " > + 
+             < T o o l t i p T e x t   l a n g = " e n - U S " > S p e c i f i e s   t h e   s h i p - t o   a d d r e s s . < / T o o l t i p T e x t > + 
+         < / T o o l t i p > + 
+     < / T o o l t i p s > + 
+     < P u r c h a s e _ H e a d e r   E l e m e n t T y p e = " D a t a I t e m "   E l e m e n t I d = " 3 0 1 5 4 4 2 5 8 " > + 
+         < A l l o w I n v o i c e D i s c _ L b l   E l e m e n t T y p e = " C o l u m n "   E l e m e n t I d = " 1 4 4 9 1 1 7 7 6 3 "   D a t a T y p e = " L a b e l " > A l l o w I n v o i c e D i s c _ L b l < / A l l o w I n v o i c e D i s c _ L b l > + 
+         < A m o u n t _ L b l   E l e m e n t T y p e = " C o l u m n "   E l e m e n t I d = " 1 8 5 7 4 6 5 8 6 0 "   D a t a T y p e = " L a b e l " > A m o u n t _ L b l < / A m o u n t _ L b l > + 
+         < B u y e r _ L b l   E l e m e n t T y p e = " C o l u m n "   E l e m e n t I d = " 1 7 4 6 3 3 5 4 8 9 "   D a t a T y p e = " L a b e l " > B u y e r _ L b l < / B u y e r _ L b l > + 
+         < B u y F r m V e n d N o _ P u r c h H e a d e r   E l e m e n t T y p e = " C o l u m n "   E l e m e n t I d = " 1 1 4 1 1 5 6 0 2 "   D a t a T y p e = " C o d e " > B u y F r m V e n d N o _ P u r c h H e a d e r < / B u y F r m V e n d N o _ P u r c h H e a d e r > + 
+         < B u y F r m V e n d N o _ P u r c h H e a d e r _ L b l   E l e m e n t T y p e = " C o l u m n "   E l e m e n t I d = " 1 8 5 3 8 7 0 8 5 "   D a t a T y p e = " S t r i n g " > B u y F r m V e n d N o _ P u r c h H e a d e r _ L b l < / B u y F r m V e n d N o _ P u r c h H e a d e r _ L b l > + 
+         < B u y F r o m A d d r 1   E l e m e n t T y p e = " C o l u m n "   E l e m e n t I d = " 9 9 4 5 5 4 4 3 3 "   D a t a T y p e = " T e x t " > B u y F r o m A d d r 1 < / B u y F r o m A d d r 1 > + 
+         < B u y F r o m A d d r 2   E l e m e n t T y p e = " C o l u m n "   E l e m e n t I d = " 1 3 8 7 3 2 3 0 1 2 "   D a t a T y p e = " T e x t " > B u y F r o m A d d r 2 < / B u y F r o m A d d r 2 > + 
+         < B u y F r o m A d d r 3   E l e m e n t T y p e = " C o l u m n "   E l e m e n t I d = " 2 0 2 5 0 1 9 6 2 9 "   D a t a T y p e = " T e x t " > B u y F r o m A d d r 3 < / B u y F r o m A d d r 3 > + 
+         < B u y F r o m A d d r 4   E l e m e n t T y p e = " C o l u m n "   E l e m e n t I d = " 1 1 1 9 2 9 7 7 8 "   D a t a T y p e = " T e x t " > B u y F r o m A d d r 4 < / B u y F r o m A d d r 4 > + 
+         < B u y F r o m A d d r 5   E l e m e n t T y p e = " C o l u m n "   E l e m e n t I d = " 7 4 9 6 2 6 3 9 5 "   D a t a T y p e = " T e x t " > B u y F r o m A d d r 5 < / B u y F r o m A d d r 5 > + 
+         < B u y F r o m A d d r 6   E l e m e n t T y p e = " C o l u m n "   E l e m e n t I d = " 1 1 6 3 4 6 3 4 5 6 "   D a t a T y p e = " T e x t " > B u y F r o m A d d r 6 < / B u y F r o m A d d r 6 > + 
+         < B u y F r o m A d d r 7   E l e m e n t T y p e = " C o l u m n "   E l e m e n t I d = " 5 2 5 7 6 6 8 3 9 "   D a t a T y p e = " T e x t " > B u y F r o m A d d r 7 < / B u y F r o m A d d r 7 > + 
+         < B u y F r o m A d d r 8   E l e m e n t T y p e = " C o l u m n "   E l e m e n t I d = " 8 2 5 6 4 5 4 1 0 "   D a t a T y p e = " T e x t " > B u y F r o m A d d r 8 < / B u y F r o m A d d r 8 > + 
+         < B u y F r o m C o n t a c t E m a i l   E l e m e n t T y p e = " C o l u m n "   E l e m e n t I d = " 1 4 6 0 8 4 1 4 4 9 "   D a t a T y p e = " T e x t " > B u y F r o m C o n t a c t E m a i l < / B u y F r o m C o n t a c t E m a i l > + 
+         < B u y F r o m C o n t a c t E m a i l L b l   E l e m e n t T y p e = " C o l u m n "   E l e m e n t I d = " 4 6 2 0 6 3 8 7 5 "   D a t a T y p e = " L a b e l " > B u y F r o m C o n t a c t E m a i l L b l < / B u y F r o m C o n t a c t E m a i l L b l > + 
+         < B u y F r o m C o n t a c t M o b i l e P h o n e N o   E l e m e n t T y p e = " C o l u m n "   E l e m e n t I d = " 6 8 2 3 8 6 3 9 2 "   D a t a T y p e = " T e x t " > B u y F r o m C o n t a c t M o b i l e P h o n e N o < / B u y F r o m C o n t a c t M o b i l e P h o n e N o > + 
+         < B u y F r o m C o n t a c t M o b i l e P h o n e N o L b l   E l e m e n t T y p e = " C o l u m n "   E l e m e n t I d = " 3 5 0 1 9 3 3 8 "   D a t a T y p e = " L a b e l " > B u y F r o m C o n t a c t M o b i l e P h o n e N o L b l < / B u y F r o m C o n t a c t M o b i l e P h o n e N o L b l > + 
+         < B u y F r o m C o n t a c t P h o n e N o   E l e m e n t T y p e = " C o l u m n "   E l e m e n t I d = " 1 6 2 4 1 1 6 4 9 6 "   D a t a T y p e = " T e x t " > B u y F r o m C o n t a c t P h o n e N o < / B u y F r o m C o n t a c t P h o n e N o > + 
+         < B u y F r o m C o n t a c t P h o n e N o L b l   E l e m e n t T y p e = " C o l u m n "   E l e m e n t I d = " 3 6 1 4 5 0 8 0 2 "   D a t a T y p e = " L a b e l " > B u y F r o m C o n t a c t P h o n e N o L b l < / B u y F r o m C o n t a c t P h o n e N o L b l > + 
+         < C o m p a n y A d d r e s s 1   E l e m e n t T y p e = " C o l u m n "   E l e m e n t I d = " 1 8 8 4 1 6 4 3 2 3 "   D a t a T y p e = " T e x t " > C o m p a n y A d d r e s s 1 < / C o m p a n y A d d r e s s 1 > + 
+         < C o m p a n y A d d r e s s 2   E l e m e n t T y p e = " C o l u m n "   E l e m e n t I d = " 1 2 4 6 4 6 7 7 0 6 "   D a t a T y p e = " T e x t " > C o m p a n y A d d r e s s 2 < / C o m p a n y A d d r e s s 2 > + 
+         < C o m p a n y A d d r e s s 3   E l e m e n t T y p e = " C o l u m n "   E l e m e n t I d = " 6 0 8 7 7 1 0 8 9 "   D a t a T y p e = " T e x t " > C o m p a n y A d d r e s s 3 < / C o m p a n y A d d r e s s 3 > + 
+         < C o m p a n y A d d r e s s 4   E l e m e n t T y p e = " C o l u m n "   E l e m e n t I d = " 7 7 7 6 8 0 1 1 2 "   D a t a T y p e = " T e x t " > C o m p a n y A d d r e s s 4 < / C o m p a n y A d d r e s s 4 > + 
+         < C o m p a n y A d d r e s s 5   E l e m e n t T y p e = " C o l u m n "   E l e m e n t I d = " 1 3 9 9 8 3 4 9 5 "   D a t a T y p e = " T e x t " > C o m p a n y A d d r e s s 5 < / C o m p a n y A d d r e s s 5 > + 
+         < C o m p a n y A d d r e s s 6   E l e m e n t T y p e = " C o l u m n "   E l e m e n t I d = " 4 9 7 7 1 3 1 2 2 "   D a t a T y p e = " T e x t " > C o m p a n y A d d r e s s 6 < / C o m p a n y A d d r e s s 6 > + 
+         < C o m p a n y B a n k A c c o u n t N o   E l e m e n t T y p e = " C o l u m n "   E l e m e n t I d = " 3 0 1 4 0 2 0 4 "   D a t a T y p e = " T e x t " > C o m p a n y B a n k A c c o u n t N o < / C o m p a n y B a n k A c c o u n t N o > + 
+         < C o m p a n y B a n k A c c o u n t N o _ L b l   E l e m e n t T y p e = " C o l u m n "   E l e m e n t I d = " 1 0 9 7 7 4 3 3 4 5 "   D a t a T y p e = " L a b e l " > C o m p a n y B a n k A c c o u n t N o _ L b l < / C o m p a n y B a n k A c c o u n t N o _ L b l > + 
+         < C o m p a n y B a n k B r a n c h N o   E l e m e n t T y p e = " C o l u m n "   E l e m e n t I d = " 7 9 3 1 3 3 0 5 7 "   D a t a T y p e = " T e x t " > C o m p a n y B a n k B r a n c h N o < / C o m p a n y B a n k B r a n c h N o > + 
+         < C o m p a n y B a n k B r a n c h N o _ L b l   E l e m e n t T y p e = " C o l u m n "   E l e m e n t I d = " 3 2 7 9 0 6 6 9 2 "   D a t a T y p e = " S t r i n g " > C o m p a n y B a n k B r a n c h N o _ L b l < / C o m p a n y B a n k B r a n c h N o _ L b l > + 
+         < C o m p a n y B a n k N a m e   E l e m e n t T y p e = " C o l u m n "   E l e m e n t I d = " 1 5 3 4 9 0 5 6 0 5 "   D a t a T y p e = " T e x t " > C o m p a n y B a n k N a m e < / C o m p a n y B a n k N a m e > + 
+         < C o m p a n y B a n k N a m e _ L b l   E l e m e n t T y p e = " C o l u m n "   E l e m e n t I d = " 1 2 0 4 3 0 7 0 1 4 "   D a t a T y p e = " L a b e l " > C o m p a n y B a n k N a m e _ L b l < / C o m p a n y B a n k N a m e _ L b l > + 
+         < C o m p a n y C u s t o m G i r o   E l e m e n t T y p e = " C o l u m n "   E l e m e n t I d = " 1 6 7 0 4 7 5 7 9 8 "   D a t a T y p e = " T e x t " > C o m p a n y C u s t o m G i r o < / C o m p a n y C u s t o m G i r o > + 
+         < C o m p a n y C u s t o m G i r o _ L b l   E l e m e n t T y p e = " C o l u m n "   E l e m e n t I d = " 8 9 1 4 3 9 6 2 5 "   D a t a T y p e = " T e x t " > C o m p a n y C u s t o m G i r o _ L b l < / C o m p a n y C u s t o m G i r o _ L b l > + 
+         < C o m p a n y E M a i l   E l e m e n t T y p e = " C o l u m n "   E l e m e n t I d = " 1 6 7 7 0 7 4 0 5 8 "   D a t a T y p e = " T e x t " > C o m p a n y E M a i l < / C o m p a n y E M a i l > + 
+         < C o m p a n y E m a i l _ L b l   E l e m e n t T y p e = " C o l u m n "   E l e m e n t I d = " 8 0 8 1 5 9 1 7 9 "   D a t a T y p e = " L a b e l " > C o m p a n y E m a i l _ L b l < / C o m p a n y E m a i l _ L b l > + 
+         < C o m p a n y G i r o N o   E l e m e n t T y p e = " C o l u m n "   E l e m e n t I d = " 1 3 6 0 1 9 6 3 2 0 "   D a t a T y p e = " T e x t " > C o m p a n y G i r o N o < / C o m p a n y G i r o N o > + 
+         < C o m p a n y G i r o N o _ L b l   E l e m e n t T y p e = " C o l u m n "   E l e m e n t I d = " 8 6 1 6 0 2 1 1 5 "   D a t a T y p e = " L a b e l " > C o m p a n y G i r o N o _ L b l < / C o m p a n y G i r o N o _ L b l > + 
+         < C o m p a n y H o m e P a g e   E l e m e n t T y p e = " C o l u m n "   E l e m e n t I d = " 1 9 8 9 1 8 8 7 0 "   D a t a T y p e = " T e x t " > C o m p a n y H o m e P a g e < / C o m p a n y H o m e P a g e > + 
+         < C o m p a n y H o m e P a g e _ L b l   E l e m e n t T y p e = " C o l u m n "   E l e m e n t I d = " 1 5 2 9 3 4 8 1 7 1 "   D a t a T y p e = " L a b e l " > C o m p a n y H o m e P a g e _ L b l < / C o m p a n y H o m e P a g e _ L b l > + 
+         < C o m p a n y I B A N   E l e m e n t T y p e = " C o l u m n "   E l e m e n t I d = " 9 0 6 5 4 9 1 8 2 "   D a t a T y p e = " C o d e " > C o m p a n y I B A N < / C o m p a n y I B A N > + 
+         < C o m p a n y I B A N _ L b l   E l e m e n t T y p e = " C o l u m n "   E l e m e n t I d = " 1 2 6 7 9 5 2 2 2 7 "   D a t a T y p e = " S t r i n g " > C o m p a n y I B A N _ L b l < / C o m p a n y I B A N _ L b l > + 
+         < C o m p a n y L e g a l O f f i c e   E l e m e n t T y p e = " C o l u m n "   E l e m e n t I d = " 7 1 4 2 5 8 1 1 1 "   D a t a T y p e = " T e x t " > C o m p a n y L e g a l O f f i c e < / C o m p a n y L e g a l O f f i c e > + 
+         < C o m p a n y L e g a l O f f i c e _ L b l   E l e m e n t T y p e = " C o l u m n "   E l e m e n t I d = " 1 5 3 3 1 7 5 1 0 8 "   D a t a T y p e = " T e x t " > C o m p a n y L e g a l O f f i c e _ L b l < / C o m p a n y L e g a l O f f i c e _ L b l > + 
+         < C o m p a n y L o g o P o s i t i o n   E l e m e n t T y p e = " C o l u m n "   E l e m e n t I d = " 1 4 2 5 2 6 6 6 8 8 "   D a t a T y p e = " I n t e g e r " > C o m p a n y L o g o P o s i t i o n < / C o m p a n y L o g o P o s i t i o n > + 
+         < C o m p a n y P h o n e N o   E l e m e n t T y p e = " C o l u m n "   E l e m e n t I d = " 2 5 0 4 4 0 6 5 5 "   D a t a T y p e = " T e x t " > C o m p a n y P h o n e N o < / C o m p a n y P h o n e N o > + 
+         < C o m p a n y P h o n e N o _ L b l   E l e m e n t T y p e = " C o l u m n "   E l e m e n t I d = " 5 5 8 5 9 3 5 8 6 "   D a t a T y p e = " L a b e l " > C o m p a n y P h o n e N o _ L b l < / C o m p a n y P h o n e N o _ L b l > + 
+         < C o m p a n y P i c t u r e   E l e m e n t T y p e = " C o l u m n "   E l e m e n t I d = " 1 3 9 7 4 1 1 0 7 4 "   D a t a T y p e = " B l o b "   / > + 
+         < C o m p a n y R e g i s t r a t i o n N u m b e r   E l e m e n t T y p e = " C o l u m n "   E l e m e n t I d = " 2 0 2 3 6 3 9 4 2 4 "   D a t a T y p e = " T e x t " > C o m p a n y R e g i s t r a t i o n N u m b e r < / C o m p a n y R e g i s t r a t i o n N u m b e r > + 
+         < C o m p a n y R e g i s t r a t i o n N u m b e r _ L b l   E l e m e n t T y p e = " C o l u m n "   E l e m e n t I d = " 1 8 3 3 1 0 6 6 5 3 "   D a t a T y p e = " T e x t " > C o m p a n y R e g i s t r a t i o n N u m b e r _ L b l < / C o m p a n y R e g i s t r a t i o n N u m b e r _ L b l > + 
+         < C o m p a n y S W I F T   E l e m e n t T y p e = " C o l u m n "   E l e m e n t I d = " 6 6 8 2 5 0 2 4 5 "   D a t a T y p e = " C o d e " > C o m p a n y S W I F T < / C o m p a n y S W I F T > + 
+         < C o m p a n y S W I F T _ L b l   E l e m e n t T y p e = " C o l u m n "   E l e m e n t I d = " 2 0 2 9 5 9 7 3 8 4 "   D a t a T y p e = " S t r i n g " > C o m p a n y S W I F T _ L b l < / C o m p a n y S W I F T _ L b l > + 
+         < C o m p a n y V A T R e g i s t r a t i o n N o   E l e m e n t T y p e = " C o l u m n "   E l e m e n t I d = " 1 9 1 4 0 1 3 6 4 9 "   D a t a T y p e = " T e x t " > C o m p a n y V A T R e g i s t r a t i o n N o < / C o m p a n y V A T R e g i s t r a t i o n N o > + 
+         < C o m p a n y V A T R e g i s t r a t i o n N o _ L b l   E l e m e n t T y p e = " C o l u m n "   E l e m e n t I d = " 9 2 4 5 0 3 1 2 4 "   D a t a T y p e = " T e x t " > C o m p a n y V A T R e g i s t r a t i o n N o _ L b l < / C o m p a n y V A T R e g i s t r a t i o n N o _ L b l > + 
+         < C o m p a n y V A T R e g N o   E l e m e n t T y p e = " C o l u m n "   E l e m e n t I d = " 1 7 1 4 3 1 9 3 6 "   D a t a T y p e = " T e x t " > C o m p a n y V A T R e g N o < / C o m p a n y V A T R e g N o > + 
+         < C o m p a n y V A T R e g N o _ L b l   E l e m e n t T y p e = " C o l u m n "   E l e m e n t I d = " 7 7 3 2 0 1 5 0 1 "   D a t a T y p e = " T e x t " > C o m p a n y V A T R e g N o _ L b l < / C o m p a n y V A T R e g N o _ L b l > + 
+         < C o n f i r m T o C a p t i o n _ L b l   E l e m e n t T y p e = " C o l u m n "   E l e m e n t I d = " 1 7 0 5 6 7 2 8 4 1 "   D a t a T y p e = " L a b e l " > C o n f i r m T o C a p t i o n _ L b l < / C o n f i r m T o C a p t i o n _ L b l > + 
+         < C o n t i n u e d C a p t i o n L b l   E l e m e n t T y p e = " C o l u m n "   E l e m e n t I d = " 1 8 8 9 4 5 4 6 6 8 "   D a t a T y p e = " L a b e l " > C o n t i n u e d C a p t i o n L b l < / C o n t i n u e d C a p t i o n L b l > + 
+         < D i m T e x t   E l e m e n t T y p e = " C o l u m n "   E l e m e n t I d = " 1 7 6 4 8 3 2 3 2 "   D a t a T y p e = " T e x t " > D i m T e x t < / D i m T e x t > + 
+         < D o c T y p e _ P u r c h H e a d e r   E l e m e n t T y p e = " C o l u m n "   E l e m e n t I d = " 1 9 1 3 4 4 6 4 3 3 "   D a t a T y p e = " E n u m " > D o c T y p e _ P u r c h H e a d e r < / D o c T y p e _ P u r c h H e a d e r > + 
+         < D o c u m e n t D a t e   E l e m e n t T y p e = " C o l u m n "   E l e m e n t I d = " 5 5 2 8 7 1 9 1 4 "   D a t a T y p e = " S t r i n g " > D o c u m e n t D a t e < / D o c u m e n t D a t e > + 
+         < D o c u m e n t D a t e _ L b l   E l e m e n t T y p e = " C o l u m n "   E l e m e n t I d = " 1 0 2 6 4 9 4 8 3 "   D a t a T y p e = " L a b e l " > D o c u m e n t D a t e _ L b l < / D o c u m e n t D a t e _ L b l > + 
+         < D o c u m e n t T i t l e _ L b l   E l e m e n t T y p e = " C o l u m n "   E l e m e n t I d = " 8 5 8 4 2 3 9 2 9 "   D a t a T y p e = " L a b e l " > D o c u m e n t T i t l e _ L b l < / D o c u m e n t T i t l e _ L b l > + 
+         < D u e D a t e   E l e m e n t T y p e = " C o l u m n "   E l e m e n t I d = " 7 4 5 1 7 0 2 0 3 "   D a t a T y p e = " S t r i n g " > D u e D a t e < / D u e D a t e > + 
+         < E m a i l I D _ L b l   E l e m e n t T y p e = " C o l u m n "   E l e m e n t I d = " 1 0 8 1 3 5 7 8 8 9 "   D a t a T y p e = " L a b e l " > E m a i l I D _ L b l < / E m a i l I D _ L b l > + 
+         < E x p t R e c p t D t _ P u r c h a s e H e a d e r   E l e m e n t T y p e = " C o l u m n "   E l e m e n t I d = " 7 5 1 5 1 3 9 8 3 "   D a t a T y p e = " S t r i n g " > E x p t R e c p t D t _ P u r c h a s e H e a d e r < / E x p t R e c p t D t _ P u r c h a s e H e a d e r > + 
+         < H o m e P a g e _ L b l   E l e m e n t T y p e = " C o l u m n "   E l e m e n t I d = " 1 4 3 3 5 9 2 3 0 0 "   D a t a T y p e = " L a b e l " > H o m e P a g e _ L b l < / H o m e P a g e _ L b l > + 
+         < I t e m D e s c r i p t i o n _ L b l   E l e m e n t T y p e = " C o l u m n "   E l e m e n t I d = " 8 3 5 8 4 5 8 5 3 "   D a t a T y p e = " L a b e l " > I t e m D e s c r i p t i o n _ L b l < / I t e m D e s c r i p t i o n _ L b l > + 
+         < I t e m L i n e A m o u n t _ L b l   E l e m e n t T y p e = " C o l u m n "   E l e m e n t I d = " 4 8 8 7 0 7 2 7 "   D a t a T y p e = " L a b e l " > I t e m L i n e A m o u n t _ L b l < / I t e m L i n e A m o u n t _ L b l > + 
+         < I t e m N u m b e r _ L b l   E l e m e n t T y p e = " C o l u m n "   E l e m e n t I d = " 1 3 3 2 2 2 5 7 7 4 "   D a t a T y p e = " L a b e l " > I t e m N u m b e r _ L b l < / I t e m N u m b e r _ L b l > + 
+         < I t e m Q u a n t i t y _ L b l   E l e m e n t T y p e = " C o l u m n "   E l e m e n t I d = " 1 8 0 2 5 9 1 7 6 6 "   D a t a T y p e = " L a b e l " > I t e m Q u a n t i t y _ L b l < / I t e m Q u a n t i t y _ L b l > + 
+         < I t e m U n i t P r i c e _ L b l   E l e m e n t T y p e = " C o l u m n "   E l e m e n t I d = " 4 6 6 8 5 2 9 8 "   D a t a T y p e = " L a b e l " > I t e m U n i t P r i c e _ L b l < / I t e m U n i t P r i c e _ L b l > + 
+         < I t e m U n i t _ L b l   E l e m e n t T y p e = " C o l u m n "   E l e m e n t I d = " 1 9 8 1 4 0 3 7 7 3 "   D a t a T y p e = " L a b e l " > I t e m U n i t _ L b l < / I t e m U n i t _ L b l > + 
+         < N o _ P u r c h H e a d e r   E l e m e n t T y p e = " C o l u m n "   E l e m e n t I d = " 5 2 0 3 3 9 3 5 2 "   D a t a T y p e = " C o d e " > N o _ P u r c h H e a d e r < / N o _ P u r c h H e a d e r > + 
+         < O r d e r D a t e n L b l   E l e m e n t T y p e = " C o l u m n "   E l e m e n t I d = " 6 8 6 5 0 6 1 8 9 "   D a t a T y p e = " L a b e l " > O r d e r D a t e n L b l < / O r d e r D a t e n L b l > + 
+         < O r d e r D a t e _ L b l   E l e m e n t T y p e = " C o l u m n "   E l e m e n t I d = " 4 1 7 6 9 0 3 9 8 "   D a t a T y p e = " L a b e l " > O r d e r D a t e _ L b l < / O r d e r D a t e _ L b l > + 
+         < O r d e r D a t e _ P u r c h a s e H e a d e r   E l e m e n t T y p e = " C o l u m n "   E l e m e n t I d = " 1 1 1 9 3 3 8 5 4 0 "   D a t a T y p e = " S t r i n g " > O r d e r D a t e _ P u r c h a s e H e a d e r < / O r d e r D a t e _ P u r c h a s e H e a d e r > + 
+         < O r d e r N o _ L b l   E l e m e n t T y p e = " C o l u m n "   E l e m e n t I d = " 1 9 9 1 0 6 2 5 2 9 "   D a t a T y p e = " L a b e l " > O r d e r N o _ L b l < / O r d e r N o _ L b l > + 
+         < O u t p u t N o   E l e m e n t T y p e = " C o l u m n "   E l e m e n t I d = " 1 5 2 4 6 3 6 1 8 1 "   D a t a T y p e = " I n t e g e r " > O u t p u t N o < / O u t p u t N o > + 
+         < O u t s t a n d i n g L b l   E l e m e n t T y p e = " C o l u m n "   E l e m e n t I d = " 2 1 0 0 6 5 8 0 8 3 "   D a t a T y p e = " L a b e l " > O u t s t a n d i n g L b l < / O u t s t a n d i n g L b l > + 
+         < P a g e L b l   E l e m e n t T y p e = " C o l u m n "   E l e m e n t I d = " 2 7 0 2 9 6 3 3 2 "   D a t a T y p e = " L a b e l " > P a g e L b l < / P a g e L b l > + 
+         < P a g e _ L b l   E l e m e n t T y p e = " C o l u m n "   E l e m e n t I d = " 6 8 0 6 4 8 0 9 1 "   D a t a T y p e = " L a b e l " > P a g e _ L b l < / P a g e _ L b l > + 
+         < P a y m e n t D e t a i l s _ L b l   E l e m e n t T y p e = " C o l u m n "   E l e m e n t I d = " 1 0 2 9 7 4 8 9 9 2 "   D a t a T y p e = " L a b e l " > P a y m e n t D e t a i l s _ L b l < / P a y m e n t D e t a i l s _ L b l > + 
+         < P a y m e n t T e r m s D e s c _ L b l   E l e m e n t T y p e = " C o l u m n "   E l e m e n t I d = " 1 4 3 7 8 0 9 5 6 2 "   D a t a T y p e = " L a b e l " > P a y m e n t T e r m s D e s c _ L b l < / P a y m e n t T e r m s D e s c _ L b l > + 
+         < P a y T o C o n t a c t E m a i l   E l e m e n t T y p e = " C o l u m n "   E l e m e n t I d = " 1 9 8 4 8 9 3 3 1 0 "   D a t a T y p e = " T e x t " > P a y T o C o n t a c t E m a i l < / P a y T o C o n t a c t E m a i l > + 
+         < P a y T o C o n t a c t E m a i l L b l   E l e m e n t T y p e = " C o l u m n "   E l e m e n t I d = " 6 8 4 6 8 8 4 8 "   D a t a T y p e = " L a b e l " > P a y T o C o n t a c t E m a i l L b l < / P a y T o C o n t a c t E m a i l L b l > + 
+         < P a y T o C o n t a c t M o b i l e P h o n e N o   E l e m e n t T y p e = " C o l u m n "   E l e m e n t I d = " 1 9 0 1 4 6 6 0 5 "   D a t a T y p e = " T e x t " > P a y T o C o n t a c t M o b i l e P h o n e N o < / P a y T o C o n t a c t M o b i l e P h o n e N o > + 
+         < P a y T o C o n t a c t M o b i l e P h o n e N o L b l   E l e m e n t T y p e = " C o l u m n "   E l e m e n t I d = " 1 2 5 4 4 4 0 0 8 9 "   D a t a T y p e = " L a b e l " > P a y T o C o n t a c t M o b i l e P h o n e N o L b l < / P a y T o C o n t a c t M o b i l e P h o n e N o L b l > + 
+         < P a y T o C o n t a c t P h o n e N o   E l e m e n t T y p e = " C o l u m n "   E l e m e n t I d = " 1 9 2 3 7 9 6 7 0 9 "   D a t a T y p e = " T e x t " > P a y T o C o n t a c t P h o n e N o < / P a y T o C o n t a c t P h o n e N o > + 
+         < P a y T o C o n t a c t P h o n e N o L b l   E l e m e n t T y p e = " C o l u m n "   E l e m e n t I d = " 2 9 3 4 6 1 0 8 7 "   D a t a T y p e = " L a b e l " > P a y T o C o n t a c t P h o n e N o L b l < / P a y T o C o n t a c t P h o n e N o L b l > + 
+         < P a y T o V e n d N o _ P u r c h H e a d e r   E l e m e n t T y p e = " C o l u m n "   E l e m e n t I d = " 6 3 5 5 6 4 4 9 8 "   D a t a T y p e = " C o d e " > P a y T o V e n d N o _ P u r c h H e a d e r < / P a y T o V e n d N o _ P u r c h H e a d e r > + 
+         < P r e p m t P a y m e n t T e r m s D e s c   E l e m e n t T y p e = " C o l u m n "   E l e m e n t I d = " 4 2 9 7 6 4 9 1 "   D a t a T y p e = " T e x t " > P r e p m t P a y m e n t T e r m s D e s c < / P r e p m t P a y m e n t T e r m s D e s c > + 
+         < P r e p y m t T e r m s D e s c _ L b l   E l e m e n t T y p e = " C o l u m n "   E l e m e n t I d = " 1 8 4 2 9 3 9 4 8 5 "   D a t a T y p e = " L a b e l " > P r e p y m t T e r m s D e s c _ L b l < / P r e p y m t T e r m s D e s c _ L b l > + 
+         < P r i c e s I n c l u d i n g V A T _ L b l   E l e m e n t T y p e = " C o l u m n "   E l e m e n t I d = " 1 3 7 7 9 7 9 4 4 4 "   D a t a T y p e = " L a b e l " > P r i c e s I n c l u d i n g V A T _ L b l < / P r i c e s I n c l u d i n g V A T _ L b l > + 
+         < P r i c e s I n c l V A T t x t   E l e m e n t T y p e = " C o l u m n "   E l e m e n t I d = " 1 1 2 3 7 2 4 4 4 8 "   D a t a T y p e = " L a b e l " > P r i c e s I n c l V A T t x t < / P r i c e s I n c l V A T t x t > + 
+         < P r i c e s I n c l V A T _ P u r c h H e a d e r   E l e m e n t T y p e = " C o l u m n "   E l e m e n t I d = " 1 8 0 5 5 0 7 9 8 0 "   D a t a T y p e = " B o o l e a n " > P r i c e s I n c l V A T _ P u r c h H e a d e r < / P r i c e s I n c l V A T _ P u r c h H e a d e r > + 
+         < P r i c e s I n c l V A T _ P u r c h H e a d e r _ L b l   E l e m e n t T y p e = " C o l u m n "   E l e m e n t I d = " 1 7 9 9 5 0 1 7 4 3 "   D a t a T y p e = " S t r i n g " > P r i c e s I n c l V A T _ P u r c h H e a d e r _ L b l < / P r i c e s I n c l V A T _ P u r c h H e a d e r _ L b l > + 
+         < P u r c h a s e r T e x t   E l e m e n t T y p e = " C o l u m n "   E l e m e n t I d = " 1 2 9 1 4 2 3 8 3 3 "   D a t a T y p e = " T e x t " > P u r c h a s e r T e x t < / P u r c h a s e r T e x t > + 
+         < P u r c h L i n e I n v D i s c A m t _ L b l   E l e m e n t T y p e = " C o l u m n "   E l e m e n t I d = " 9 2 6 7 0 5 4 6 2 "   D a t a T y p e = " L a b e l " > P u r c h L i n e I n v D i s c A m t _ L b l < / P u r c h L i n e I n v D i s c A m t _ L b l > + 
+         < P u r c h O r d e r C a p t i o n _ L b l   E l e m e n t T y p e = " C o l u m n "   E l e m e n t I d = " 6 3 3 7 2 3 3 7 2 "   D a t a T y p e = " L a b e l " > P u r c h O r d e r C a p t i o n _ L b l < / P u r c h O r d e r C a p t i o n _ L b l > + 
+         < P u r c h O r d e r D a t e C a p t i o n _ L b l   E l e m e n t T y p e = " C o l u m n "   E l e m e n t I d = " 1 6 3 4 1 8 6 4 0 "   D a t a T y p e = " L a b e l " > P u r c h O r d e r D a t e C a p t i o n _ L b l < / P u r c h O r d e r D a t e C a p t i o n _ L b l > + 
+         < P u r c h O r d e r N u m C a p t i o n _ L b l   E l e m e n t T y p e = " C o l u m n "   E l e m e n t I d = " 4 6 4 1 4 9 4 5 4 "   D a t a T y p e = " L a b e l " > P u r c h O r d e r N u m C a p t i o n _ L b l < / P u r c h O r d e r N u m C a p t i o n _ L b l > + 
+         < R e c e i v e b y _ L b l   E l e m e n t T y p e = " C o l u m n "   E l e m e n t I d = " 9 4 4 0 6 3 6 8 "   D a t a T y p e = " L a b e l " > R e c e i v e b y _ L b l < / R e c e i v e b y _ L b l > + 
+         < R e f e r e n c e T e x t   E l e m e n t T y p e = " C o l u m n "   E l e m e n t I d = " 4 4 5 3 5 3 4 5 1 "   D a t a T y p e = " T e x t " > R e f e r e n c e T e x t < / R e f e r e n c e T e x t > + 
+         < S a l e s P u r c h P e r s o n N a m e   E l e m e n t T y p e = " C o l u m n "   E l e m e n t I d = " 1 3 7 3 7 6 8 5 5 7 "   D a t a T y p e = " T e x t " > S a l e s P u r c h P e r s o n N a m e < / S a l e s P u r c h P e r s o n N a m e > + 
+         < S e l l T o C u s t N o _ P u r c h H e a d e r   E l e m e n t T y p e = " C o l u m n "   E l e m e n t I d = " 9 6 4 8 7 3 2 0 4 "   D a t a T y p e = " C o d e " > S e l l T o C u s t N o _ P u r c h H e a d e r < / S e l l T o C u s t N o _ P u r c h H e a d e r > + 
+         < S e l l T o C u s t N o _ P u r c h H e a d e r _ L b l   E l e m e n t T y p e = " C o l u m n "   E l e m e n t I d = " 1 9 3 1 5 7 0 8 9 7 "   D a t a T y p e = " S t r i n g " > S e l l T o C u s t N o _ P u r c h H e a d e r _ L b l < / S e l l T o C u s t N o _ P u r c h H e a d e r _ L b l > + 
+         < S h i p m e n t M e t h o d D e s c   E l e m e n t T y p e = " C o l u m n "   E l e m e n t I d = " 6 8 6 3 4 3 1 7 9 "   D a t a T y p e = " T e x t " > S h i p m e n t M e t h o d D e s c < / S h i p m e n t M e t h o d D e s c > + 
+         < S h i p m e n t M e t h o d D e s c _ L b l   E l e m e n t T y p e = " C o l u m n "   E l e m e n t I d = " 5 7 9 9 0 1 3 6 6 "   D a t a T y p e = " L a b e l " > S h i p m e n t M e t h o d D e s c _ L b l < / S h i p m e n t M e t h o d D e s c _ L b l > + 
+         < S h i p T o A d d r 1   E l e m e n t T y p e = " C o l u m n "   E l e m e n t I d = " 5 1 2 9 7 9 8 5 0 "   D a t a T y p e = " T e x t " > S h i p T o A d d r 1 < / S h i p T o A d d r 1 > + 
+         < S h i p T o A d d r 2   E l e m e n t T y p e = " C o l u m n "   E l e m e n t I d = " 1 1 5 0 6 7 6 4 6 7 "   D a t a T y p e = " T e x t " > S h i p T o A d d r 2 < / S h i p T o A d d r 2 > + 
+         < S h i p T o A d d r 3   E l e m e n t T y p e = " C o l u m n "   E l e m e n t I d = " 1 7 8 8 3 7 3 0 8 4 "   D a t a T y p e = " T e x t " > S h i p T o A d d r 3 < / S h i p T o A d d r 3 > + 
+         < S h i p T o A d d r 4   E l e m e n t T y p e = " C o l u m n "   E l e m e n t I d = " 1 8 6 8 8 9 7 5 9 5 "   D a t a T y p e = " T e x t " > S h i p T o A d d r 4 < / S h i p T o A d d r 4 > + 
+         < S h i p T o A d d r 5   E l e m e n t T y p e = " C o l u m n "   E l e m e n t I d = " 1 2 3 1 2 0 0 9 7 8 "   D a t a T y p e = " T e x t " > S h i p T o A d d r 5 < / S h i p T o A d d r 5 > + 
+         < S h i p T o A d d r 6   E l e m e n t T y p e = " C o l u m n "   E l e m e n t I d = " 5 9 3 5 0 4 3 6 1 "   D a t a T y p e = " T e x t " > S h i p T o A d d r 6 < / S h i p T o A d d r 6 > + 
+         < S h i p T o A d d r 7   E l e m e n t T y p e = " C o l u m n "   E l e m e n t I d = " 4 4 1 9 2 2 5 6 "   D a t a T y p e = " T e x t " > S h i p T o A d d r 7 < / S h i p T o A d d r 7 > + 
+         < S h i p T o A d d r 8   E l e m e n t T y p e = " C o l u m n "   E l e m e n t I d = " 9 3 1 3 2 2 4 0 7 "   D a t a T y p e = " T e x t " > S h i p T o A d d r 8 < / S h i p T o A d d r 8 > + 
+         < S h i p t o A d d r e s s _ L b l   E l e m e n t T y p e = " C o l u m n "   E l e m e n t I d = " 1 0 4 3 5 1 9 5 7 7 "   D a t a T y p e = " L a b e l " > S h i p t o A d d r e s s _ L b l < / S h i p t o A d d r e s s _ L b l > + 
+         < S u b c A d d r I n f o L i n e   E l e m e n t T y p e = " C o l u m n "   E l e m e n t I d = " 1 0 0 9 4 5 5 3 8 3 "   D a t a T y p e = " T e x t " > S u b c A d d r I n f o L i n e < / S u b c A d d r I n f o L i n e > + 
+         < S u b c A m o u n t C a p t i o n L b l   E l e m e n t T y p e = " C o l u m n "   E l e m e n t I d = " 1 1 2 8 0 9 4 5 5 8 "   D a t a T y p e = " L a b e l " > S u b c A m o u n t C a p t i o n L b l < / S u b c A m o u n t C a p t i o n L b l > + 
+         < S u b c B a r c o d e B a s e   E l e m e n t T y p e = " C o l u m n "   E l e m e n t I d = " 7 0 5 6 0 9 3 7 1 "   D a t a T y p e = " B l o b "   / > + 
+         < S u b c C o m p a n y A d d r e s s 1   E l e m e n t T y p e = " C o l u m n "   E l e m e n t I d = " 1 8 9 3 8 9 9 8 5 4 "   D a t a T y p e = " T e x t " > S u b c C o m p a n y A d d r e s s 1 < / S u b c C o m p a n y A d d r e s s 1 > + 
+         < S u b c C o m p a n y A d d r e s s 2   E l e m e n t T y p e = " C o l u m n "   E l e m e n t I d = " 1 7 6 3 3 7 0 8 2 5 "   D a t a T y p e = " T e x t " > S u b c C o m p a n y A d d r e s s 2 < / S u b c C o m p a n y A d d r e s s 2 > + 
+         < S u b c C o m p a n y A d d r e s s 3   E l e m e n t T y p e = " C o l u m n "   E l e m e n t I d = " 1 1 2 5 6 7 4 2 0 8 "   D a t a T y p e = " T e x t " > S u b c C o m p a n y A d d r e s s 3 < / S u b c C o m p a n y A d d r e s s 3 > + 
+         < S u b c C o m p a n y A d d r e s s 4   E l e m e n t T y p e = " C o l u m n "   E l e m e n t I d = " 1 2 9 4 5 8 3 2 3 1 "   D a t a T y p e = " T e x t " > S u b c C o m p a n y A d d r e s s 4 < / S u b c C o m p a n y A d d r e s s 4 > + 
+         < S u b c C o m p a n y B a n k N a m e   E l e m e n t T y p e = " C o l u m n "   E l e m e n t I d = " 7 2 9 7 1 5 4 9 2 "   D a t a T y p e = " T e x t " > S u b c C o m p a n y B a n k N a m e < / S u b c C o m p a n y B a n k N a m e > + 
+         < S u b c C o m p a n y B a n k N a m e _ L b l   E l e m e n t T y p e = " C o l u m n "   E l e m e n t I d = " 8 9 7 6 7 7 6 2 5 "   D a t a T y p e = " T e x t " > S u b c C o m p a n y B a n k N a m e _ L b l < / S u b c C o m p a n y B a n k N a m e _ L b l > + 
+         < S u b c C o m p a n y E M a i l   E l e m e n t T y p e = " C o l u m n "   E l e m e n t I d = " 1 8 0 8 6 8 5 5 1 9 "   D a t a T y p e = " T e x t " > S u b c C o m p a n y E M a i l < / S u b c C o m p a n y E M a i l > + 
+         < S u b c C o m p a n y H o m e P a g e   E l e m e n t T y p e = " C o l u m n "   E l e m e n t I d = " 1 1 2 9 4 2 4 5 8 5 "   D a t a T y p e = " T e x t " > S u b c C o m p a n y H o m e P a g e < / S u b c C o m p a n y H o m e P a g e > + 
+         < S u b c C o m p a n y I B A N   E l e m e n t T y p e = " C o l u m n "   E l e m e n t I d = " 5 6 0 0 6 2 7 8 3 "   D a t a T y p e = " T e x t " > S u b c C o m p a n y I B A N < / S u b c C o m p a n y I B A N > + 
+         < S u b c C o m p a n y I B A N _ L b l   E l e m e n t T y p e = " C o l u m n "   E l e m e n t I d = " 1 4 8 7 1 1 8 3 9 6 "   D a t a T y p e = " T e x t " > S u b c C o m p a n y I B A N _ L b l < / S u b c C o m p a n y I B A N _ L b l > + 
+         < S u b c C o m p a n y I n f o 1 P i c t u r e   E l e m e n t T y p e = " C o l u m n "   E l e m e n t I d = " 1 0 5 2 1 8 7 7 9 8 "   D a t a T y p e = " B l o b "   / > + 
+         < S u b c C o m p a n y I n f o 2 P i c t u r e   E l e m e n t T y p e = " C o l u m n "   E l e m e n t I d = " 6 3 9 9 3 6 3 7 "   D a t a T y p e = " B l o b "   / > + 
+         < S u b c C o m p a n y I n f o C o u r t L o c a t i o n   E l e m e n t T y p e = " C o l u m n "   E l e m e n t I d = " 2 8 0 0 6 5 2 3 3 "   D a t a T y p e = " T e x t " > S u b c C o m p a n y I n f o C o u r t L o c a t i o n < / S u b c C o m p a n y I n f o C o u r t L o c a t i o n > + 
+         < S u b c C o m p a n y I n f o E x e c u t i v e D i r e c t o r 1   E l e m e n t T y p e = " C o l u m n "   E l e m e n t I d = " 6 3 0 1 1 2 1 5 8 "   D a t a T y p e = " T e x t " > S u b c C o m p a n y I n f o E x e c u t i v e D i r e c t o r 1 < / S u b c C o m p a n y I n f o E x e c u t i v e D i r e c t o r 1 > + 
+         < S u b c C o m p a n y I n f o E x e c u t i v e D i r e c t o r 2   E l e m e n t T y p e = " C o l u m n "   E l e m e n t I d = " 1 2 6 7 8 0 8 7 7 5 "   D a t a T y p e = " T e x t " > S u b c C o m p a n y I n f o E x e c u t i v e D i r e c t o r 2 < / S u b c C o m p a n y I n f o E x e c u t i v e D i r e c t o r 2 > + 
+         < S u b c C o m p a n y I n f o E x e c u t i v e D i r e c t o r 3   E l e m e n t T y p e = " C o l u m n "   E l e m e n t I d = " 1 9 0 5 5 0 5 3 9 2 "   D a t a T y p e = " T e x t " > S u b c C o m p a n y I n f o E x e c u t i v e D i r e c t o r 3 < / S u b c C o m p a n y I n f o E x e c u t i v e D i r e c t o r 3 > + 
+         < S u b c C o m p a n y I n f o E x e c u t i v e D i r e c t o r 4   E l e m e n t T y p e = " C o l u m n "   E l e m e n t I d = " 1 7 3 6 5 9 6 3 6 9 "   D a t a T y p e = " T e x t " > S u b c C o m p a n y I n f o E x e c u t i v e D i r e c t o r 4 < / S u b c C o m p a n y I n f o E x e c u t i v e D i r e c t o r 4 > + 
+         < S u b c C o m p a n y I n f o F a x L b l   E l e m e n t T y p e = " C o l u m n "   E l e m e n t I d = " 1 6 8 2 9 0 8 1 0 "   D a t a T y p e = " T e x t " > S u b c C o m p a n y I n f o F a x L b l < / S u b c C o m p a n y I n f o F a x L b l > + 
+         < S u b c C o m p a n y I n f o F a x N o   E l e m e n t T y p e = " C o l u m n "   E l e m e n t I d = " 1 2 8 1 1 3 2 1 3 "   D a t a T y p e = " T e x t " > S u b c C o m p a n y I n f o F a x N o < / S u b c C o m p a n y I n f o F a x N o > + 
+         < S u b c C o m p a n y I n f o P h o n e N o L b l   E l e m e n t T y p e = " C o l u m n "   E l e m e n t I d = " 4 5 4 6 4 4 1 8 0 "   D a t a T y p e = " T e x t " > S u b c C o m p a n y I n f o P h o n e N o L b l < / S u b c C o m p a n y I n f o P h o n e N o L b l > + 
+         < S u b c C o m p a n y I n f o P i c t u r e   E l e m e n t T y p e = " C o l u m n "   E l e m e n t I d = " 1 7 1 6 9 3 2 0 4 9 "   D a t a T y p e = " B l o b "   / > + 
+         < S u b c C o m p a n y I n f o R e g i s t e r C o u r t N o   E l e m e n t T y p e = " C o l u m n "   E l e m e n t I d = " 1 7 5 2 9 6 9 6 1 2 "   D a t a T y p e = " T e x t " > S u b c C o m p a n y I n f o R e g i s t e r C o u r t N o < / S u b c C o m p a n y I n f o R e g i s t e r C o u r t N o > + 
+         < S u b c C o m p a n y P h o n e N o   E l e m e n t T y p e = " C o l u m n "   E l e m e n t I d = " 5 5 3 5 7 6 2 1 6 "   D a t a T y p e = " T e x t " > S u b c C o m p a n y P h o n e N o < / S u b c C o m p a n y P h o n e N o > + 
+         < S u b c C o m p a n y P h o n e N o _ L b l   E l e m e n t T y p e = " C o l u m n "   E l e m e n t I d = " 5 7 2 3 2 0 5 "   D a t a T y p e = " T e x t " > S u b c C o m p a n y P h o n e N o _ L b l < / S u b c C o m p a n y P h o n e N o _ L b l > + 
+         < S u b c C o m p a n y S W I F T   E l e m e n t T y p e = " C o l u m n "   E l e m e n t I d = " 2 2 9 7 9 1 8 4 2 "   D a t a T y p e = " T e x t " > S u b c C o m p a n y S W I F T < / S u b c C o m p a n y S W I F T > + 
+         < S u b c C o m p a n y S W I F T _ L b l   E l e m e n t T y p e = " C o l u m n "   E l e m e n t I d = " 9 2 1 2 7 1 8 0 9 "   D a t a T y p e = " T e x t " > S u b c C o m p a n y S W I F T _ L b l < / S u b c C o m p a n y S W I F T _ L b l > + 
+         < S u b c C o m p a n y V A T R e g i s t r a t i o n N o   E l e m e n t T y p e = " C o l u m n "   E l e m e n t I d = " 1 5 3 5 8 1 2 0 6 "   D a t a T y p e = " T e x t " > S u b c C o m p a n y V A T R e g i s t r a t i o n N o < / S u b c C o m p a n y V A T R e g i s t r a t i o n N o > + 
+         < S u b c C o m p a n y V A T R e g i s t r a t i o n N o _ L b l   E l e m e n t T y p e = " C o l u m n "   E l e m e n t I d = " 1 1 0 7 2 4 6 3 4 7 "   D a t a T y p e = " T e x t " > S u b c C o m p a n y V A T R e g i s t r a t i o n N o _ L b l < / S u b c C o m p a n y V A T R e g i s t r a t i o n N o _ L b l > + 
+         < S u b c C o m p a n y V A T R e g N o _ L b l   E l e m e n t T y p e = " C o l u m n "   E l e m e n t I d = " 7 2 5 9 1 4 5 6 2 "   D a t a T y p e = " T e x t " > S u b c C o m p a n y V A T R e g N o _ L b l < / S u b c C o m p a n y V A T R e g N o _ L b l > + 
+         < S u b c C o u r t L o c a t i o n L b l   E l e m e n t T y p e = " C o l u m n "   E l e m e n t I d = " 1 0 9 1 2 0 4 7 4 "   D a t a T y p e = " T e x t " > S u b c C o u r t L o c a t i o n L b l < / S u b c C o u r t L o c a t i o n L b l > + 
+         < S u b c D o c C a p t i o n L b l   E l e m e n t T y p e = " C o l u m n "   E l e m e n t I d = " 7 3 8 7 7 2 6 2 2 "   D a t a T y p e = " L a b e l " > S u b c D o c C a p t i o n L b l < / S u b c D o c C a p t i o n L b l > + 
+         < S u b c D o c u m e n t D a t e   E l e m e n t T y p e = " C o l u m n "   E l e m e n t I d = " 1 1 3 9 5 4 7 1 "   D a t a T y p e = " S t r i n g " > S u b c D o c u m e n t D a t e < / S u b c D o c u m e n t D a t e > + 
+         < S u b c D o c u m e n t D a t e L b l   E l e m e n t T y p e = " C o l u m n "   E l e m e n t I d = " 1 3 6 6 2 2 7 2 1 1 "   D a t a T y p e = " L a b e l " > S u b c D o c u m e n t D a t e L b l < / S u b c D o c u m e n t D a t e L b l > + 
+         < S u b c D u e D a t e   E l e m e n t T y p e = " C o l u m n "   E l e m e n t I d = " 1 2 9 8 7 0 3 2 5 4 "   D a t a T y p e = " S t r i n g " > S u b c D u e D a t e < / S u b c D u e D a t e > + 
+         < S u b c E M a i l _ L b l   E l e m e n t T y p e = " C o l u m n "   E l e m e n t I d = " 1 2 3 2 8 1 2 2 8 5 "   D a t a T y p e = " T e x t " > S u b c E M a i l _ L b l < / S u b c E M a i l _ L b l > + 
+         < S u b c E x e c u t i v e D i r e c t o r s L b l   E l e m e n t T y p e = " C o l u m n "   E l e m e n t I d = " 2 1 0 2 0 0 4 0 4 3 "   D a t a T y p e = " T e x t " > S u b c E x e c u t i v e D i r e c t o r s L b l < / S u b c E x e c u t i v e D i r e c t o r s L b l > + 
+         < S u b c E x t e r n a l D o c u m e n t N o C a p t i o n L b l   E l e m e n t T y p e = " C o l u m n "   E l e m e n t I d = " 1 6 6 9 9 6 1 7 6 5 "   D a t a T y p e = " L a b e l " > S u b c E x t e r n a l D o c u m e n t N o C a p t i o n L b l < / S u b c E x t e r n a l D o c u m e n t N o C a p t i o n L b l > + 
+         < S u b c F o o t e r M a r k   E l e m e n t T y p e = " C o l u m n "   E l e m e n t I d = " 4 9 4 1 4 4 9 0 2 "   D a t a T y p e = " T e x t " > S u b c F o o t e r M a r k < / S u b c F o o t e r M a r k > + 
+         < S u b c H e a d e r M a r k   E l e m e n t T y p e = " C o l u m n "   E l e m e n t I d = " 1 0 2 8 6 5 8 1 2 8 "   D a t a T y p e = " T e x t " > S u b c H e a d e r M a r k < / S u b c H e a d e r M a r k > + 
+         < S u b c H e a d e r P h o n e N o   E l e m e n t T y p e = " C o l u m n "   E l e m e n t I d = " 1 0 8 0 3 7 8 9 2 0 "   D a t a T y p e = " T e x t " > S u b c H e a d e r P h o n e N o < / S u b c H e a d e r P h o n e N o > + 
+         < S u b c H e a d e r P h o n e N o L b l   E l e m e n t T y p e = " C o l u m n "   E l e m e n t I d = " 1 9 1 7 5 3 6 6 9 8 "   D a t a T y p e = " L a b e l " > S u b c H e a d e r P h o n e N o L b l < / S u b c H e a d e r P h o n e N o L b l > + 
+         < S u b c H o m e P a g e _ L b l   E l e m e n t T y p e = " C o l u m n "   E l e m e n t I d = " 1 6 9 1 8 3 9 0 7 5 "   D a t a T y p e = " T e x t " > S u b c H o m e P a g e _ L b l < / S u b c H o m e P a g e _ L b l > + 
+         < S u b c I n v D i s c A m o u n t   E l e m e n t T y p e = " C o l u m n "   E l e m e n t I d = " 3 6 2 0 6 0 3 6 2 "   D a t a T y p e = " T e x t " > S u b c I n v D i s c A m o u n t < / S u b c I n v D i s c A m o u n t > + 
+         < S u b c I n v D i s c A m t C a p t i o n L b l   E l e m e n t T y p e = " C o l u m n "   E l e m e n t I d = " 8 4 7 9 6 3 3 1 8 "   D a t a T y p e = " T e x t " > S u b c I n v D i s c A m t C a p t i o n L b l < / S u b c I n v D i s c A m t C a p t i o n L b l > + 
+         < S u b c O f F o r P a g e L b l   E l e m e n t T y p e = " C o l u m n "   E l e m e n t I d = " 4 8 1 0 1 4 7 3 "   D a t a T y p e = " L a b e l " > S u b c O f F o r P a g e L b l < / S u b c O f F o r P a g e L b l > + 
+         < S u b c o n t r a c t o r D i s p a t c h L i s t L b l   E l e m e n t T y p e = " C o l u m n "   E l e m e n t I d = " 1 0 4 6 4 6 0 7 0 2 "   D a t a T y p e = " L a b e l " > S u b c o n t r a c t o r D i s p a t c h L i s t L b l < / S u b c o n t r a c t o r D i s p a t c h L i s t L b l > + 
+         < S u b c o n t r a c t o r L b l   E l e m e n t T y p e = " C o l u m n "   E l e m e n t I d = " 1 3 9 9 4 5 9 1 2 4 "   D a t a T y p e = " L a b e l " > S u b c o n t r a c t o r L b l < / S u b c o n t r a c t o r L b l > + 
+         < S u b c O r d e r N o C a p t i o n L b l   E l e m e n t T y p e = " C o l u m n "   E l e m e n t I d = " 7 6 3 4 9 9 6 9 5 "   D a t a T y p e = " L a b e l " > S u b c O r d e r N o C a p t i o n L b l < / S u b c O r d e r N o C a p t i o n L b l > + 
+         < S u b c O r d e r _ D a t e   E l e m e n t T y p e = " C o l u m n "   E l e m e n t I d = " 9 9 1 2 1 3 0 1 7 "   D a t a T y p e = " S t r i n g " > S u b c O r d e r _ D a t e < / S u b c O r d e r _ D a t e > + 
+         < S u b c O r d N o L b l   E l e m e n t T y p e = " C o l u m n "   E l e m e n t I d = " 9 0 4 4 0 0 5 0 4 "   D a t a T y p e = " L a b e l " > S u b c O r d N o L b l < / S u b c O r d N o L b l > + 
+         < S u b c P a g e L b l   E l e m e n t T y p e = " C o l u m n "   E l e m e n t I d = " 1 6 2 4 9 6 5 4 4 5 "   D a t a T y p e = " L a b e l " > S u b c P a g e L b l < / S u b c P a g e L b l > + 
+         < S u b c P a y m e n t T e r m s D e s c r i p t i o n L b l   E l e m e n t T y p e = " C o l u m n "   E l e m e n t I d = " 1 9 0 4 6 2 6 2 4 9 "   D a t a T y p e = " T e x t " > S u b c P a y m e n t T e r m s D e s c r i p t i o n L b l < / S u b c P a y m e n t T e r m s D e s c r i p t i o n L b l > + 
+         < S u b c P r i n t A d d r e s s L i n e   E l e m e n t T y p e = " C o l u m n "   E l e m e n t I d = " 1 0 7 3 1 6 2 8 0 3 "   D a t a T y p e = " B o o l e a n " > S u b c P r i n t A d d r e s s L i n e < / S u b c P r i n t A d d r e s s L i n e > + 
+         < S u b c P r i n t B a r C o d e   E l e m e n t T y p e = " C o l u m n "   E l e m e n t I d = " 4 6 3 3 8 1 6 4 9 "   D a t a T y p e = " B o o l e a n " > S u b c P r i n t B a r C o d e < / S u b c P r i n t B a r C o d e > + 
+         < S u b c P r i n t F o o t e r L i n e   E l e m e n t T y p e = " C o l u m n "   E l e m e n t I d = " 9 6 6 7 4 8 3 9 2 "   D a t a T y p e = " B o o l e a n " > S u b c P r i n t F o o t e r L i n e < / S u b c P r i n t F o o t e r L i n e > + 
+         < S u b c P r o m i s e d D e l i v e r y D a t e L b l   E l e m e n t T y p e = " C o l u m n "   E l e m e n t I d = " 1 7 3 6 6 5 5 4 9 9 "   D a t a T y p e = " L a b e l " > S u b c P r o m i s e d D e l i v e r y D a t e L b l < / S u b c P r o m i s e d D e l i v e r y D a t e L b l > + 
+         < S u b c P u r c h D o c N u m   E l e m e n t T y p e = " C o l u m n "   E l e m e n t I d = " 4 6 3 0 2 3 5 6 8 "   D a t a T y p e = " C o d e " > S u b c P u r c h D o c N u m < / S u b c P u r c h D o c N u m > + 
+         < S u b c P u r c h D o c N u m L b l   E l e m e n t T y p e = " C o l u m n "   E l e m e n t I d = " 5 0 2 7 0 4 5 5 8 "   D a t a T y p e = " L a b e l " > S u b c P u r c h D o c N u m L b l < / S u b c P u r c h D o c N u m L b l > + 
+         < S u b c R e g i s t e r C o u r t N o L b l   E l e m e n t T y p e = " C o l u m n "   E l e m e n t I d = " 4 7 4 4 2 9 6 8 1 "   D a t a T y p e = " T e x t " > S u b c R e g i s t e r C o u r t N o L b l < / S u b c R e g i s t e r C o u r t N o L b l > + 
+         < S u b c S a l e s L i n e L i n e D i s c o u n t L b l   E l e m e n t T y p e = " C o l u m n "   E l e m e n t I d = " 1 0 0 9 5 4 9 3 6 5 "   D a t a T y p e = " L a b e l " > S u b c S a l e s L i n e L i n e D i s c o u n t L b l < / S u b c S a l e s L i n e L i n e D i s c o u n t L b l > + 
+         < S u b c S a l e s p e r s o n   E l e m e n t T y p e = " C o l u m n "   E l e m e n t I d = " 1 7 0 8 9 4 8 1 9 1 "   D a t a T y p e = " T e x t " > S u b c S a l e s p e r s o n < / S u b c S a l e s p e r s o n > + 
+         < S u b c S a l e s P e r s o n E m a i l   E l e m e n t T y p e = " C o l u m n "   E l e m e n t I d = " 1 8 6 7 8 0 7 7 9 7 "   D a t a T y p e = " T e x t " > S u b c S a l e s P e r s o n E m a i l < / S u b c S a l e s P e r s o n E m a i l > + 
+         < S u b c S a l e s p e r s o n L b l   E l e m e n t T y p e = " C o l u m n "   E l e m e n t I d = " 1 7 7 0 7 7 5 1 6 3 "   D a t a T y p e = " L a b e l " > S u b c S a l e s p e r s o n L b l < / S u b c S a l e s p e r s o n L b l > + 
+         < S u b c S a l e s P e r s o n P u r c h a s e r E m a i l L b l   E l e m e n t T y p e = " C o l u m n "   E l e m e n t I d = " 2 6 1 6 1 9 0 1 6 "   D a t a T y p e = " L a b e l " > S u b c S a l e s P e r s o n P u r c h a s e r E m a i l L b l < / S u b c S a l e s P e r s o n P u r c h a s e r E m a i l L b l > + 
+         < S u b c S e l l T o C u s t o m e r N o C a p t i o n L b l   E l e m e n t T y p e = " C o l u m n "   E l e m e n t I d = " 1 8 4 6 3 2 6 2 3 8 "   D a t a T y p e = " T e x t " > S u b c S e l l T o C u s t o m e r N o C a p t i o n L b l < / S u b c S e l l T o C u s t o m e r N o C a p t i o n L b l > + 
+         < S u b c S e l l T o C u s t o m e r N o S h i p T o A d d r   E l e m e n t T y p e = " C o l u m n "   E l e m e n t I d = " 1 5 3 0 1 7 9 7 2 8 "   D a t a T y p e = " T e x t " > S u b c S e l l T o C u s t o m e r N o S h i p T o A d d r < / S u b c S e l l T o C u s t o m e r N o S h i p T o A d d r > + 
+         < S u b c S e p e r a t o r 2 L b l   E l e m e n t T y p e = " C o l u m n "   E l e m e n t I d = " 1 9 4 1 7 5 6 9 5 7 "   D a t a T y p e = " T e x t " > S u b c S e p e r a t o r 2 L b l < / S u b c S e p e r a t o r 2 L b l > + 
+         < S u b c S e p e r a t o r 3 L b l   E l e m e n t T y p e = " C o l u m n "   E l e m e n t I d = " 1 8 1 0 2 6 0 5 4 2 "   D a t a T y p e = " T e x t " > S u b c S e p e r a t o r 3 L b l < / S u b c S e p e r a t o r 3 L b l > + 
+         < S u b c S e p e r a t o r L b l   E l e m e n t T y p e = " C o l u m n "   E l e m e n t I d = " 1 0 9 5 5 8 0 1 8 5 "   D a t a T y p e = " T e x t " > S u b c S e p e r a t o r L b l < / S u b c S e p e r a t o r L b l > + 
+         < S u b c S h i p T o A d d r e s s C a p t i o n L b l   E l e m e n t T y p e = " C o l u m n "   E l e m e n t I d = " 1 3 6 5 7 6 4 6 1 7 "   D a t a T y p e = " T e x t " > S u b c S h i p T o A d d r e s s C a p t i o n L b l < / S u b c S h i p T o A d d r e s s C a p t i o n L b l > + 
+         < S u b c S h p t M e t h o d D e s c   E l e m e n t T y p e = " C o l u m n "   E l e m e n t I d = " 1 8 7 7 3 0 1 7 7 1 "   D a t a T y p e = " T e x t " > S u b c S h p t M e t h o d D e s c < / S u b c S h p t M e t h o d D e s c > + 
+         < S u b c S h p t M e t h o d D e s c L b l   E l e m e n t T y p e = " C o l u m n "   E l e m e n t I d = " 1 1 6 9 9 5 4 0 0 1 "   D a t a T y p e = " T e x t " > S u b c S h p t M e t h o d D e s c L b l < / S u b c S h p t M e t h o d D e s c L b l > + 
+         < S u b c T o t a l A m o u n t I n c l V A T   E l e m e n t T y p e = " C o l u m n "   E l e m e n t I d = " 1 8 8 3 5 6 8 5 6 9 "   D a t a T y p e = " S t r i n g " > S u b c T o t a l A m o u n t I n c l V A T < / S u b c T o t a l A m o u n t I n c l V A T > + 
+         < S u b c T o t a l T e x t   E l e m e n t T y p e = " C o l u m n "   E l e m e n t I d = " 7 9 8 5 5 0 8 4 3 "   D a t a T y p e = " T e x t " > S u b c T o t a l T e x t < / S u b c T o t a l T e x t > + 
+         < S u b c U n i t O f M e a s u r e L b l   E l e m e n t T y p e = " C o l u m n "   E l e m e n t I d = " 3 5 0 4 4 8 3 9 3 "   D a t a T y p e = " L a b e l " > S u b c U n i t O f M e a s u r e L b l < / S u b c U n i t O f M e a s u r e L b l > + 
+         < S u b c U n i t _ P r i c e C a p t i o n L b l   E l e m e n t T y p e = " C o l u m n "   E l e m e n t I d = " 1 8 2 0 7 9 6 3 4 2 "   D a t a T y p e = " L a b e l " > S u b c U n i t _ P r i c e C a p t i o n L b l < / S u b c U n i t _ P r i c e C a p t i o n L b l > + 
+         < S u b c V A T A m o u n t   E l e m e n t T y p e = " C o l u m n "   E l e m e n t I d = " 1 9 8 8 8 1 4 0 3 5 "   D a t a T y p e = " S t r i n g " > S u b c V A T A m o u n t < / S u b c V A T A m o u n t > + 
+         < S u b c V A T A m o u n t S p e c i f i c a t i o n C a p t i o n L b l   E l e m e n t T y p e = " C o l u m n "   E l e m e n t I d = " 1 2 5 2 7 6 7 5 8 0 "   D a t a T y p e = " L a b e l " > S u b c V A T A m o u n t S p e c i f i c a t i o n C a p t i o n L b l < / S u b c V A T A m o u n t S p e c i f i c a t i o n C a p t i o n L b l > + 
+         < S u b c V A T B a s e A m o u n t   E l e m e n t T y p e = " C o l u m n "   E l e m e n t I d = " 1 5 9 2 8 9 8 6 0 0 "   D a t a T y p e = " S t r i n g " > S u b c V A T B a s e A m o u n t < / S u b c V A T B a s e A m o u n t > + 
+         < S u b c V A T C l a u s e C a p t i o n L b l   E l e m e n t T y p e = " C o l u m n "   E l e m e n t I d = " 9 3 4 8 8 8 0 1 6 "   D a t a T y p e = " L a b e l " > S u b c V A T C l a u s e C a p t i o n L b l < / S u b c V A T C l a u s e C a p t i o n L b l > + 
+         < S u b c V A T D i s c o u n t A m o u n t   E l e m e n t T y p e = " C o l u m n "   E l e m e n t I d = " 3 4 3 2 3 3 7 8 4 "   D a t a T y p e = " S t r i n g " > S u b c V A T D i s c o u n t A m o u n t < / S u b c V A T D i s c o u n t A m o u n t > + 
+         < S u b c V A T N o   E l e m e n t T y p e = " C o l u m n "   E l e m e n t I d = " 1 5 5 2 1 8 6 2 3 2 "   D a t a T y p e = " T e x t " > S u b c V A T N o < / S u b c V A T N o > + 
+         < S u b c V A T N o L b l   E l e m e n t T y p e = " C o l u m n "   E l e m e n t I d = " 6 1 8 0 8 1 1 9 0 "   D a t a T y p e = " L a b e l " > S u b c V A T N o L b l < / S u b c V A T N o L b l > + 
+         < S u b c V e n d o r N o   E l e m e n t T y p e = " C o l u m n "   E l e m e n t I d = " 1 9 2 8 6 5 0 6 9 5 "   D a t a T y p e = " C o d e " > S u b c V e n d o r N o < / S u b c V e n d o r N o > + 
+         < S u b c V e n d o r N o L b l   E l e m e n t T y p e = " C o l u m n "   E l e m e n t I d = " 9 5 4 8 2 5 9 0 1 "   D a t a T y p e = " L a b e l " > S u b c V e n d o r N o L b l < / S u b c V e n d o r N o L b l > + 
+         < S u b c Y o u r R e f e r e n c e L b l   E l e m e n t T y p e = " C o l u m n "   E l e m e n t I d = " 1 8 4 1 1 9 1 5 6 6 "   D a t a T y p e = " L a b e l " > S u b c Y o u r R e f e r e n c e L b l < / S u b c Y o u r R e f e r e n c e L b l > + 
+         < S u b t o t a l _ L b l   E l e m e n t T y p e = " C o l u m n "   E l e m e n t I d = " 1 9 6 7 7 9 5 1 4 2 "   D a t a T y p e = " L a b e l " > S u b t o t a l _ L b l < / S u b t o t a l _ L b l > + 
+         < T a x I d e n t T y p e C a p t i o n _ L b l   E l e m e n t T y p e = " C o l u m n "   E l e m e n t I d = " 1 2 3 4 9 8 1 3 2 1 "   D a t a T y p e = " L a b e l " > T a x I d e n t T y p e C a p t i o n _ L b l < / T a x I d e n t T y p e C a p t i o n _ L b l > + 
+         < T o C a p t i o n _ L b l   E l e m e n t T y p e = " C o l u m n "   E l e m e n t I d = " 2 0 3 0 5 3 2 2 2 9 "   D a t a T y p e = " L a b e l " > T o C a p t i o n _ L b l < / T o C a p t i o n _ L b l > + 
+         < T o t a l _ L b l   E l e m e n t T y p e = " C o l u m n "   E l e m e n t I d = " 1 2 1 0 1 0 0 8 7 8 "   D a t a T y p e = " L a b e l " > T o t a l _ L b l < / T o t a l _ L b l > + 
+         < V A L V A T B a s e L C Y _ L b l   E l e m e n t T y p e = " C o l u m n "   E l e m e n t I d = " 1 7 0 5 4 3 5 8 1 1 "   D a t a T y p e = " L a b e l " > V A L V A T B a s e L C Y _ L b l < / V A L V A T B a s e L C Y _ L b l > + 
+         < V A T A m t L i n e I n v D i s c B a s e A m t _ L b l   E l e m e n t T y p e = " C o l u m n "   E l e m e n t I d = " 1 6 4 7 3 8 4 9 1 6 "   D a t a T y p e = " L a b e l " > V A T A m t L i n e I n v D i s c B a s e A m t _ L b l < / V A T A m t L i n e I n v D i s c B a s e A m t _ L b l > + 
+         < V A T A m t L i n e L i n e A m t _ L b l   E l e m e n t T y p e = " C o l u m n "   E l e m e n t I d = " 1 1 3 2 2 4 5 2 5 1 "   D a t a T y p e = " L a b e l " > V A T A m t L i n e L i n e A m t _ L b l < / V A T A m t L i n e L i n e A m t _ L b l > + 
+         < V A T A m t L i n e V A T A m t _ L b l   E l e m e n t T y p e = " C o l u m n "   E l e m e n t I d = " 5 0 9 5 8 8 9 9 8 "   D a t a T y p e = " L a b e l " > V A T A m t L i n e V A T A m t _ L b l < / V A T A m t L i n e V A T A m t _ L b l > + 
+         < V A T A m t L i n e V A T _ L b l   E l e m e n t T y p e = " C o l u m n "   E l e m e n t I d = " 1 1 6 2 6 0 3 1 0 2 "   D a t a T y p e = " L a b e l " > V A T A m t L i n e V A T _ L b l < / V A T A m t L i n e V A T _ L b l > + 
+         < V A T A m t S p e c _ L b l   E l e m e n t T y p e = " C o l u m n "   E l e m e n t I d = " 1 5 0 9 9 9 9 3 4 6 "   D a t a T y p e = " L a b e l " > V A T A m t S p e c _ L b l < / V A T A m t S p e c _ L b l > + 
+         < V A T B a s e D i s c _ P u r c h H e a d e r   E l e m e n t T y p e = " C o l u m n "   E l e m e n t I d = " 1 6 3 9 7 3 7 3 5 8 "   D a t a T y p e = " D e c i m a l " > V A T B a s e D i s c _ P u r c h H e a d e r < / V A T B a s e D i s c _ P u r c h H e a d e r > + 
+         < V A T I d e n t i f i e r _ L b l   E l e m e n t T y p e = " C o l u m n "   E l e m e n t I d = " 1 6 8 6 6 2 3 9 8 4 "   D a t a T y p e = " L a b e l " > V A T I d e n t i f i e r _ L b l < / V A T I d e n t i f i e r _ L b l > + 
+         < V A T N o T e x t   E l e m e n t T y p e = " C o l u m n "   E l e m e n t I d = " 1 9 5 9 6 6 3 4 2 6 "   D a t a T y p e = " T e x t " > V A T N o T e x t < / V A T N o T e x t > + 
+         < V A T R e g N o _ P u r c h H e a d e r   E l e m e n t T y p e = " C o l u m n "   E l e m e n t I d = " 9 8 5 0 3 8 1 8 7 "   D a t a T y p e = " T e x t " > V A T R e g N o _ P u r c h H e a d e r < / V A T R e g N o _ P u r c h H e a d e r > + 
+         < V e n d A d d r 1   E l e m e n t T y p e = " C o l u m n "   E l e m e n t I d = " 2 0 3 8 5 3 5 7 8 "   D a t a T y p e = " T e x t " > V e n d A d d r 1 < / V e n d A d d r 1 > + 
+         < V e n d A d d r 2   E l e m e n t T y p e = " C o l u m n "   E l e m e n t I d = " 8 4 1 5 5 0 1 9 5 "   D a t a T y p e = " T e x t " > V e n d A d d r 2 < / V e n d A d d r 2 > + 
+         < V e n d A d d r 3   E l e m e n t T y p e = " C o l u m n "   E l e m e n t I d = " 1 4 7 9 2 4 6 8 1 2 "   D a t a T y p e = " T e x t " > V e n d A d d r 3 < / V e n d A d d r 3 > + 
+         < V e n d A d d r 4   E l e m e n t T y p e = " C o l u m n "   E l e m e n t I d = " 2 1 1 6 9 4 3 4 2 9 "   D a t a T y p e = " T e x t " > V e n d A d d r 4 < / V e n d A d d r 4 > + 
+         < V e n d A d d r 5   E l e m e n t T y p e = " C o l u m n "   E l e m e n t I d = " 1 5 4 0 3 2 7 2 5 0 "   D a t a T y p e = " T e x t " > V e n d A d d r 5 < / V e n d A d d r 5 > + 
+         < V e n d A d d r 6   E l e m e n t T y p e = " C o l u m n "   E l e m e n t I d = " 9 0 2 6 3 0 6 3 3 "   D a t a T y p e = " T e x t " > V e n d A d d r 6 < / V e n d A d d r 6 > + 
+         < V e n d A d d r 7   E l e m e n t T y p e = " C o l u m n "   E l e m e n t I d = " 2 6 4 9 3 4 0 1 6 "   D a t a T y p e = " T e x t " > V e n d A d d r 7 < / V e n d A d d r 7 > + 
+         < V e n d A d d r 8   E l e m e n t T y p e = " C o l u m n "   E l e m e n t I d = " 1 2 4 0 4 4 8 6 7 9 "   D a t a T y p e = " T e x t " > V e n d A d d r 8 < / V e n d A d d r 8 > + 
+         < V e n d N o _ L b l   E l e m e n t T y p e = " C o l u m n "   E l e m e n t I d = " 1 1 9 1 1 1 2 2 4 0 "   D a t a T y p e = " L a b e l " > V e n d N o _ L b l < / V e n d N o _ L b l > + 
+         < V e n d o r I D C a p t i o n _ L b l   E l e m e n t T y p e = " C o l u m n "   E l e m e n t I d = " 1 1 2 9 2 1 9 5 9 3 "   D a t a T y p e = " L a b e l " > V e n d o r I D C a p t i o n _ L b l < / V e n d o r I D C a p t i o n _ L b l > + 
+         < V e n d o r I n v o i c e N o   E l e m e n t T y p e = " C o l u m n "   E l e m e n t I d = " 8 8 7 3 7 6 2 2 5 "   D a t a T y p e = " C o d e " > V e n d o r I n v o i c e N o < / V e n d o r I n v o i c e N o > + 
+         < V e n d o r I n v o i c e N o _ L b l   E l e m e n t T y p e = " C o l u m n "   E l e m e n t I d = " 1 0 3 4 9 0 0 7 0 0 "   D a t a T y p e = " L a b e l " > V e n d o r I n v o i c e N o _ L b l < / V e n d o r I n v o i c e N o _ L b l > + 
+         < V e n d o r O r d e r N o   E l e m e n t T y p e = " C o l u m n "   E l e m e n t I d = " 1 6 4 1 9 6 8 4 4 6 "   D a t a T y p e = " C o d e " > V e n d o r O r d e r N o < / V e n d o r O r d e r N o > + 
+         < V e n d o r O r d e r N o _ L b l   E l e m e n t T y p e = " C o l u m n "   E l e m e n t I d = " 1 5 7 1 7 5 2 4 7 7 "   D a t a T y p e = " L a b e l " > V e n d o r O r d e r N o _ L b l < / V e n d o r O r d e r N o _ L b l > + 
+         < V e n d o r _ _ S u b c o n t r a c t i n g _ L o c a t i o n _ C o d e _   E l e m e n t T y p e = " C o l u m n "   E l e m e n t I d = " 1 3 4 7 4 3 0 9 3 6 "   D a t a T y p e = " C o d e " > V e n d o r _ _ S u b c o n t r a c t i n g _ L o c a t i o n _ C o d e _ < / V e n d o r _ _ S u b c o n t r a c t i n g _ L o c a t i o n _ C o d e _ > + 
+         < V e n d o r _ _ S u b c o n t r a c t i n g _ L o c a t i o n _ C o d e _ C a p t i o n   E l e m e n t T y p e = " C o l u m n "   E l e m e n t I d = " 7 6 3 3 1 5 3 6 6 "   D a t a T y p e = " S t r i n g " > V e n d o r _ _ S u b c o n t r a c t i n g _ L o c a t i o n _ C o d e _ C a p t i o n < / V e n d o r _ _ S u b c o n t r a c t i n g _ L o c a t i o n _ C o d e _ C a p t i o n > + 
+         < Y o u r R e f _ P u r c h H e a d e r   E l e m e n t T y p e = " C o l u m n "   E l e m e n t I d = " 1 9 8 5 3 6 8 6 3 1 "   D a t a T y p e = " T e x t " > Y o u r R e f _ P u r c h H e a d e r < / Y o u r R e f _ P u r c h H e a d e r > + 
+         < P u r c h a s e _ L i n e   E l e m e n t T y p e = " D a t a I t e m "   E l e m e n t I d = " 1 2 9 1 3 1 7 9 1 1 " > + 
+             < A l l o w I n v D i s c t x t   E l e m e n t T y p e = " C o l u m n "   E l e m e n t I d = " 2 0 1 2 9 2 1 6 0 8 "   D a t a T y p e = " T e x t " > A l l o w I n v D i s c t x t < / A l l o w I n v D i s c t x t > + 
+             < A l l o w I n v D i s c _ P u r c h L i n e   E l e m e n t T y p e = " C o l u m n "   E l e m e n t I d = " 9 8 2 2 2 1 3 6 3 "   D a t a T y p e = " B o o l e a n " > A l l o w I n v D i s c _ P u r c h L i n e < / A l l o w I n v D i s c _ P u r c h L i n e > + 
+             < A m o u n t I n c l u d i n g V A T   E l e m e n t T y p e = " C o l u m n "   E l e m e n t I d = " 8 9 1 0 4 9 5 7 1 "   D a t a T y p e = " D e c i m a l " > A m o u n t I n c l u d i n g V A T < / A m o u n t I n c l u d i n g V A T > + 
+             < D e s c _ P u r c h L i n e   E l e m e n t T y p e = " C o l u m n "   E l e m e n t I d = " 1 1 6 1 7 0 2 0 8 9 "   D a t a T y p e = " T e x t " > D e s c _ P u r c h L i n e < / D e s c _ P u r c h L i n e > + 
+             < D e s c _ P u r c h L i n e _ L b l   E l e m e n t T y p e = " C o l u m n "   E l e m e n t I d = " 6 6 5 1 1 3 6 5 2 "   D a t a T y p e = " S t r i n g " > D e s c _ P u r c h L i n e _ L b l < / D e s c _ P u r c h L i n e _ L b l > + 
+             < D i r e c t U n i C o s t _ L b l   E l e m e n t T y p e = " C o l u m n "   E l e m e n t I d = " 7 2 1 4 7 6 6 8 4 "   D a t a T y p e = " L a b e l " > D i r e c t U n i C o s t _ L b l < / D i r e c t U n i C o s t _ L b l > + 
+             < D i r U n i t C o s t _ P u r c h L i n e   E l e m e n t T y p e = " C o l u m n "   E l e m e n t I d = " 9 5 0 9 6 2 5 8 6 "   D a t a T y p e = " T e x t " > D i r U n i t C o s t _ P u r c h L i n e < / D i r U n i t C o s t _ P u r c h L i n e > + 
+             < E x p e c t e d R e c e i p t D a t e   E l e m e n t T y p e = " C o l u m n "   E l e m e n t I d = " 1 9 8 8 0 4 6 2 0 5 "   D a t a T y p e = " S t r i n g " > E x p e c t e d R e c e i p t D a t e < / E x p e c t e d R e c e i p t D a t e > + 
+             < E x p e c t e d R e c e i p t D a t e L b l   E l e m e n t T y p e = " C o l u m n "   E l e m e n t I d = " 1 8 0 6 8 4 1 2 7 1 "   D a t a T y p e = " L a b e l " > E x p e c t e d R e c e i p t D a t e L b l < / E x p e c t e d R e c e i p t D a t e L b l > + 
+             < I n v D i s c A m t _ P u r c h L i n e   E l e m e n t T y p e = " C o l u m n "   E l e m e n t I d = " 1 4 5 3 0 9 9 5 8 0 "   D a t a T y p e = " D e c i m a l " > I n v D i s c A m t _ P u r c h L i n e < / I n v D i s c A m t _ P u r c h L i n e > + 
+             < I n v D i s c C a p t i o n _ L b l   E l e m e n t T y p e = " C o l u m n "   E l e m e n t I d = " 1 9 3 9 0 5 8 9 7 4 "   D a t a T y p e = " L a b e l " > I n v D i s c C a p t i o n _ L b l < / I n v D i s c C a p t i o n _ L b l > + 
+             < I t e m N o _ P u r c h L i n e   E l e m e n t T y p e = " C o l u m n "   E l e m e n t I d = " 1 0 5 7 2 2 4 1 4 0 "   D a t a T y p e = " C o d e " > I t e m N o _ P u r c h L i n e < / I t e m N o _ P u r c h L i n e > + 
+             < I t e m R e f e r e n c e N o _ P u r c h L i n e   E l e m e n t T y p e = " C o l u m n "   E l e m e n t I d = " 1 1 5 8 3 9 2 0 3 1 "   D a t a T y p e = " C o d e " > I t e m R e f e r e n c e N o _ P u r c h L i n e < / I t e m R e f e r e n c e N o _ P u r c h L i n e > + 
+             < J o b N o _ P u r c h L i n e   E l e m e n t T y p e = " C o l u m n "   E l e m e n t I d = " 2 7 7 7 0 3 3 2 6 "   D a t a T y p e = " C o d e " > J o b N o _ P u r c h L i n e < / J o b N o _ P u r c h L i n e > + 
+             < J o b N o _ P u r c h L i n e _ L b l   E l e m e n t T y p e = " C o l u m n "   E l e m e n t I d = " 9 6 0 0 7 3 4 1 1 "   D a t a T y p e = " L a b e l " > J o b N o _ P u r c h L i n e _ L b l < / J o b N o _ P u r c h L i n e _ L b l > + 
+             < J o b T a s k N o _ P u r c h L i n e   E l e m e n t T y p e = " C o l u m n "   E l e m e n t I d = " 7 2 6 6 6 9 0 1 1 "   D a t a T y p e = " C o d e " > J o b T a s k N o _ P u r c h L i n e < / J o b T a s k N o _ P u r c h L i n e > + 
+             < J o b T a s k N o _ P u r c h L i n e _ L b l   E l e m e n t T y p e = " C o l u m n "   E l e m e n t I d = " 2 0 4 9 1 3 1 1 8 2 "   D a t a T y p e = " L a b e l " > J o b T a s k N o _ P u r c h L i n e _ L b l < / J o b T a s k N o _ P u r c h L i n e _ L b l > + 
+             < L i n e A m t _ P u r c h L i n e   E l e m e n t T y p e = " C o l u m n "   E l e m e n t I d = " 1 5 9 3 7 5 8 6 7 4 "   D a t a T y p e = " T e x t " > L i n e A m t _ P u r c h L i n e < / L i n e A m t _ P u r c h L i n e > + 
+             < L i n e D i s c _ P u r c h L i n e   E l e m e n t T y p e = " C o l u m n "   E l e m e n t I d = " 2 1 3 3 2 3 3 9 7 3 "   D a t a T y p e = " D e c i m a l " > L i n e D i s c _ P u r c h L i n e < / L i n e D i s c _ P u r c h L i n e > + 
+             < L i n e N o _ P u r c h L i n e   E l e m e n t T y p e = " C o l u m n "   E l e m e n t I d = " 1 7 4 8 8 4 8 6 5 "   D a t a T y p e = " I n t e g e r " > L i n e N o _ P u r c h L i n e < / L i n e N o _ P u r c h L i n e > + 
+             < N o _ P u r c h L i n e   E l e m e n t T y p e = " C o l u m n "   E l e m e n t I d = " 2 8 8 5 5 1 3 4 3 "   D a t a T y p e = " T e x t " > N o _ P u r c h L i n e < / N o _ P u r c h L i n e > + 
+             < N o _ P u r c h L i n e _ L b l   E l e m e n t T y p e = " C o l u m n "   E l e m e n t I d = " 1 8 4 4 9 0 6 5 4 0 "   D a t a T y p e = " S t r i n g " > N o _ P u r c h L i n e _ L b l < / N o _ P u r c h L i n e _ L b l > + 
+             < P l a n n e d R e c e i p t D a t e   E l e m e n t T y p e = " C o l u m n "   E l e m e n t I d = " 1 1 4 0 0 3 3 3 2 1 "   D a t a T y p e = " S t r i n g " > P l a n n e d R e c e i p t D a t e < / P l a n n e d R e c e i p t D a t e > + 
+             < P l a n n e d R e c e i p t D a t e L b l   E l e m e n t T y p e = " C o l u m n "   E l e m e n t I d = " 1 4 7 8 7 6 7 2 9 9 "   D a t a T y p e = " L a b e l " > P l a n n e d R e c e i p t D a t e L b l < / P l a n n e d R e c e i p t D a t e L b l > + 
+             < P r o m i s e d R e c e i p t D a t e   E l e m e n t T y p e = " C o l u m n "   E l e m e n t I d = " 2 9 4 5 3 0 7 8 "   D a t a T y p e = " S t r i n g " > P r o m i s e d R e c e i p t D a t e < / P r o m i s e d R e c e i p t D a t e > + 
+             < P r o m i s e d R e c e i p t D a t e L b l   E l e m e n t T y p e = " C o l u m n "   E l e m e n t I d = " 2 0 2 4 9 3 8 1 7 2 "   D a t a T y p e = " L a b e l " > P r o m i s e d R e c e i p t D a t e L b l < / P r o m i s e d R e c e i p t D a t e L b l > + 
+             < P u r c h a s e _ L i n e _ O p e r a t i o n _ N o _   E l e m e n t T y p e = " C o l u m n "   E l e m e n t I d = " 9 3 5 5 8 5 3 8 8 "   D a t a T y p e = " C o d e " > P u r c h a s e _ L i n e _ O p e r a t i o n _ N o _ < / P u r c h a s e _ L i n e _ O p e r a t i o n _ N o _ > + 
+             < P u r c h a s e _ L i n e _ O u t s t a n d i n g _ Q t y   E l e m e n t T y p e = " C o l u m n "   E l e m e n t I d = " 2 1 2 3 0 1 5 5 8 3 "   D a t a T y p e = " D e c i m a l " > P u r c h a s e _ L i n e _ O u t s t a n d i n g _ Q t y < / P u r c h a s e _ L i n e _ O u t s t a n d i n g _ Q t y > + 
+             < P u r c h a s e _ L i n e _ P r o d _ _ O r d e r _ L i n e _ N o _   E l e m e n t T y p e = " C o l u m n "   E l e m e n t I d = " 1 3 4 8 1 7 1 5 8 5 "   D a t a T y p e = " I n t e g e r " > P u r c h a s e _ L i n e _ P r o d _ _ O r d e r _ L i n e _ N o _ < / P u r c h a s e _ L i n e _ P r o d _ _ O r d e r _ L i n e _ N o _ > + 
+             < P u r c h a s e _ L i n e _ P r o d _ _ O r d e r _ N o _   E l e m e n t T y p e = " C o l u m n "   E l e m e n t I d = " 4 3 3 0 9 7 7 9 4 "   D a t a T y p e = " C o d e " > P u r c h a s e _ L i n e _ P r o d _ _ O r d e r _ N o _ < / P u r c h a s e _ L i n e _ P r o d _ _ O r d e r _ N o _ > + 
+             < P u r c h a s e _ L i n e _ R o u t i n g _ N o _   E l e m e n t T y p e = " C o l u m n "   E l e m e n t I d = " 7 8 0 1 6 3 6 5 3 "   D a t a T y p e = " C o d e " > P u r c h a s e _ L i n e _ R o u t i n g _ N o _ < / P u r c h a s e _ L i n e _ R o u t i n g _ N o _ > + 
+             < P u r c h a s e _ L i n e _ R o u t i n g _ R e f e r e n c e _ N o _   E l e m e n t T y p e = " C o l u m n "   E l e m e n t I d = " 1 2 0 9 1 3 5 8 4 7 "   D a t a T y p e = " I n t e g e r " > P u r c h a s e _ L i n e _ R o u t i n g _ R e f e r e n c e _ N o _ < / P u r c h a s e _ L i n e _ R o u t i n g _ R e f e r e n c e _ N o _ > + 
+             < P u r c h L i n e L i n e D i s c _ L b l   E l e m e n t T y p e = " C o l u m n "   E l e m e n t I d = " 5 7 3 7 9 3 8 4 1 "   D a t a T y p e = " L a b e l " > P u r c h L i n e L i n e D i s c _ L b l < / P u r c h L i n e L i n e D i s c _ L b l > + 
+             < Q t y _ P u r c h L i n e   E l e m e n t T y p e = " C o l u m n "   E l e m e n t I d = " 7 8 0 8 5 8 6 7 6 "   D a t a T y p e = " T e x t " > Q t y _ P u r c h L i n e < / Q t y _ P u r c h L i n e > + 
+             < Q t y _ P u r c h L i n e _ L b l   E l e m e n t T y p e = " C o l u m n "   E l e m e n t I d = " 6 6 5 5 0 9 2 9 "   D a t a T y p e = " S t r i n g " > Q t y _ P u r c h L i n e _ L b l < / Q t y _ P u r c h L i n e _ L b l > + 
+             < R e q u e s t e d R e c e i p t D a t e   E l e m e n t T y p e = " C o l u m n "   E l e m e n t I d = " 9 3 3 1 1 2 9 3 1 "   D a t a T y p e = " S t r i n g " > R e q u e s t e d R e c e i p t D a t e < / R e q u e s t e d R e c e i p t D a t e > + 
+             < R e q u e s t e d R e c e i p t D a t e L b l   E l e m e n t T y p e = " C o l u m n "   E l e m e n t I d = " 1 4 4 2 7 6 8 2 3 "   D a t a T y p e = " L a b e l " > R e q u e s t e d R e c e i p t D a t e L b l < / R e q u e s t e d R e c e i p t D a t e L b l > + 
+             < S u b c D e s c r i p t i o n C a p t i o n   E l e m e n t T y p e = " C o l u m n "   E l e m e n t I d = " 9 7 9 9 2 9 3 3 4 "   D a t a T y p e = " S t r i n g " > S u b c D e s c r i p t i o n C a p t i o n < / S u b c D e s c r i p t i o n C a p t i o n > + 
+             < S u b c E x p e c t e d R e c e i p t D a t e   E l e m e n t T y p e = " C o l u m n "   E l e m e n t I d = " 2 4 9 0 3 9 1 7 2 "   D a t a T y p e = " S t r i n g " > S u b c E x p e c t e d R e c e i p t D a t e < / S u b c E x p e c t e d R e c e i p t D a t e > + 
+             < S u b c L i n e D e s c r i p t i o n 2   E l e m e n t T y p e = " C o l u m n "   E l e m e n t I d = " 1 3 3 9 9 9 1 1 2 "   D a t a T y p e = " T e x t " > S u b c L i n e D e s c r i p t i o n 2 < / S u b c L i n e D e s c r i p t i o n 2 > + 
+             < S u b c L i n e D i s c   E l e m e n t T y p e = " C o l u m n "   E l e m e n t I d = " 6 5 8 9 8 0 3 1 "   D a t a T y p e = " T e x t " > S u b c L i n e D i s c < / S u b c L i n e D i s c > + 
+             < S u b c L i n e M a r k   E l e m e n t T y p e = " C o l u m n "   E l e m e n t I d = " 2 0 5 3 3 6 4 2 9 7 "   D a t a T y p e = " T e x t " > S u b c L i n e M a r k < / S u b c L i n e M a r k > + 
+             < S u b c N o C a p t i o n   E l e m e n t T y p e = " C o l u m n "   E l e m e n t I d = " 6 2 7 1 3 7 4 2 1 "   D a t a T y p e = " S t r i n g " > S u b c N o C a p t i o n < / S u b c N o C a p t i o n > + 
+             < S u b c P o s N o T e x t   E l e m e n t T y p e = " C o l u m n "   E l e m e n t I d = " 1 5 9 5 3 4 0 1 3 8 "   D a t a T y p e = " T e x t " > S u b c P o s N o T e x t < / S u b c P o s N o T e x t > + 
+             < S u b c P U o M   E l e m e n t T y p e = " C o l u m n "   E l e m e n t I d = " 3 2 6 3 6 9 9 6 3 "   D a t a T y p e = " T e x t " > S u b c P U o M < / S u b c P U o M > + 
+             < S u b c P u r c h Q t y   E l e m e n t T y p e = " C o l u m n "   E l e m e n t I d = " 8 8 0 6 5 5 3 7 4 "   D a t a T y p e = " D e c i m a l " > S u b c P u r c h Q t y < / S u b c P u r c h Q t y > + 
+             < S u b c P U S   E l e m e n t T y p e = " C o l u m n "   E l e m e n t I d = " 1 5 5 6 6 5 5 6 "   D a t a T y p e = " T e x t " > S u b c P U S < / S u b c P U S > + 
+             < S u b c Q u a n t i t y C a p t i o n   E l e m e n t T y p e = " C o l u m n "   E l e m e n t I d = " 2 1 3 5 9 0 4 0 2 5 "   D a t a T y p e = " S t r i n g " > S u b c Q u a n t i t y C a p t i o n < / S u b c Q u a n t i t y C a p t i o n > + 
+             < S u b c S a l e s L i n e L i n e A m o u n t   E l e m e n t T y p e = " C o l u m n "   E l e m e n t I d = " 2 6 3 1 4 5 7 0 2 "   D a t a T y p e = " T e x t " > S u b c S a l e s L i n e L i n e A m o u n t < / S u b c S a l e s L i n e L i n e A m o u n t > + 
+             < S u b c U n i t C o s t   E l e m e n t T y p e = " C o l u m n "   E l e m e n t I d = " 7 7 2 9 2 9 4 9 5 "   D a t a T y p e = " T e x t " > S u b c U n i t C o s t < / S u b c U n i t C o s t > + 
+             < T o t a l I n c l V A T   E l e m e n t T y p e = " C o l u m n "   E l e m e n t I d = " 2 0 6 6 5 7 4 0 8 4 "   D a t a T y p e = " D e c i m a l " > T o t a l I n c l V A T < / T o t a l I n c l V A T > + 
+             < T o t a l P r i c e C a p t i o n _ L b l   E l e m e n t T y p e = " C o l u m n "   E l e m e n t I d = " 1 7 4 8 7 7 2 0 5 5 "   D a t a T y p e = " L a b e l " > T o t a l P r i c e C a p t i o n _ L b l < / T o t a l P r i c e C a p t i o n _ L b l > + 
+             < T y p e _ P u r c h L i n e   E l e m e n t T y p e = " C o l u m n "   E l e m e n t I d = " 8 0 9 4 7 1 0 8 8 "   D a t a T y p e = " S t r i n g " > T y p e _ P u r c h L i n e < / T y p e _ P u r c h L i n e > + 
+             < U n i t P r i c e _ P u r c h L i n e   E l e m e n t T y p e = " C o l u m n "   E l e m e n t I d = " 2 0 6 3 2 5 9 8 1 9 "   D a t a T y p e = " D e c i m a l " > U n i t P r i c e _ P u r c h L i n e < / U n i t P r i c e _ P u r c h L i n e > + 
+             < U n i t P r i c e _ P u r c h L i n e _ L b l   E l e m e n t T y p e = " C o l u m n "   E l e m e n t I d = " 7 0 4 0 2 1 4 6 2 "   D a t a T y p e = " L a b e l " > U n i t P r i c e _ P u r c h L i n e _ L b l < / U n i t P r i c e _ P u r c h L i n e _ L b l > + 
+             < U O M _ P u r c h L i n e   E l e m e n t T y p e = " C o l u m n "   E l e m e n t I d = " 4 4 1 1 3 9 0 4 9 "   D a t a T y p e = " T e x t " > U O M _ P u r c h L i n e < / U O M _ P u r c h L i n e > + 
+             < U O M _ P u r c h L i n e _ L b l   E l e m e n t T y p e = " C o l u m n "   E l e m e n t I d = " 1 8 5 6 1 1 3 1 9 4 "   D a t a T y p e = " L a b e l " > U O M _ P u r c h L i n e _ L b l < / U O M _ P u r c h L i n e _ L b l > + 
+             < V A T D i s c o u n t A m o u n t _ L b l   E l e m e n t T y p e = " C o l u m n "   E l e m e n t I d = " 1 3 5 5 1 2 6 5 3 8 "   D a t a T y p e = " L a b e l " > V A T D i s c o u n t A m o u n t _ L b l < / V A T D i s c o u n t A m o u n t _ L b l > + 
+             < V A T I d e n t i f i e r _ P u r c h L i n e   E l e m e n t T y p e = " C o l u m n "   E l e m e n t I d = " 1 0 5 5 6 1 2 1 2 8 "   D a t a T y p e = " C o d e " > V A T I d e n t i f i e r _ P u r c h L i n e < / V A T I d e n t i f i e r _ P u r c h L i n e > + 
+             < V A T I d e n t i f i e r _ P u r c h L i n e _ L b l   E l e m e n t T y p e = " C o l u m n "   E l e m e n t I d = " 1 4 0 4 1 9 4 8 1 9 "   D a t a T y p e = " S t r i n g " > V A T I d e n t i f i e r _ P u r c h L i n e _ L b l < / V A T I d e n t i f i e r _ P u r c h L i n e _ L b l > + 
+             < V e n d o r I t e m N o _ P u r c h L i n e   E l e m e n t T y p e = " C o l u m n "   E l e m e n t I d = " 1 9 1 8 6 5 6 1 6 0 "   D a t a T y p e = " T e x t " > V e n d o r I t e m N o _ P u r c h L i n e < / V e n d o r I t e m N o _ P u r c h L i n e > + 
+             < P r o d _ O r d e r _ L i n e   E l e m e n t T y p e = " D a t a I t e m "   E l e m e n t I d = " 3 4 3 3 1 8 6 8 "   / > + 
+             < P r o d _ O r d e r _ R o u t i n g _ L i n e   E l e m e n t T y p e = " D a t a I t e m "   E l e m e n t I d = " 9 4 8 4 0 6 1 1 9 " > + 
+                 < C o m p o n e n t s T o S h i p L b l   E l e m e n t T y p e = " C o l u m n "   E l e m e n t I d = " 1 8 3 3 5 4 1 8 1 8 "   D a t a T y p e = " L a b e l " > C o m p o n e n t s T o S h i p L b l < / C o m p o n e n t s T o S h i p L b l > + 
+                 < E n d i n g D a t e L b l   E l e m e n t T y p e = " C o l u m n "   E l e m e n t I d = " 7 2 2 0 5 2 3 8 0 "   D a t a T y p e = " L a b e l " > E n d i n g D a t e L b l < / E n d i n g D a t e L b l > + 
+                 < I t e m L b l   E l e m e n t T y p e = " C o l u m n "   E l e m e n t I d = " 2 1 1 5 2 0 3 3 0 "   D a t a T y p e = " L a b e l " > I t e m L b l < / I t e m L b l > + 
+                 < P r o d O r d e r L b l   E l e m e n t T y p e = " C o l u m n "   E l e m e n t I d = " 3 7 7 4 0 9 6 5 6 "   D a t a T y p e = " L a b e l " > P r o d O r d e r L b l < / P r o d O r d e r L b l > + 
+                 < P r o d _ _ O r d e r _ L i n e _ _ Q u a n t i t y   E l e m e n t T y p e = " C o l u m n "   E l e m e n t I d = " 5 5 7 1 7 6 8 1 6 "   D a t a T y p e = " S t r i n g " > P r o d _ _ O r d e r _ L i n e _ _ Q u a n t i t y < / P r o d _ _ O r d e r _ L i n e _ _ Q u a n t i t y > + 
+                 < P r o d _ _ O r d e r _ L i n e _ _ _ I t e m _ N o _ _   E l e m e n t T y p e = " C o l u m n "   E l e m e n t I d = " 1 4 4 5 8 3 7 4 7 3 "   D a t a T y p e = " C o d e " > P r o d _ _ O r d e r _ L i n e _ _ _ I t e m _ N o _ _ < / P r o d _ _ O r d e r _ L i n e _ _ _ I t e m _ N o _ _ > + 
+                 < P r o d _ _ O r d e r _ L i n e _ _ _ Q u a n t i t y _ _ B a s e _ _   E l e m e n t T y p e = " C o l u m n "   E l e m e n t I d = " 5 4 9 7 6 2 9 4 "   D a t a T y p e = " D e c i m a l " > P r o d _ _ O r d e r _ L i n e _ _ _ Q u a n t i t y _ _ B a s e _ _ < / P r o d _ _ O r d e r _ L i n e _ _ _ Q u a n t i t y _ _ B a s e _ _ > + 
+                 < P r o d _ _ O r d e r _ L i n e _ _ _ R e m a i n i n g _ Q u a n t i t y _   E l e m e n t T y p e = " C o l u m n "   E l e m e n t I d = " 1 6 3 4 3 5 0 7 3 9 "   D a t a T y p e = " S t r i n g " > P r o d _ _ O r d e r _ L i n e _ _ _ R e m a i n i n g _ Q u a n t i t y _ < / P r o d _ _ O r d e r _ L i n e _ _ _ R e m a i n i n g _ Q u a n t i t y _ > + 
+                 < P r o d _ _ O r d e r _ L i n e _ _ _ U n i t _ o f _ M e a s u r e _ C o d e _   E l e m e n t T y p e = " C o l u m n "   E l e m e n t I d = " 9 5 8 0 7 4 5 4 "   D a t a T y p e = " C o d e " > P r o d _ _ O r d e r _ L i n e _ _ _ U n i t _ o f _ M e a s u r e _ C o d e _ < / P r o d _ _ O r d e r _ L i n e _ _ _ U n i t _ o f _ M e a s u r e _ C o d e _ > + 
+                 < P r o d _ _ O r d e r _ R o u t i n g _ L i n e _ D e s c r i p t i o n   E l e m e n t T y p e = " C o l u m n "   E l e m e n t I d = " 1 1 8 5 2 9 4 8 9 7 "   D a t a T y p e = " T e x t " > P r o d _ _ O r d e r _ R o u t i n g _ L i n e _ D e s c r i p t i o n < / P r o d _ _ O r d e r _ R o u t i n g _ L i n e _ D e s c r i p t i o n > + 
+                 < P r o d _ _ O r d e r _ R o u t i n g _ L i n e _ D e s c r i p t i o n _ C o n t r o l 1 1 3 0 5 3 8   E l e m e n t T y p e = " C o l u m n "   E l e m e n t I d = " 2 0 5 0 0 9 4 6 2 0 "   D a t a T y p e = " T e x t " > P r o d _ _ O r d e r _ R o u t i n g _ L i n e _ D e s c r i p t i o n _ C o n t r o l 1 1 3 0 5 3 8 < / P r o d _ _ O r d e r _ R o u t i n g _ L i n e _ D e s c r i p t i o n _ C o n t r o l 1 1 3 0 5 3 8 > + 
+                 < P r o d _ _ O r d e r _ R o u t i n g _ L i n e _ R o u t i n g _ L i n k _ C o d e   E l e m e n t T y p e = " C o l u m n "   E l e m e n t I d = " 1 2 4 7 0 8 9 6 6 "   D a t a T y p e = " C o d e " > P r o d _ _ O r d e r _ R o u t i n g _ L i n e _ R o u t i n g _ L i n k _ C o d e < / P r o d _ _ O r d e r _ R o u t i n g _ L i n e _ R o u t i n g _ L i n k _ C o d e > + 
+                 < P r o d _ _ O r d e r _ R o u t i n g _ L i n e _ R o u t i n g _ N o _   E l e m e n t T y p e = " C o l u m n "   E l e m e n t I d = " 1 0 6 0 7 5 6 5 4 "   D a t a T y p e = " C o d e " > P r o d _ _ O r d e r _ R o u t i n g _ L i n e _ R o u t i n g _ N o _ < / P r o d _ _ O r d e r _ R o u t i n g _ L i n e _ R o u t i n g _ N o _ > + 
+                 < P r o d _ _ O r d e r _ R o u t i n g _ L i n e _ R o u t i n g _ R e f e r e n c e _ N o _   E l e m e n t T y p e = " C o l u m n "   E l e m e n t I d = " 2 7 3 1 5 8 7 7 8 "   D a t a T y p e = " I n t e g e r " > P r o d _ _ O r d e r _ R o u t i n g _ L i n e _ R o u t i n g _ R e f e r e n c e _ N o _ < / P r o d _ _ O r d e r _ R o u t i n g _ L i n e _ R o u t i n g _ R e f e r e n c e _ N o _ > + 
+                 < P r o d _ _ O r d e r _ R o u t i n g _ L i n e _ S t a t u s   E l e m e n t T y p e = " C o l u m n "   E l e m e n t I d = " 7 9 8 1 7 9 9 1 7 "   D a t a T y p e = " E n u m " > P r o d _ _ O r d e r _ R o u t i n g _ L i n e _ S t a t u s < / P r o d _ _ O r d e r _ R o u t i n g _ L i n e _ S t a t u s > + 
+                 < P r o d _ _ O r d e r _ R o u t i n g _ L i n e _ _ E n d i n g _ D a t e _   E l e m e n t T y p e = " C o l u m n "   E l e m e n t I d = " 6 8 7 0 9 4 1 3 1 "   D a t a T y p e = " S t r i n g " > P r o d _ _ O r d e r _ R o u t i n g _ L i n e _ _ E n d i n g _ D a t e _ < / P r o d _ _ O r d e r _ R o u t i n g _ L i n e _ _ E n d i n g _ D a t e _ > + 
+                 < P r o d _ _ O r d e r _ R o u t i n g _ L i n e _ _ O p e r a t i o n _ N o _ _   E l e m e n t T y p e = " C o l u m n "   E l e m e n t I d = " 1 6 4 1 3 6 8 4 3 "   D a t a T y p e = " C o d e " > P r o d _ _ O r d e r _ R o u t i n g _ L i n e _ _ O p e r a t i o n _ N o _ _ < / P r o d _ _ O r d e r _ R o u t i n g _ L i n e _ _ O p e r a t i o n _ N o _ _ > + 
+                 < P r o d _ _ O r d e r _ R o u t i n g _ L i n e _ _ O p e r a t i o n _ N o _ _ C a p t i o n   E l e m e n t T y p e = " C o l u m n "   E l e m e n t I d = " 7 6 3 5 7 3 6 9 9 "   D a t a T y p e = " S t r i n g " > P r o d _ _ O r d e r _ R o u t i n g _ L i n e _ _ O p e r a t i o n _ N o _ _ C a p t i o n < / P r o d _ _ O r d e r _ R o u t i n g _ L i n e _ _ O p e r a t i o n _ N o _ _ C a p t i o n > + 
+                 < P r o d _ _ O r d e r _ R o u t i n g _ L i n e _ _ P r o d _ _ O r d e r _ N o _ _   E l e m e n t T y p e = " C o l u m n "   E l e m e n t I d = " 9 8 1 9 6 1 5 8 5 "   D a t a T y p e = " C o d e " > P r o d _ _ O r d e r _ R o u t i n g _ L i n e _ _ P r o d _ _ O r d e r _ N o _ _ < / P r o d _ _ O r d e r _ R o u t i n g _ L i n e _ _ P r o d _ _ O r d e r _ N o _ _ > + 
+                 < P r o d _ _ O r d e r _ R o u t i n g _ L i n e _ _ S t a r t i n g _ D a t e _   E l e m e n t T y p e = " C o l u m n "   E l e m e n t I d = " 1 1 5 9 6 4 7 6 "   D a t a T y p e = " S t r i n g " > P r o d _ _ O r d e r _ R o u t i n g _ L i n e _ _ S t a r t i n g _ D a t e _ < / P r o d _ _ O r d e r _ R o u t i n g _ L i n e _ _ S t a r t i n g _ D a t e _ > + 
+                 < Q t y T o S h i p L b l   E l e m e n t T y p e = " C o l u m n "   E l e m e n t I d = " 5 1 0 9 0 6 0 8 2 "   D a t a T y p e = " L a b e l " > Q t y T o S h i p L b l < / Q t y T o S h i p L b l > + 
+                 < Q u a n t i t y B a s e L b l   E l e m e n t T y p e = " C o l u m n "   E l e m e n t I d = " 1 8 2 8 0 4 3 4 1 7 "   D a t a T y p e = " L a b e l " > Q u a n t i t y B a s e L b l < / Q u a n t i t y B a s e L b l > + 
+                 < Q u a n t i t y L b l   E l e m e n t T y p e = " C o l u m n "   E l e m e n t I d = " 2 7 2 0 7 7 8 0 "   D a t a T y p e = " L a b e l " > Q u a n t i t y L b l < / Q u a n t i t y L b l > + 
+                 < R e m a i n i n g Q u a n t i t y L b l   E l e m e n t T y p e = " C o l u m n "   E l e m e n t I d = " 1 4 8 4 1 1 8 8 4 8 "   D a t a T y p e = " L a b e l " > R e m a i n i n g Q u a n t i t y L b l < / R e m a i n i n g Q u a n t i t y L b l > + 
+                 < S t a r t i n g D a t e L b l   E l e m e n t T y p e = " C o l u m n "   E l e m e n t I d = " 4 3 9 3 8 1 8 8 3 "   D a t a T y p e = " L a b e l " > S t a r t i n g D a t e L b l < / S t a r t i n g D a t e L b l > + 
+                 < U o M L b l   E l e m e n t T y p e = " C o l u m n "   E l e m e n t I d = " 7 3 6 2 1 6 7 6 0 "   D a t a T y p e = " L a b e l " > U o M L b l < / U o M L b l > + 
+                 < P r o d _ O r d e r _ C o m p o n e n t   E l e m e n t T y p e = " D a t a I t e m "   E l e m e n t I d = " 1 0 0 9 9 9 2 6 7 7 " > + 
+                     < E x p e c t e d _ Q t y _ _ _ B a s e _ _ _ _ _ _ Q t y _ _ t r a n s f _ _ t o _ S u b c o n t r a c t o r _ _ _ _ _ _ Q t y _ _ i n _ T r a n s i t _ _ B a s e _ _   E l e m e n t T y p e = " C o l u m n "   E l e m e n t I d = " 1 2 3 3 3 6 3 3 3 1 "   D a t a T y p e = " D e c i m a l " > E x p e c t e d _ Q t y _ _ _ B a s e _ _ _ _ _ _ Q t y _ _ t r a n s f _ _ t o _ S u b c o n t r a c t o r _ _ _ _ _ _ Q t y _ _ i n _ T r a n s i t _ _ B a s e _ _ < / E x p e c t e d _ Q t y _ _ _ B a s e _ _ _ _ _ _ Q t y _ _ t r a n s f _ _ t o _ S u b c o n t r a c t o r _ _ _ _ _ _ Q t y _ _ i n _ T r a n s i t _ _ B a s e _ _ > + 
+                     < P r o d _ _ O r d e r _ C o m p o n e n t _ D e s c r i p t i o n   E l e m e n t T y p e = " C o l u m n "   E l e m e n t I d = " 1 3 0 9 7 4 4 4 3 "   D a t a T y p e = " T e x t " > P r o d _ _ O r d e r _ C o m p o n e n t _ D e s c r i p t i o n < / P r o d _ _ O r d e r _ C o m p o n e n t _ D e s c r i p t i o n > + 
+                     < P r o d _ _ O r d e r _ C o m p o n e n t _ L i n e _ N o _   E l e m e n t T y p e = " C o l u m n "   E l e m e n t I d = " 1 2 5 8 8 4 1 3 9 0 "   D a t a T y p e = " I n t e g e r " > P r o d _ _ O r d e r _ C o m p o n e n t _ L i n e _ N o _ < / P r o d _ _ O r d e r _ C o m p o n e n t _ L i n e _ N o _ > + 
+                     < P r o d _ _ O r d e r _ C o m p o n e n t _ P r o d _ _ O r d e r _ L i n e _ N o _   E l e m e n t T y p e = " C o l u m n "   E l e m e n t I d = " 1 7 2 6 5 5 2 3 1 8 "   D a t a T y p e = " I n t e g e r " > P r o d _ _ O r d e r _ C o m p o n e n t _ P r o d _ _ O r d e r _ L i n e _ N o _ < / P r o d _ _ O r d e r _ C o m p o n e n t _ P r o d _ _ O r d e r _ L i n e _ N o _ > + 
+                     < P r o d _ _ O r d e r _ C o m p o n e n t _ P r o d _ _ O r d e r _ N o _   E l e m e n t T y p e = " C o l u m n "   E l e m e n t I d = " 1 4 6 7 3 5 3 9 2 5 "   D a t a T y p e = " C o d e " > P r o d _ _ O r d e r _ C o m p o n e n t _ P r o d _ _ O r d e r _ N o _ < / P r o d _ _ O r d e r _ C o m p o n e n t _ P r o d _ _ O r d e r _ N o _ > + 
+                     < P r o d _ _ O r d e r _ C o m p o n e n t _ R o u t i n g _ L i n k _ C o d e   E l e m e n t T y p e = " C o l u m n "   E l e m e n t I d = " 2 0 6 8 1 8 6 1 8 0 "   D a t a T y p e = " C o d e " > P r o d _ _ O r d e r _ C o m p o n e n t _ R o u t i n g _ L i n k _ C o d e < / P r o d _ _ O r d e r _ C o m p o n e n t _ R o u t i n g _ L i n k _ C o d e > + 
+                     < P r o d _ _ O r d e r _ C o m p o n e n t _ S t a t u s   E l e m e n t T y p e = " C o l u m n "   E l e m e n t I d = " 6 0 3 9 0 9 7 0 3 "   D a t a T y p e = " E n u m " > P r o d _ _ O r d e r _ C o m p o n e n t _ S t a t u s < / P r o d _ _ O r d e r _ C o m p o n e n t _ S t a t u s > + 
+                     < P r o d _ _ O r d e r _ C o m p o n e n t _ _ E x p e c t e d _ Q t y _ _ _ B a s e _ _   E l e m e n t T y p e = " C o l u m n "   E l e m e n t I d = " 1 2 7 8 2 8 1 7 1 "   D a t a T y p e = " D e c i m a l " > P r o d _ _ O r d e r _ C o m p o n e n t _ _ E x p e c t e d _ Q t y _ _ _ B a s e _ _ < / P r o d _ _ O r d e r _ C o m p o n e n t _ _ E x p e c t e d _ Q t y _ _ _ B a s e _ _ > + 
+                     < P r o d _ _ O r d e r _ C o m p o n e n t _ _ E x p e c t e d _ Q t y _ _ _ B a s e _ _ C a p t i o n   E l e m e n t T y p e = " C o l u m n "   E l e m e n t I d = " 1 9 4 1 9 0 5 3 0 9 "   D a t a T y p e = " S t r i n g " > P r o d _ _ O r d e r _ C o m p o n e n t _ _ E x p e c t e d _ Q t y _ _ _ B a s e _ _ C a p t i o n < / P r o d _ _ O r d e r _ C o m p o n e n t _ _ E x p e c t e d _ Q t y _ _ _ B a s e _ _ C a p t i o n > + 
+                     < P r o d _ _ O r d e r _ C o m p o n e n t _ _ I t e m _ N o _ _   E l e m e n t T y p e = " C o l u m n "   E l e m e n t I d = " 6 2 8 6 8 6 0 8 7 "   D a t a T y p e = " C o d e " > P r o d _ _ O r d e r _ C o m p o n e n t _ _ I t e m _ N o _ _ < / P r o d _ _ O r d e r _ C o m p o n e n t _ _ I t e m _ N o _ _ > + 
+                     < P r o d _ _ O r d e r _ C o m p o n e n t _ _ Q t y _ _ i n _ T r a n s i t _ _ B a s e _ _   E l e m e n t T y p e = " C o l u m n "   E l e m e n t I d = " 1 9 9 5 0 4 3 4 3 6 "   D a t a T y p e = " D e c i m a l " > P r o d _ _ O r d e r _ C o m p o n e n t _ _ Q t y _ _ i n _ T r a n s i t _ _ B a s e _ _ < / P r o d _ _ O r d e r _ C o m p o n e n t _ _ Q t y _ _ i n _ T r a n s i t _ _ B a s e _ _ > + 
+                     < P r o d _ _ O r d e r _ C o m p o n e n t _ _ Q t y _ _ i n _ T r a n s i t _ _ B a s e _ _ C a p t i o n   E l e m e n t T y p e = " C o l u m n "   E l e m e n t I d = " 1 3 5 0 0 4 1 6 9 0 "   D a t a T y p e = " S t r i n g " > P r o d _ _ O r d e r _ C o m p o n e n t _ _ Q t y _ _ i n _ T r a n s i t _ _ B a s e _ _ C a p t i o n < / P r o d _ _ O r d e r _ C o m p o n e n t _ _ Q t y _ _ i n _ T r a n s i t _ _ B a s e _ _ C a p t i o n > + 
+                     < P r o d _ _ O r d e r _ C o m p o n e n t _ _ Q t y _ _ t r a n s f _ _ t o _ S u b c o n t r a c t o r _   E l e m e n t T y p e = " C o l u m n "   E l e m e n t I d = " 7 7 0 6 9 1 9 7 8 "   D a t a T y p e = " D e c i m a l " > P r o d _ _ O r d e r _ C o m p o n e n t _ _ Q t y _ _ t r a n s f _ _ t o _ S u b c o n t r a c t o r _ < / P r o d _ _ O r d e r _ C o m p o n e n t _ _ Q t y _ _ t r a n s f _ _ t o _ S u b c o n t r a c t o r _ > + 
+                     < P r o d _ _ O r d e r _ C o m p o n e n t _ _ Q t y _ _ t r a n s f _ _ t o _ S u b c o n t r a c t o r _ C a p t i o n   E l e m e n t T y p e = " C o l u m n "   E l e m e n t I d = " 1 8 2 1 5 6 8 9 8 0 "   D a t a T y p e = " S t r i n g " > P r o d _ _ O r d e r _ C o m p o n e n t _ _ Q t y _ _ t r a n s f _ _ t o _ S u b c o n t r a c t o r _ C a p t i o n < / P r o d _ _ O r d e r _ C o m p o n e n t _ _ Q t y _ _ t r a n s f _ _ t o _ S u b c o n t r a c t o r _ C a p t i o n > + 
+                 < / P r o d _ O r d e r _ C o m p o n e n t > + 
+             < / P r o d _ O r d e r _ R o u t i n g _ L i n e > + 
+         < / P u r c h a s e _ L i n e > + 
+         < T o t a l s   E l e m e n t T y p e = " D a t a I t e m "   E l e m e n t I d = " 1 8 2 3 9 5 0 0 4 4 " > + 
+             < S u b c T o t a l A m o u n t I n c l u d i n g V A T   E l e m e n t T y p e = " C o l u m n "   E l e m e n t I d = " 1 4 1 3 5 2 0 2 3 4 "   D a t a T y p e = " T e x t " > S u b c T o t a l A m o u n t I n c l u d i n g V A T < / S u b c T o t a l A m o u n t I n c l u d i n g V A T > + 
+             < S u b c T o t a l I n v o i c e D i s c o u n t A m o u n t   E l e m e n t T y p e = " C o l u m n "   E l e m e n t I d = " 1 6 8 5 2 6 4 1 4 4 "   D a t a T y p e = " S t r i n g " > S u b c T o t a l I n v o i c e D i s c o u n t A m o u n t < / S u b c T o t a l I n v o i c e D i s c o u n t A m o u n t > + 
+             < S u b c T o t a l N e t A m o u n t   E l e m e n t T y p e = " C o l u m n "   E l e m e n t I d = " 2 0 6 9 4 6 4 2 5 3 "   D a t a T y p e = " S t r i n g " > S u b c T o t a l N e t A m o u n t < / S u b c T o t a l N e t A m o u n t > + 
+             < S u b c T o t a l S u b T o t a l   E l e m e n t T y p e = " C o l u m n "   E l e m e n t I d = " 1 1 1 9 0 1 5 6 1 4 "   D a t a T y p e = " S t r i n g " > S u b c T o t a l S u b T o t a l < / S u b c T o t a l S u b T o t a l > + 
+             < S u b c T o t a l V A T A m o u n t   E l e m e n t T y p e = " C o l u m n "   E l e m e n t I d = " 1 5 4 7 1 2 3 5 2 1 "   D a t a T y p e = " S t r i n g " > S u b c T o t a l V A T A m o u n t < / S u b c T o t a l V A T A m o u n t > + 
+             < S u b c T o t a l V A T B a s e L C Y   E l e m e n t T y p e = " C o l u m n "   E l e m e n t I d = " 1 6 1 4 0 0 8 7 6 0 "   D a t a T y p e = " S t r i n g " > S u b c T o t a l V A T B a s e L C Y < / S u b c T o t a l V A T B a s e L C Y > + 
+             < T o t a l A m o u n t   E l e m e n t T y p e = " C o l u m n "   E l e m e n t I d = " 1 5 5 9 1 6 4 8 7 7 "   D a t a T y p e = " D e c i m a l " > T o t a l A m o u n t < / T o t a l A m o u n t > + 
+             < T o t a l A m o u n t I n c l V A T   E l e m e n t T y p e = " C o l u m n "   E l e m e n t I d = " 1 4 2 2 4 2 7 9 5 2 "   D a t a T y p e = " D e c i m a l " > T o t a l A m o u n t I n c l V A T < / T o t a l A m o u n t I n c l V A T > + 
+             < T o t a l E x c l V A T T e x t   E l e m e n t T y p e = " C o l u m n "   E l e m e n t I d = " 1 3 8 4 8 1 6 4 5 "   D a t a T y p e = " T e x t " > T o t a l E x c l V A T T e x t < / T o t a l E x c l V A T T e x t > + 
+             < T o t a l I n c l V A T T e x t   E l e m e n t T y p e = " C o l u m n "   E l e m e n t I d = " 7 6 1 2 0 3 1 7 7 "   D a t a T y p e = " T e x t " > T o t a l I n c l V A T T e x t < / T o t a l I n c l V A T T e x t > + 
+             < T o t a l I n v o i c e D i s c o u n t A m o u n t   E l e m e n t T y p e = " C o l u m n "   E l e m e n t I d = " 4 0 2 1 7 7 5 1 "   D a t a T y p e = " D e c i m a l " > T o t a l I n v o i c e D i s c o u n t A m o u n t < / T o t a l I n v o i c e D i s c o u n t A m o u n t > + 
+             < T o t a l S u b T o t a l   E l e m e n t T y p e = " C o l u m n "   E l e m e n t I d = " 2 0 9 7 8 7 6 8 0 1 "   D a t a T y p e = " D e c i m a l " > T o t a l S u b T o t a l < / T o t a l S u b T o t a l > + 
+             < T o t a l T e x t   E l e m e n t T y p e = " C o l u m n "   E l e m e n t I d = " 2 3 1 9 1 0 5 1 8 "   D a t a T y p e = " T e x t " > T o t a l T e x t < / T o t a l T e x t > + 
+             < T o t a l V A T A m o u n t   E l e m e n t T y p e = " C o l u m n "   E l e m e n t I d = " 1 6 2 7 1 0 2 3 2 8 "   D a t a T y p e = " D e c i m a l " > T o t a l V A T A m o u n t < / T o t a l V A T A m o u n t > + 
+             < T o t a l V A T B a s e A m o u n t   E l e m e n t T y p e = " C o l u m n "   E l e m e n t I d = " 6 6 3 4 5 3 7 0 9 "   D a t a T y p e = " D e c i m a l " > T o t a l V A T B a s e A m o u n t < / T o t a l V A T B a s e A m o u n t > + 
+             < T o t a l V A T D i s c o u n t A m o u n t   E l e m e n t T y p e = " C o l u m n "   E l e m e n t I d = " 6 8 1 2 9 8 4 1 3 "   D a t a T y p e = " D e c i m a l " > T o t a l V A T D i s c o u n t A m o u n t < / T o t a l V A T D i s c o u n t A m o u n t > + 
+             < V A T A m o u n t T e x t   E l e m e n t T y p e = " C o l u m n "   E l e m e n t I d = " 6 5 0 3 5 8 2 4 7 "   D a t a T y p e = " T e x t " > V A T A m o u n t T e x t < / V A T A m o u n t T e x t > + 
+         < / T o t a l s > + 
+         < V A T C o u n t e r   E l e m e n t T y p e = " D a t a I t e m "   E l e m e n t I d = " 5 5 7 1 2 6 5 0 6 " > + 
+             < V A T A m t L i n e I n v D i s c A m t   E l e m e n t T y p e = " C o l u m n "   E l e m e n t I d = " 1 0 0 7 8 2 8 6 0 "   D a t a T y p e = " D e c i m a l " > V A T A m t L i n e I n v D i s c A m t < / V A T A m t L i n e I n v D i s c A m t > + 
+             < V A T A m t L i n e I n v D i s c B a s e A m t   E l e m e n t T y p e = " C o l u m n "   E l e m e n t I d = " 1 6 9 1 0 0 3 4 1 5 "   D a t a T y p e = " D e c i m a l " > V A T A m t L i n e I n v D i s c B a s e A m t < / V A T A m t L i n e I n v D i s c B a s e A m t > + 
+             < V A T A m t L i n e L i n e A m t   E l e m e n t T y p e = " C o l u m n "   E l e m e n t I d = " 1 8 8 2 1 0 3 2 6 2 "   D a t a T y p e = " D e c i m a l " > V A T A m t L i n e L i n e A m t < / V A T A m t L i n e L i n e A m t > + 
+             < V A T A m t L i n e V A T   E l e m e n t T y p e = " C o l u m n "   E l e m e n t I d = " 2 9 9 0 4 8 9 2 5 "   D a t a T y p e = " D e c i m a l " > V A T A m t L i n e V A T < / V A T A m t L i n e V A T > + 
+             < V A T A m t L i n e V A T A m t   E l e m e n t T y p e = " C o l u m n "   E l e m e n t I d = " 8 4 9 9 7 4 3 4 1 "   D a t a T y p e = " D e c i m a l " > V A T A m t L i n e V A T A m t < / V A T A m t L i n e V A T A m t > + 
+             < V A T A m t L i n e V A T B a s e   E l e m e n t T y p e = " C o l u m n "   E l e m e n t I d = " 1 4 1 9 8 1 6 2 1 8 "   D a t a T y p e = " D e c i m a l " > V A T A m t L i n e V A T B a s e < / V A T A m t L i n e V A T B a s e > + 
+             < V A T A m t L i n e V A T I d e n t i f i e r   E l e m e n t T y p e = " C o l u m n "   E l e m e n t I d = " 4 6 1 3 9 9 7 9 2 "   D a t a T y p e = " C o d e " > V A T A m t L i n e V A T I d e n t i f i e r < / V A T A m t L i n e V A T I d e n t i f i e r > + 
+         < / V A T C o u n t e r > + 
+         < V A T C o u n t e r L C Y   E l e m e n t T y p e = " D a t a I t e m "   E l e m e n t I d = " 9 1 0 2 7 8 4 9 2 " > + 
+             < V A L E x c h R a t e   E l e m e n t T y p e = " C o l u m n "   E l e m e n t I d = " 1 8 3 2 0 7 3 1 5 4 "   D a t a T y p e = " T e x t " > V A L E x c h R a t e < / V A L E x c h R a t e > + 
+             < V A L S p e c L C Y H e a d e r   E l e m e n t T y p e = " C o l u m n "   E l e m e n t I d = " 6 9 9 3 5 8 7 5 8 "   D a t a T y p e = " T e x t " > V A L S p e c L C Y H e a d e r < / V A L S p e c L C Y H e a d e r > + 
+             < V A L V A T A m o u n t L C Y   E l e m e n t T y p e = " C o l u m n "   E l e m e n t I d = " 1 4 4 5 9 7 3 0 8 7 "   D a t a T y p e = " D e c i m a l " > V A L V A T A m o u n t L C Y < / V A L V A T A m o u n t L C Y > + 
+             < V A L V A T B a s e L C Y   E l e m e n t T y p e = " C o l u m n "   E l e m e n t I d = " 1 4 3 9 0 5 7 6 6 6 "   D a t a T y p e = " D e c i m a l " > V A L V A T B a s e L C Y < / V A L V A T B a s e L C Y > + 
+         < / V A T C o u n t e r L C Y > + 
+         < P r e p m t L o o p   E l e m e n t T y p e = " D a t a I t e m "   E l e m e n t I d = " 1 1 5 9 7 3 9 4 0 7 " > + 
+             < P r e p a y m e n t S p e c C a p t i o n   E l e m e n t T y p e = " C o l u m n "   E l e m e n t I d = " 1 6 2 3 2 2 2 3 0 1 "   D a t a T y p e = " L a b e l " > P r e p a y m e n t S p e c C a p t i o n < / P r e p a y m e n t S p e c C a p t i o n > + 
+             < P r e p m t I n v B u D e s c C a p t i o n   E l e m e n t T y p e = " C o l u m n "   E l e m e n t I d = " 1 8 0 7 4 4 6 7 8 "   D a t a T y p e = " L a b e l " > P r e p m t I n v B u D e s c C a p t i o n < / P r e p m t I n v B u D e s c C a p t i o n > + 
+             < P r e p m t I n v B u f A m t   E l e m e n t T y p e = " C o l u m n "   E l e m e n t I d = " 1 0 9 6 9 7 6 1 9 5 "   D a t a T y p e = " D e c i m a l " > P r e p m t I n v B u f A m t < / P r e p m t I n v B u f A m t > + 
+             < P r e p m t I n v B u f D e s c   E l e m e n t T y p e = " C o l u m n "   E l e m e n t I d = " 2 2 5 6 0 3 3 1 8 "   D a t a T y p e = " T e x t " > P r e p m t I n v B u f D e s c < / P r e p m t I n v B u f D e s c > + 
+             < P r e p m t I n v B u f G L A c c N o   E l e m e n t T y p e = " C o l u m n "   E l e m e n t I d = " 8 7 1 9 7 7 4 0 0 "   D a t a T y p e = " C o d e " > P r e p m t I n v B u f G L A c c N o < / P r e p m t I n v B u f G L A c c N o > + 
+             < P r e p m t I n v B u f G L A c c N o C a p t i o n   E l e m e n t T y p e = " C o l u m n "   E l e m e n t I d = " 6 6 7 6 9 7 1 8 "   D a t a T y p e = " L a b e l " > P r e p m t I n v B u f G L A c c N o C a p t i o n < / P r e p m t I n v B u f G L A c c N o C a p t i o n > + 
+             < P r e p m t L i n e A m o u n t   E l e m e n t T y p e = " C o l u m n "   E l e m e n t I d = " 1 3 0 2 3 0 2 1 5 "   D a t a T y p e = " D e c i m a l " > P r e p m t L i n e A m o u n t < / P r e p m t L i n e A m o u n t > + 
+             < P r e p m t T o t a l A m o u n t I n c l V A T   E l e m e n t T y p e = " C o l u m n "   E l e m e n t I d = " 3 2 0 0 3 6 5 9 4 "   D a t a T y p e = " D e c i m a l " > P r e p m t T o t a l A m o u n t I n c l V A T < / P r e p m t T o t a l A m o u n t I n c l V A T > + 
+             < P r e p m t V A T A m o u n t   E l e m e n t T y p e = " C o l u m n "   E l e m e n t I d = " 2 1 0 3 3 9 3 6 6 0 "   D a t a T y p e = " D e c i m a l " > P r e p m t V A T A m o u n t < / P r e p m t V A T A m o u n t > + 
+             < P r e p m t V A T A m o u n t T e x t   E l e m e n t T y p e = " C o l u m n "   E l e m e n t I d = " 1 0 3 1 2 5 7 4 9 5 "   D a t a T y p e = " T e x t " > P r e p m t V A T A m o u n t T e x t < / P r e p m t V A T A m o u n t T e x t > + 
+             < P r e p m t V A T B a s e A m o u n t   E l e m e n t T y p e = " C o l u m n "   E l e m e n t I d = " 1 3 9 2 9 6 6 7 9 "   D a t a T y p e = " D e c i m a l " > P r e p m t V A T B a s e A m o u n t < / P r e p m t V A T B a s e A m o u n t > + 
+             < T o t a l E x c l V A T T e x t 2   E l e m e n t T y p e = " C o l u m n "   E l e m e n t I d = " 1 6 4 4 3 1 2 4 5 7 "   D a t a T y p e = " T e x t " > T o t a l E x c l V A T T e x t 2 < / T o t a l E x c l V A T T e x t 2 > + 
+             < T o t a l I n c l V A T T e x t 2   E l e m e n t T y p e = " C o l u m n "   E l e m e n t I d = " 2 0 8 6 8 8 9 6 8 3 "   D a t a T y p e = " T e x t " > T o t a l I n c l V A T T e x t 2 < / T o t a l I n c l V A T T e x t 2 > + 
+         < / P r e p m t L o o p > + 
+         < P r e p m t V A T C o u n t e r   E l e m e n t T y p e = " D a t a I t e m "   E l e m e n t I d = " 1 6 7 7 6 2 3 1 0 8 " > + 
+             < P r e p m t V A T A m t L i n e L i n e A m t   E l e m e n t T y p e = " C o l u m n "   E l e m e n t I d = " 4 0 2 6 8 5 8 2 4 "   D a t a T y p e = " D e c i m a l " > P r e p m t V A T A m t L i n e L i n e A m t < / P r e p m t V A T A m t L i n e L i n e A m t > + 
+             < P r e p m t V A T A m t L i n e V A T   E l e m e n t T y p e = " C o l u m n "   E l e m e n t I d = " 1 9 1 5 4 9 4 8 5 "   D a t a T y p e = " D e c i m a l " > P r e p m t V A T A m t L i n e V A T < / P r e p m t V A T A m t L i n e V A T > + 
+             < P r e p m t V A T A m t L i n e V A T A m t   E l e m e n t T y p e = " C o l u m n "   E l e m e n t I d = " 1 8 7 1 3 0 1 8 2 9 "   D a t a T y p e = " D e c i m a l " > P r e p m t V A T A m t L i n e V A T A m t < / P r e p m t V A T A m t L i n e V A T A m t > + 
+             < P r e p m t V A T A m t L i n e V A T B a s e   E l e m e n t T y p e = " C o l u m n "   E l e m e n t I d = " 1 2 2 6 9 0 4 6 9 6 "   D a t a T y p e = " D e c i m a l " > P r e p m t V A T A m t L i n e V A T B a s e < / P r e p m t V A T A m t L i n e V A T B a s e > + 
+             < P r e p m t V A T A m t L i n e V A T I d   E l e m e n t T y p e = " C o l u m n "   E l e m e n t I d = " 9 8 2 2 2 4 8 0 0 "   D a t a T y p e = " C o d e " > P r e p m t V A T A m t L i n e V A T I d < / P r e p m t V A T A m t L i n e V A T I d > + 
+             < P r e p y m t V A T A m t S p e c C a p t i o n   E l e m e n t T y p e = " C o l u m n "   E l e m e n t I d = " 2 0 0 9 6 4 9 1 3 8 "   D a t a T y p e = " L a b e l " > P r e p y m t V A T A m t S p e c C a p t i o n < / P r e p y m t V A T A m t S p e c C a p t i o n > + 
+         < / P r e p m t V A T C o u n t e r > + 
+         < L e t t e r T e x t   E l e m e n t T y p e = " D a t a I t e m "   E l e m e n t I d = " 1 5 1 0 3 5 3 8 3 4 " > + 
+             < B o d y T e x t   E l e m e n t T y p e = " C o l u m n "   E l e m e n t I d = " 1 4 9 7 5 9 8 0 8 "   D a t a T y p e = " L a b e l " > B o d y T e x t < / B o d y T e x t > + 
+             < C l o s i n g T e x t   E l e m e n t T y p e = " C o l u m n "   E l e m e n t I d = " 5 1 2 1 3 5 9 0 9 "   D a t a T y p e = " L a b e l " > C l o s i n g T e x t < / C l o s i n g T e x t > + 
+             < G r e e t i n g T e x t   E l e m e n t T y p e = " C o l u m n "   E l e m e n t I d = " 1 1 7 5 2 7 9 2 8 9 "   D a t a T y p e = " L a b e l " > G r e e t i n g T e x t < / G r e e t i n g T e x t > + 
+         < / L e t t e r T e x t > + 
+         < S u b c V A T A m o u n t L i n e   E l e m e n t T y p e = " D a t a I t e m "   E l e m e n t I d = " 3 5 6 2 4 0 9 1 5 " > + 
+             < S u b c I n v o i c e D i s c o u n t A m o u n t _ V A T A m o u n t L i n e   E l e m e n t T y p e = " C o l u m n "   E l e m e n t I d = " 8 7 9 9 1 1 6 2 8 "   D a t a T y p e = " D e c i m a l " > S u b c I n v o i c e D i s c o u n t A m o u n t _ V A T A m o u n t L i n e < / S u b c I n v o i c e D i s c o u n t A m o u n t _ V A T A m o u n t L i n e > + 
+             < S u b c I n v o i c e D i s c o u n t A m o u n t _ V A T A m o u n t L i n e _ L b l   E l e m e n t T y p e = " C o l u m n "   E l e m e n t I d = " 5 7 5 1 3 2 8 1 7 "   D a t a T y p e = " S t r i n g " > S u b c I n v o i c e D i s c o u n t A m o u n t _ V A T A m o u n t L i n e _ L b l < / S u b c I n v o i c e D i s c o u n t A m o u n t _ V A T A m o u n t L i n e _ L b l > + 
+             < S u b c I n v o i c e D i s c o u n t B a s e A m o u n t _ V A T A m o u n t L i n e   E l e m e n t T y p e = " C o l u m n "   E l e m e n t I d = " 1 2 5 3 7 7 7 4 6 5 "   D a t a T y p e = " D e c i m a l " > S u b c I n v o i c e D i s c o u n t B a s e A m o u n t _ V A T A m o u n t L i n e < / S u b c I n v o i c e D i s c o u n t B a s e A m o u n t _ V A T A m o u n t L i n e > + 
+             < S u b c I n v o i c e D i s c o u n t B a s e A m o u n t _ V A T A m o u n t L i n e _ L b l   E l e m e n t T y p e = " C o l u m n "   E l e m e n t I d = " 1 3 7 1 0 3 2 1 9 6 "   D a t a T y p e = " S t r i n g " > S u b c I n v o i c e D i s c o u n t B a s e A m o u n t _ V A T A m o u n t L i n e _ L b l < / S u b c I n v o i c e D i s c o u n t B a s e A m o u n t _ V A T A m o u n t L i n e _ L b l > + 
+             < S u b c L i n e A m o u n t _ V a t A m o u n t L i n e   E l e m e n t T y p e = " C o l u m n "   E l e m e n t I d = " 8 9 2 6 1 3 9 2 2 "   D a t a T y p e = " D e c i m a l " > S u b c L i n e A m o u n t _ V a t A m o u n t L i n e < / S u b c L i n e A m o u n t _ V a t A m o u n t L i n e > + 
+             < S u b c L i n e A m o u n t _ V a t A m o u n t L i n e _ L b l   E l e m e n t T y p e = " C o l u m n "   E l e m e n t I d = " 1 3 8 3 2 3 5 0 7 5 "   D a t a T y p e = " S t r i n g " > S u b c L i n e A m o u n t _ V a t A m o u n t L i n e _ L b l < / S u b c L i n e A m o u n t _ V a t A m o u n t L i n e _ L b l > + 
+             < S u b c N o O f V A T I d e n t i f i e r s   E l e m e n t T y p e = " C o l u m n "   E l e m e n t I d = " 2 5 2 1 5 8 7 1 3 "   D a t a T y p e = " I n t e g e r " > S u b c N o O f V A T I d e n t i f i e r s < / S u b c N o O f V A T I d e n t i f i e r s > + 
+             < S u b c O f L b l   E l e m e n t T y p e = " C o l u m n "   E l e m e n t I d = " 1 0 2 1 9 9 1 9 5 3 "   D a t a T y p e = " L a b e l " > S u b c O f L b l < / S u b c O f L b l > + 
+             < S u b c T o t a l E x c l V A T T e x t   E l e m e n t T y p e = " C o l u m n "   E l e m e n t I d = " 5 0 7 9 2 5 7 7 2 "   D a t a T y p e = " T e x t " > S u b c T o t a l E x c l V A T T e x t < / S u b c T o t a l E x c l V A T T e x t > + 
+             < S u b c T o t a l I n c l V A T T e x t   E l e m e n t T y p e = " C o l u m n "   E l e m e n t I d = " 3 4 1 9 5 1 1 7 0 "   D a t a T y p e = " T e x t " > S u b c T o t a l I n c l V A T T e x t < / S u b c T o t a l I n c l V A T T e x t > + 
+             < S u b c V A T A m o u n t _ V a t A m o u n t L i n e   E l e m e n t T y p e = " C o l u m n "   E l e m e n t I d = " 1 1 9 8 7 6 5 5 8 1 "   D a t a T y p e = " D e c i m a l " > S u b c V A T A m o u n t _ V a t A m o u n t L i n e < / S u b c V A T A m o u n t _ V a t A m o u n t L i n e > + 
+             < S u b c V A T A m o u n t _ V a t A m o u n t L i n e _ L b l   E l e m e n t T y p e = " C o l u m n "   E l e m e n t I d = " 1 5 5 9 2 8 9 0 1 0 "   D a t a T y p e = " S t r i n g " > S u b c V A T A m o u n t _ V a t A m o u n t L i n e _ L b l < / S u b c V A T A m o u n t _ V a t A m o u n t L i n e _ L b l > + 
+             < S u b c V A T B a s e _ V a t A m o u n t L i n e   E l e m e n t T y p e = " C o l u m n "   E l e m e n t I d = " 1 6 3 9 4 2 6 9 4 "   D a t a T y p e = " D e c i m a l " > S u b c V A T B a s e _ V a t A m o u n t L i n e < / S u b c V A T B a s e _ V a t A m o u n t L i n e > + 
+             < S u b c V A T B a s e _ V a t A m o u n t L i n e _ L b l   E l e m e n t T y p e = " C o l u m n "   E l e m e n t I d = " 1 9 2 7 9 5 2 1 8 5 "   D a t a T y p e = " S t r i n g " > S u b c V A T B a s e _ V a t A m o u n t L i n e _ L b l < / S u b c V A T B a s e _ V a t A m o u n t L i n e _ L b l > + 
+             < S u b c V A T C l a u s e 2 D e s c r i p t i o n   E l e m e n t T y p e = " C o l u m n "   E l e m e n t I d = " 1 0 7 3 5 6 6 6 1 6 "   D a t a T y p e = " T e x t " > S u b c V A T C l a u s e 2 D e s c r i p t i o n < / S u b c V A T C l a u s e 2 D e s c r i p t i o n > + 
+             < S u b c V A T C l a u s e 2 D e s c r i p t i o n 2   E l e m e n t T y p e = " C o l u m n "   E l e m e n t I d = " 1 1 4 1 9 2 6 6 7 8 "   D a t a T y p e = " T e x t " > S u b c V A T C l a u s e 2 D e s c r i p t i o n 2 < / S u b c V A T C l a u s e 2 D e s c r i p t i o n 2 > + 
+             < S u b c V A T I d e n t i f i e r _ V a t A m o u n t L i n e   E l e m e n t T y p e = " C o l u m n "   E l e m e n t I d = " 1 3 2 9 3 9 5 5 3 2 "   D a t a T y p e = " C o d e " > S u b c V A T I d e n t i f i e r _ V a t A m o u n t L i n e < / S u b c V A T I d e n t i f i e r _ V a t A m o u n t L i n e > + 
+             < S u b c V A T I d e n t i f i e r _ V a t A m o u n t L i n e _ L b l   E l e m e n t T y p e = " C o l u m n "   E l e m e n t I d = " 2 0 1 3 2 3 4 9 2 7 "   D a t a T y p e = " S t r i n g " > S u b c V A T I d e n t i f i e r _ V a t A m o u n t L i n e _ L b l < / S u b c V A T I d e n t i f i e r _ V a t A m o u n t L i n e _ L b l > + 
+             < S u b c V A T P c t _ V a t A m o u n t L i n e   E l e m e n t T y p e = " C o l u m n "   E l e m e n t I d = " 1 8 7 3 8 8 6 8 3 2 "   D a t a T y p e = " D e c i m a l " > S u b c V A T P c t _ V a t A m o u n t L i n e < / S u b c V A T P c t _ V a t A m o u n t L i n e > + 
+             < S u b c V A T P c t _ V a t A m o u n t L i n e _ L b l   E l e m e n t T y p e = " C o l u m n "   E l e m e n t I d = " 1 0 3 2 1 0 7 9 8 7 "   D a t a T y p e = " S t r i n g " > S u b c V A T P c t _ V a t A m o u n t L i n e _ L b l < / S u b c V A T P c t _ V a t A m o u n t L i n e _ L b l > + 
+             < S u b c V A T P e r c e n t C a p t i o n L b l   E l e m e n t T y p e = " C o l u m n "   E l e m e n t I d = " 2 1 2 9 7 1 7 9 9 4 "   D a t a T y p e = " L a b e l " > S u b c V A T P e r c e n t C a p t i o n L b l < / S u b c V A T P e r c e n t C a p t i o n L b l > + 
+         < / S u b c V A T A m o u n t L i n e > + 
+     < / P u r c h a s e _ H e a d e r > + 
+     < S u b c S h i p T o A d d r   E l e m e n t T y p e = " D a t a I t e m "   E l e m e n t I d = " 1 2 6 7 3 3 6 4 3 2 " > + 
+         < T e m p S U B S h i p T o A d d r _ _ A d d r e s s   E l e m e n t T y p e = " C o l u m n "   E l e m e n t I d = " 7 1 1 0 9 2 3 4 3 "   D a t a T y p e = " T e x t " > T e m p S U B S h i p T o A d d r _ _ A d d r e s s < / T e m p S U B S h i p T o A d d r _ _ A d d r e s s > + 
+     < / S u b c S h i p T o A d d r > + 
+ < / N a v W o r d R e p o r t X m l P a r t > 
+</file>
+
 <file path=customXml/itemProps2.xml><?xml version="1.0" encoding="utf-8"?>
 <ds:datastoreItem xmlns:ds="http://schemas.openxmlformats.org/officeDocument/2006/customXml" ds:itemID="{5446FA42-B0AC-4759-9451-580EE46BDE68}">
   <ds:schemaRefs>

</xml_diff>

<commit_message>
Sync from NAV fecfefce38 (#165)
* Sync from NAV fecfefce38

* Set AppSourceCop baseline to NAV ReferenceV2Extensions 28.2.50950 and automate baseline/platform version sync

* Temporarily disable breaking changes check (baseline unavailable in BC artifacts)

* Disable DetailedCalculation SCM tests failing on CLEAN29 report substitution (99001500)

* Disable flaky tests failing in PR #165 CI

Disable GLTransferWithClosingDate (134812), PullServiceLineNoShipmentUsingUseFilter (136140), and ItemCategoryCodeAfterPostingAssemblyOrder (137096), which failed in run 27885395426 due to test-isolation/flakiness.

* Revert "Disable flaky tests failing in PR #165 CI"

This reverts commit 5ba9e6b5561e736e73abce894d70d1b78509a2b2.
</commit_message>
<xml_diff>
--- a/src/Apps/W1/Subcontracting/App/src/Process/Reports/SubcDispatchingList.docx
+++ b/src/Apps/W1/Subcontracting/App/src/Process/Reports/SubcDispatchingList.docx
@@ -17712,6 +17712,1485 @@
  < / N a v W o r d R e p o r t X m l P a r t > 
 </file>
 
+<file path=customXml/item4.xml>��< ? x m l   v e r s i o n = " 1 . 0 "   e n c o d i n g = " u t f - 1 6 " ? > + 
+ < N a v W o r d R e p o r t X m l P a r t   x m l n s = " u r n : m i c r o s o f t - d y n a m i c s - b u s i n e s s c e n t r a l / i n t e r n a l / e x t e n d e d / r e p o r t s / S u b c _ D i s p a t c h i n g _ L i s t / 9 9 0 0 1 5 0 4 / " > + 
+     < B C R e p o r t I n f o r m a t i o n > + 
+         < R e p o r t M e t a d a t a > + 
+             < E x t e n s i o n I d > E x t e n s i o n   I D < / E x t e n s i o n I d > + 
+             < E x t e n s i o n N a m e > E x t e n s i o n   N a m e < / E x t e n s i o n N a m e > + 
+             < E x t e n s i o n P u b l i s h e r > E x t e n s i o n   P u b l i s h e r < / E x t e n s i o n P u b l i s h e r > + 
+             < E x t e n s i o n V e r s i o n > E x t e n s i o n   V e r s i o n < / E x t e n s i o n V e r s i o n > + 
+             < R e p o r t I d > R e p o r t   I D < / R e p o r t I d > + 
+             < R e p o r t N a m e > R e p o r t   N a m e < / R e p o r t N a m e > + 
+             < A b o u t T h i s R e p o r t T i t l e > A b o u t   T h i s   R e p o r t   T i t l e < / A b o u t T h i s R e p o r t T i t l e > + 
+             < A b o u t T h i s R e p o r t T e x t > A b o u t   T h i s   R e p o r t   T e x t < / A b o u t T h i s R e p o r t T e x t > + 
+             < R e p o r t H e l p L i n k > R e p o r t   H e l p   L i n k < / R e p o r t H e l p L i n k > + 
+         < / R e p o r t M e t a d a t a > + 
+         < R e p o r t R e q u e s t > + 
+             < T e n a n t E n t r a I d > T e n a n t   E n t r a   I d < / T e n a n t E n t r a I d > + 
+             < E n v i r o n m e n t N a m e > E n v i r o n m e n t   N a m e < / E n v i r o n m e n t N a m e > + 
+             < E n v i r o n m e n t T y p e > E n v i r o n m e n t   T y p e < / E n v i r o n m e n t T y p e > + 
+             < C o m p a n y N a m e > C o m p a n y   N a m e < / C o m p a n y N a m e > + 
+             < C o m p a n y D i s p l a y N a m e > C o m p a n y   D i s p l a y   N a m e < / C o m p a n y D i s p l a y N a m e > + 
+             < C o m p a n y I d > C o m p a n y   I D < / C o m p a n y I d > + 
+             < U s e r N a m e > U s e r   N a m e < / U s e r N a m e > + 
+             < D a t e A n d T i m e > D a t e   a n d   T i m e < / D a t e A n d T i m e > + 
+             < L a n g u a g e > L a n g u a g e < / L a n g u a g e > + 
+             < F o r m a t R e g i o n > F o r m a t   R e g i o n < / F o r m a t R e g i o n > + 
+             < D a t e T i m e V a l u e s > + 
+                 < Y e a r > Y e a r < / Y e a r > + 
+                 < M o n t h N u m b e r > M o n t h   N u m b e r < / M o n t h N u m b e r > + 
+                 < D a y N u m b e r > D a y   N u m b e r < / D a y N u m b e r > + 
+                 < H o u r > H o u r < / H o u r > + 
+                 < M i n u t e > M i n u t e < / M i n u t e > + 
+             < / D a t e T i m e V a l u e s > + 
+         < / R e p o r t R e q u e s t > + 
+     < / B C R e p o r t I n f o r m a t i o n > + 
+     < T o o l t i p s > + 
+         < T o o l t i p   c o l u m n = " B u y F r m V e n d N o _ P u r c h H e a d e r "   E l e m e n t I d = " 1 1 4 1 1 5 6 0 2 " > + 
+             < T o o l t i p T e x t   l a n g = " e n - U S " > S p e c i f i e s   t h e   v e n d o r   w h o   w i l l   d e l i v e r   t h e   g o o d s   o r   s e r v i c e s .   E a c h   v e n d o r   h a s   a   u n i q u e   n u m b e r   t o   h e l p   y o u   t r a c k   r e l a t e d   d o c u m e n t s .   T h e   n u m b e r   c a n   c o m e   f r o m   a   n u m b e r   s e r i e s   o r   b e   a d d e d   m a n u a l l y . < / T o o l t i p T e x t > + 
+         < / T o o l t i p > + 
+         < T o o l t i p   c o l u m n = " B u y F r o m C o n t a c t E m a i l "   E l e m e n t I d = " 1 4 6 0 8 4 1 4 4 9 " > + 
+             < T o o l t i p T e x t   l a n g = " e n - U S " > S p e c i f i e s   t h e   e m a i l   a d d r e s s   o f   t h e   c o n t a c t . < / T o o l t i p T e x t > + 
+         < / T o o l t i p > + 
+         < T o o l t i p   c o l u m n = " B u y F r o m C o n t a c t M o b i l e P h o n e N o "   E l e m e n t I d = " 6 8 2 3 8 6 3 9 2 " > + 
+             < T o o l t i p T e x t   l a n g = " e n - U S " > S p e c i f i e s   t h e   c o n t a c t ' s   m o b i l e   t e l e p h o n e   n u m b e r . < / T o o l t i p T e x t > + 
+         < / T o o l t i p > + 
+         < T o o l t i p   c o l u m n = " B u y F r o m C o n t a c t P h o n e N o "   E l e m e n t I d = " 1 6 2 4 1 1 6 4 9 6 " > + 
+             < T o o l t i p T e x t   l a n g = " e n - U S " > S p e c i f i e s   t h e   c o n t a c t ' s   p h o n e   n u m b e r . < / T o o l t i p T e x t > + 
+         < / T o o l t i p > + 
+         < T o o l t i p   c o l u m n = " C o m p a n y B a n k A c c o u n t N o "   E l e m e n t I d = " 3 0 1 4 0 2 0 4 " > + 
+             < T o o l t i p T e x t   l a n g = " e n - U S " > S p e c i f i e s   t h e   c o m p a n y ' s   b a n k   a c c o u n t   n u m b e r . < / T o o l t i p T e x t > + 
+         < / T o o l t i p > + 
+         < T o o l t i p   c o l u m n = " C o m p a n y B a n k B r a n c h N o "   E l e m e n t I d = " 7 9 3 1 3 3 0 5 7 " > + 
+             < T o o l t i p T e x t   l a n g = " e n - U S " > S p e c i f i e s   t h e   b a n k ' s   b r a n c h   n u m b e r . < / T o o l t i p T e x t > + 
+         < / T o o l t i p > + 
+         < T o o l t i p   c o l u m n = " C o m p a n y B a n k N a m e "   E l e m e n t I d = " 1 5 3 4 9 0 5 6 0 5 " > + 
+             < T o o l t i p T e x t   l a n g = " e n - U S " > S p e c i f i e s   t h e   n a m e   o f   t h e   b a n k   t h e   c o m p a n y   u s e s . < / T o o l t i p T e x t > + 
+         < / T o o l t i p > + 
+         < T o o l t i p   c o l u m n = " C o m p a n y E M a i l "   E l e m e n t I d = " 1 6 7 7 0 7 4 0 5 8 " > + 
+             < T o o l t i p T e x t   l a n g = " e n - U S " > S p e c i f i e s   t h e   c o m p a n y ' s   e m a i l   a d d r e s s . < / T o o l t i p T e x t > + 
+         < / T o o l t i p > + 
+         < T o o l t i p   c o l u m n = " C o m p a n y G i r o N o "   E l e m e n t I d = " 1 3 6 0 1 9 6 3 2 0 " > + 
+             < T o o l t i p T e x t   l a n g = " e n - U S " > S p e c i f i e s   t h e   c o m p a n y ' s   g i r o   n u m b e r . < / T o o l t i p T e x t > + 
+         < / T o o l t i p > + 
+         < T o o l t i p   c o l u m n = " C o m p a n y H o m e P a g e "   E l e m e n t I d = " 1 9 8 9 1 8 8 7 0 " > + 
+             < T o o l t i p T e x t   l a n g = " e n - U S " > S p e c i f i e s   y o u r   c o m p a n y ' s   w e b   s i t e . < / T o o l t i p T e x t > + 
+         < / T o o l t i p > + 
+         < T o o l t i p   c o l u m n = " C o m p a n y I B A N "   E l e m e n t I d = " 9 0 6 5 4 9 1 8 2 " > + 
+             < T o o l t i p T e x t   l a n g = " e n - U S " > S p e c i f i e s   t h e   i n t e r n a t i o n a l   b a n k   a c c o u n t   n u m b e r   o f   y o u r   p r i m a r y   b a n k   a c c o u n t . < / T o o l t i p T e x t > + 
+         < / T o o l t i p > + 
+         < T o o l t i p   c o l u m n = " C o m p a n y P h o n e N o "   E l e m e n t I d = " 2 5 0 4 4 0 6 5 5 " > + 
+             < T o o l t i p T e x t   l a n g = " e n - U S " > S p e c i f i e s   t h e   c o m p a n y ' s   t e l e p h o n e   n u m b e r . < / T o o l t i p T e x t > + 
+         < / T o o l t i p > + 
+         < T o o l t i p   c o l u m n = " C o m p a n y P i c t u r e "   E l e m e n t I d = " 1 3 9 7 4 1 1 0 7 4 " > + 
+             < T o o l t i p T e x t   l a n g = " e n - U S " > S p e c i f i e s   t h e   p i c t u r e   t h a t   h a s   b e e n   s e t   u p   f o r   t h e   c o m p a n y ,   s u c h   a s   a   c o m p a n y   l o g o . < / T o o l t i p T e x t > + 
+         < / T o o l t i p > + 
+         < T o o l t i p   c o l u m n = " C o m p a n y S W I F T "   E l e m e n t I d = " 6 6 8 2 5 0 2 4 5 " > + 
+             < T o o l t i p T e x t   l a n g = " e n - U S " > S p e c i f i e s   t h e   S W I F T   c o d e   ( i n t e r n a t i o n a l   b a n k   i d e n t i f i e r   c o d e )   o f   y o u r   p r i m a r y   b a n k . < / T o o l t i p T e x t > + 
+         < / T o o l t i p > + 
+         < T o o l t i p   c o l u m n = " S u b c B a r c o d e B a s e "   E l e m e n t I d = " 7 0 5 6 0 9 3 7 1 " > + 
+             < T o o l t i p T e x t   l a n g = " e n - U S " > S p e c i f i e s   t h e   p i c t u r e   t h a t   h a s   b e e n   s e t   u p   f o r   t h e   c o m p a n y ,   s u c h   a s   a   c o m p a n y   l o g o . < / T o o l t i p T e x t > + 
+         < / T o o l t i p > + 
+         < T o o l t i p   c o l u m n = " S u b c C o m p a n y I n f o 1 P i c t u r e "   E l e m e n t I d = " 1 0 5 2 1 8 7 7 9 8 " > + 
+             < T o o l t i p T e x t   l a n g = " e n - U S " > S p e c i f i e s   t h e   p i c t u r e   t h a t   h a s   b e e n   s e t   u p   f o r   t h e   c o m p a n y ,   s u c h   a s   a   c o m p a n y   l o g o . < / T o o l t i p T e x t > + 
+         < / T o o l t i p > + 
+         < T o o l t i p   c o l u m n = " S u b c C o m p a n y I n f o 2 P i c t u r e "   E l e m e n t I d = " 6 3 9 9 3 6 3 7 " > + 
+             < T o o l t i p T e x t   l a n g = " e n - U S " > S p e c i f i e s   t h e   p i c t u r e   t h a t   h a s   b e e n   s e t   u p   f o r   t h e   c o m p a n y ,   s u c h   a s   a   c o m p a n y   l o g o . < / T o o l t i p T e x t > + 
+         < / T o o l t i p > + 
+         < T o o l t i p   c o l u m n = " S u b c C o m p a n y I n f o P i c t u r e "   E l e m e n t I d = " 1 7 1 6 9 3 2 0 4 9 " > + 
+             < T o o l t i p T e x t   l a n g = " e n - U S " > S p e c i f i e s   t h e   p i c t u r e   t h a t   h a s   b e e n   s e t   u p   f o r   t h e   c o m p a n y ,   s u c h   a s   a   c o m p a n y   l o g o . < / T o o l t i p T e x t > + 
+         < / T o o l t i p > + 
+         < T o o l t i p   c o l u m n = " S u b c P u r c h D o c N u m "   E l e m e n t I d = " 4 6 3 0 2 3 5 6 8 " > + 
+             < T o o l t i p T e x t   l a n g = " e n - U S " > S p e c i f i e s   a   u n i q u e   n u m b e r   t h a t   i d e n t i f i e s   t h e   p u r c h a s e   o r d e r .   T h e   n u m b e r   c a n   b e   g e n e r a t e d   a u t o m a t i c a l l y   f r o m   a   n u m b e r   s e r i e s ,   o r   y o u   c a n   n u m b e r   e a c h   o f   t h e m   m a n u a l l y . < / T o o l t i p T e x t > + 
+         < / T o o l t i p > + 
+         < T o o l t i p   c o l u m n = " S u b c S a l e s p e r s o n "   E l e m e n t I d = " 1 7 0 8 9 4 8 1 9 1 " > + 
+             < T o o l t i p T e x t   l a n g = " e n - U S " > S p e c i f i e s   t h e   n a m e   o f   t h e   s a l e s p e r s o n   o r   p u r c h a s e r . < / T o o l t i p T e x t > + 
+         < / T o o l t i p > + 
+         < T o o l t i p   c o l u m n = " S u b c S a l e s P e r s o n E m a i l "   E l e m e n t I d = " 1 8 6 7 8 0 7 7 9 7 " > + 
+             < T o o l t i p T e x t   l a n g = " e n - U S " > S p e c i f i e s   t h e   s a l e s p e r s o n ' s   e m a i l   a d d r e s s . < / T o o l t i p T e x t > + 
+         < / T o o l t i p > + 
+         < T o o l t i p   c o l u m n = " S u b c S h p t M e t h o d D e s c "   E l e m e n t I d = " 1 8 7 7 3 0 1 7 7 1 " > + 
+             < T o o l t i p T e x t   l a n g = " e n - U S " > S p e c i f i e s   a   d e s c r i p t i o n   o f   t h e   s h i p m e n t   m e t h o d . < / T o o l t i p T e x t > + 
+         < / T o o l t i p > + 
+         < T o o l t i p   c o l u m n = " S u b c V e n d o r N o "   E l e m e n t I d = " 1 9 2 8 6 5 0 6 9 5 " > + 
+             < T o o l t i p T e x t   l a n g = " e n - U S " > S p e c i f i e s   t h e   v e n d o r   w h o   w i l l   d e l i v e r   t h e   g o o d s   o r   s e r v i c e s .   E a c h   v e n d o r   h a s   a   u n i q u e   n u m b e r   t o   h e l p   y o u   t r a c k   r e l a t e d   d o c u m e n t s .   T h e   n u m b e r   c a n   c o m e   f r o m   a   n u m b e r   s e r i e s   o r   b e   a d d e d   m a n u a l l y . < / T o o l t i p T e x t > + 
+         < / T o o l t i p > + 
+         < T o o l t i p   c o l u m n = " N o _ P u r c h H e a d e r "   E l e m e n t I d = " 5 2 0 3 3 9 3 5 2 " > + 
+             < T o o l t i p T e x t   l a n g = " e n - U S " > S p e c i f i e s   a   u n i q u e   n u m b e r   t h a t   i d e n t i f i e s   t h e   p u r c h a s e   o r d e r .   T h e   n u m b e r   c a n   b e   g e n e r a t e d   a u t o m a t i c a l l y   f r o m   a   n u m b e r   s e r i e s ,   o r   y o u   c a n   n u m b e r   e a c h   o f   t h e m   m a n u a l l y . < / T o o l t i p T e x t > + 
+         < / T o o l t i p > + 
+         < T o o l t i p   c o l u m n = " P a y T o C o n t a c t E m a i l "   E l e m e n t I d = " 1 9 8 4 8 9 3 3 1 0 " > + 
+             < T o o l t i p T e x t   l a n g = " e n - U S " > S p e c i f i e s   t h e   e m a i l   a d d r e s s   o f   t h e   c o n t a c t . < / T o o l t i p T e x t > + 
+         < / T o o l t i p > + 
+         < T o o l t i p   c o l u m n = " P a y T o C o n t a c t M o b i l e P h o n e N o "   E l e m e n t I d = " 1 9 0 1 4 6 6 0 5 " > + 
+             < T o o l t i p T e x t   l a n g = " e n - U S " > S p e c i f i e s   t h e   c o n t a c t ' s   m o b i l e   t e l e p h o n e   n u m b e r . < / T o o l t i p T e x t > + 
+         < / T o o l t i p > + 
+         < T o o l t i p   c o l u m n = " P a y T o C o n t a c t P h o n e N o "   E l e m e n t I d = " 1 9 2 3 7 9 6 7 0 9 " > + 
+             < T o o l t i p T e x t   l a n g = " e n - U S " > S p e c i f i e s   t h e   c o n t a c t ' s   p h o n e   n u m b e r . < / T o o l t i p T e x t > + 
+         < / T o o l t i p > + 
+         < T o o l t i p   c o l u m n = " P a y T o V e n d N o _ P u r c h H e a d e r "   E l e m e n t I d = " 6 3 5 5 6 4 4 9 8 " > + 
+             < T o o l t i p T e x t   l a n g = " e n - U S " > S p e c i f i e s   t h e   n u m b e r   o f   t h e   v e n d o r   t h a t   y o u   r e c e i v e d   t h e   i n v o i c e   f r o m . < / T o o l t i p T e x t > + 
+         < / T o o l t i p > + 
+         < T o o l t i p   c o l u m n = " P r e p m t P a y m e n t T e r m s D e s c "   E l e m e n t I d = " 4 2 9 7 6 4 9 1 " > + 
+             < T o o l t i p T e x t   l a n g = " e n - U S " > S p e c i f i e s   a n   e x p l a n a t i o n   o f   t h e   p a y m e n t   t e r m s . < / T o o l t i p T e x t > + 
+         < / T o o l t i p > + 
+         < T o o l t i p   c o l u m n = " P r i c e s I n c l V A T _ P u r c h H e a d e r "   E l e m e n t I d = " 1 8 0 5 5 0 7 9 8 0 " > + 
+             < T o o l t i p T e x t   l a n g = " e n - U S " > S p e c i f i e s   i f   t h e   U n i t   P r i c e   a n d   L i n e   A m o u n t   f i e l d s   o n   d o c u m e n t   l i n e s   s h o u l d   b e   s h o w n   w i t h   o r   w i t h o u t   V A T . < / T o o l t i p T e x t > + 
+         < / T o o l t i p > + 
+         < T o o l t i p   c o l u m n = " S a l e s P u r c h P e r s o n N a m e "   E l e m e n t I d = " 1 3 7 3 7 6 8 5 5 7 " > + 
+             < T o o l t i p T e x t   l a n g = " e n - U S " > S p e c i f i e s   t h e   n a m e   o f   t h e   s a l e s p e r s o n   o r   p u r c h a s e r . < / T o o l t i p T e x t > + 
+         < / T o o l t i p > + 
+         < T o o l t i p   c o l u m n = " S e l l T o C u s t N o _ P u r c h H e a d e r "   E l e m e n t I d = " 9 6 4 8 7 3 2 0 4 " > + 
+             < T o o l t i p T e x t   l a n g = " e n - U S " > S p e c i f i e s   t h e   n u m b e r   o f   t h e   c u s t o m e r   t h a t   t h e   i t e m s   a r e   s h i p p e d   t o   d i r e c t l y   f r o m   y o u r   v e n d o r ,   a s   a   d r o p   s h i p m e n t . < / T o o l t i p T e x t > + 
+         < / T o o l t i p > + 
+         < T o o l t i p   c o l u m n = " S h i p m e n t M e t h o d D e s c "   E l e m e n t I d = " 6 8 6 3 4 3 1 7 9 " > + 
+             < T o o l t i p T e x t   l a n g = " e n - U S " > S p e c i f i e s   a   d e s c r i p t i o n   o f   t h e   s h i p m e n t   m e t h o d . < / T o o l t i p T e x t > + 
+         < / T o o l t i p > + 
+         < T o o l t i p   c o l u m n = " V e n d o r I n v o i c e N o "   E l e m e n t I d = " 8 8 7 3 7 6 2 2 5 " > + 
+             < T o o l t i p T e x t   l a n g = " e n - U S " > S p e c i f i e s   t h e   d o c u m e n t   n u m b e r   o f   t h e   o r i g i n a l   d o c u m e n t   y o u   r e c e i v e d   f r o m   t h e   v e n d o r .   Y o u   c a n   r e q u i r e   t h e   d o c u m e n t   n u m b e r   f o r   p o s t i n g ,   o r   l e t   i t   b e   o p t i o n a l .   B y   d e f a u l t ,   i t ' s   r e q u i r e d ,   s o   t h a t   t h i s   d o c u m e n t   r e f e r e n c e s   t h e   o r i g i n a l .   M a k i n g   d o c u m e n t   n u m b e r s   o p t i o n a l   r e m o v e s   a   s t e p   f r o m   t h e   p o s t i n g   p r o c e s s .   F o r   e x a m p l e ,   i f   y o u   a t t a c h   t h e   o r i g i n a l   i n v o i c e   a s   a   P D F ,   y o u   m i g h t   n o t   n e e d   t o   e n t e r   t h e   d o c u m e n t   n u m b e r .   T o   s p e c i f y   w h e t h e r   d o c u m e n t   n u m b e r s   a r e   r e q u i r e d ,   i n   t h e   P u r c h a s e s   & a m p ;   P a y a b l e s   S e t u p   w i n d o w ,   s e l e c t   o r   c l e a r   t h e   E x t .   D o c .   N o .   M a n d a t o r y   f i e l d . < / T o o l t i p T e x t > + 
+         < / T o o l t i p > + 
+         < T o o l t i p   c o l u m n = " V e n d o r O r d e r N o "   E l e m e n t I d = " 1 6 4 1 9 6 8 4 4 6 " > + 
+             < T o o l t i p T e x t   l a n g = " e n - U S " > S p e c i f i e s   t h e   v e n d o r ' s   o r d e r   n u m b e r . < / T o o l t i p T e x t > + 
+         < / T o o l t i p > + 
+         < T o o l t i p   c o l u m n = " Y o u r R e f _ P u r c h H e a d e r "   E l e m e n t I d = " 1 9 8 5 3 6 8 6 3 1 " > + 
+             < T o o l t i p T e x t   l a n g = " e n - U S " > S p e c i f i e s   t h e   v e n d o r ' s   r e f e r e n c e . < / T o o l t i p T e x t > + 
+         < / T o o l t i p > + 
+         < T o o l t i p   c o l u m n = " A l l o w I n v D i s c _ P u r c h L i n e "   E l e m e n t I d = " 9 8 2 2 2 1 3 6 3 " > + 
+             < T o o l t i p T e x t   l a n g = " e n - U S " > S p e c i f i e s   i f   t h e   i n v o i c e   l i n e   i s   i n c l u d e d   w h e n   t h e   i n v o i c e   d i s c o u n t   i s   c a l c u l a t e d . < / T o o l t i p T e x t > + 
+         < / T o o l t i p > + 
+         < T o o l t i p   c o l u m n = " D e s c _ P u r c h L i n e "   E l e m e n t I d = " 1 1 6 1 7 0 2 0 8 9 " > + 
+             < T o o l t i p T e x t   l a n g = " e n - U S " > S p e c i f i e s   a   d e s c r i p t i o n   o f   t h e   e n t r y   o f   t h e   p r o d u c t   t o   b e   p u r c h a s e d .   T o   a d d   a   n o n - t r a n s a c t i o n a l   t e x t   l i n e ,   f i l l   i n   t h e   D e s c r i p t i o n   f i e l d   o n l y . < / T o o l t i p T e x t > + 
+         < / T o o l t i p > + 
+         < T o o l t i p   c o l u m n = " S u b c L i n e D e s c r i p t i o n 2 "   E l e m e n t I d = " 1 3 3 9 9 9 1 1 2 " > + 
+             < T o o l t i p T e x t   l a n g = " e n - U S " > S p e c i f i e s   i n f o r m a t i o n   i n   a d d i t i o n   t o   t h e   d e s c r i p t i o n . < / T o o l t i p T e x t > + 
+         < / T o o l t i p > + 
+         < T o o l t i p   c o l u m n = " S u b c P u r c h Q t y "   E l e m e n t I d = " 8 8 0 6 5 5 3 7 4 " > + 
+             < T o o l t i p T e x t   l a n g = " e n - U S " > S p e c i f i e s   t h e   n u m b e r   o f   u n i t s   o f   t h e   i t e m   s p e c i f i e d   o n   t h e   l i n e . < / T o o l t i p T e x t > + 
+         < / T o o l t i p > + 
+         < T o o l t i p   c o l u m n = " I t e m N o _ P u r c h L i n e "   E l e m e n t I d = " 1 0 5 7 2 2 4 1 4 0 " > + 
+             < T o o l t i p T e x t   l a n g = " e n - U S " > S p e c i f i e s   t h e   n u m b e r   o f   t h e   i n v o l v e d   e n t r y   o r   r e c o r d ,   a c c o r d i n g   t o   t h e   s p e c i f i e d   n u m b e r   s e r i e s . < / T o o l t i p T e x t > + 
+         < / T o o l t i p > + 
+         < T o o l t i p   c o l u m n = " I t e m R e f e r e n c e N o _ P u r c h L i n e "   E l e m e n t I d = " 1 1 5 8 3 9 2 0 3 1 " > + 
+             < T o o l t i p T e x t   l a n g = " e n - U S " > S p e c i f i e s   t h e   r e f e r e n c e d   i t e m   n u m b e r . < / T o o l t i p T e x t > + 
+         < / T o o l t i p > + 
+         < T o o l t i p   c o l u m n = " J o b N o _ P u r c h L i n e "   E l e m e n t I d = " 2 7 7 7 0 3 3 2 6 " > + 
+             < T o o l t i p T e x t   l a n g = " e n - U S " > S p e c i f i e s   t h e   n u m b e r   o f   t h e   r e l a t e d   p r o j e c t .   I f   y o u   f i l l   i n   t h i s   f i e l d   a n d   t h e   P r o j e c t   T a s k   N o .   f i e l d ,   t h e n   a   p r o j e c t   l e d g e r   e n t r y   w i l l   b e   p o s t e d   t o g e t h e r   w i t h   t h e   p u r c h a s e   l i n e . < / T o o l t i p T e x t > + 
+         < / T o o l t i p > + 
+         < T o o l t i p   c o l u m n = " J o b T a s k N o _ P u r c h L i n e "   E l e m e n t I d = " 7 2 6 6 6 9 0 1 1 " > + 
+             < T o o l t i p T e x t   l a n g = " e n - U S " > S p e c i f i e s   t h e   n u m b e r   o f   t h e   r e l a t e d   p r o j e c t   t a s k . < / T o o l t i p T e x t > + 
+         < / T o o l t i p > + 
+         < T o o l t i p   c o l u m n = " L i n e D i s c _ P u r c h L i n e "   E l e m e n t I d = " 2 1 3 3 2 3 3 9 7 3 " > + 
+             < T o o l t i p T e x t   l a n g = " e n - U S " > S p e c i f i e s   t h e   d i s c o u n t   p e r c e n t a g e   t h a t   i s   g r a n t e d   f o r   t h e   i t e m   o n   t h e   l i n e . < / T o o l t i p T e x t > + 
+         < / T o o l t i p > + 
+         < T o o l t i p   c o l u m n = " L i n e N o _ P u r c h L i n e "   E l e m e n t I d = " 1 7 4 8 8 4 8 6 5 " > + 
+             < T o o l t i p T e x t   l a n g = " e n - U S " > S p e c i f i e s   t h e   l i n e ' s   n u m b e r . < / T o o l t i p T e x t > + 
+         < / T o o l t i p > + 
+         < T o o l t i p   c o l u m n = " P u r c h a s e _ L i n e _ O u t s t a n d i n g _ Q t y "   E l e m e n t I d = " 2 1 2 3 0 1 5 5 8 3 " > + 
+             < T o o l t i p T e x t   l a n g = " e n - U S " > S p e c i f i e s   h o w   m a n y   u n i t s   o n   t h e   o r d e r   l i n e   h a v e   n o t   y e t   b e e n   r e c e i v e d . < / T o o l t i p T e x t > + 
+         < / T o o l t i p > + 
+         < T o o l t i p   c o l u m n = " U n i t P r i c e _ P u r c h L i n e "   E l e m e n t I d = " 2 0 6 3 2 5 9 8 1 9 " > + 
+             < T o o l t i p T e x t   l a n g = " e n - U S " > S p e c i f i e s   t h e   p r i c e ,   i n   L C Y ,   o f   o n e   u n i t   o f   t h e   i t e m   o r   r e s o u r c e .   Y o u   c a n   e n t e r   a   p r i c e   m a n u a l l y   o r   h a v e   i t   e n t e r e d   a c c o r d i n g   t o   t h e   P r i c e / P r o f i t   C a l c u l a t i o n   f i e l d   o n   t h e   r e l a t e d   c a r d . < / T o o l t i p T e x t > + 
+         < / T o o l t i p > + 
+         < T o o l t i p   c o l u m n = " U O M _ P u r c h L i n e "   E l e m e n t I d = " 4 4 1 1 3 9 0 4 9 " > + 
+             < T o o l t i p T e x t   l a n g = " e n - U S " > S p e c i f i e s   t h e   u n i t   o f   m e a s u r e . < / T o o l t i p T e x t > + 
+         < / T o o l t i p > + 
+         < T o o l t i p   c o l u m n = " P r o d _ _ O r d e r _ L i n e _ _ _ I t e m _ N o _ _ "   E l e m e n t I d = " 1 4 4 5 8 3 7 4 7 3 " > + 
+             < T o o l t i p T e x t   l a n g = " e n - U S " > S p e c i f i e s   t h e   n u m b e r   o f   t h e   i t e m   t h a t   i s   t o   b e   p r o d u c e d . < / T o o l t i p T e x t > + 
+         < / T o o l t i p > + 
+         < T o o l t i p   c o l u m n = " P r o d _ _ O r d e r _ L i n e _ _ _ U n i t _ o f _ M e a s u r e _ C o d e _ "   E l e m e n t I d = " 9 5 8 0 7 4 5 4 " > + 
+             < T o o l t i p T e x t   l a n g = " e n - U S " > S p e c i f i e s   h o w   e a c h   u n i t   o f   t h e   i t e m   i s   m e a s u r e d ,   s u c h   a s   i n   p i e c e s   o r   t o n s .   B y   d e f a u l t ,   t h e   v a l u e   i n   t h e   B a s e   U n i t   o f   M e a s u r e   f i e l d   o n   t h e   i t e m   c a r d   i s   i n s e r t e d .   I t   w i l l   b e   c h a n g e d   i f   y o u   s w i t c h   P r o d u c t   B O M   o r   P r o d u c t i o n   B O M   V e r s i o n . < / T o o l t i p T e x t > + 
+         < / T o o l t i p > + 
+         < T o o l t i p   c o l u m n = " P r o d _ _ O r d e r _ R o u t i n g _ L i n e _ _ O p e r a t i o n _ N o _ _ "   E l e m e n t I d = " 1 6 4 1 3 6 8 4 3 " > + 
+             < T o o l t i p T e x t   l a n g = " e n - U S " > S p e c i f i e s   t h e   o p e r a t i o n   n u m b e r . < / T o o l t i p T e x t > + 
+         < / T o o l t i p > + 
+         < T o o l t i p   c o l u m n = " P r o d _ _ O r d e r _ R o u t i n g _ L i n e _ _ P r o d _ _ O r d e r _ N o _ _ "   E l e m e n t I d = " 9 8 1 9 6 1 5 8 5 " > + 
+             < T o o l t i p T e x t   l a n g = " e n - U S " > S p e c i f i e s   t h e   n u m b e r   o f   t h e   r e l a t e d   p r o d u c t i o n   o r d e r . < / T o o l t i p T e x t > + 
+         < / T o o l t i p > + 
+         < T o o l t i p   c o l u m n = " P r o d _ _ O r d e r _ R o u t i n g _ L i n e _ D e s c r i p t i o n "   E l e m e n t I d = " 1 1 8 5 2 9 4 8 9 7 " > + 
+             < T o o l t i p T e x t   l a n g = " e n - U S " > S p e c i f i e s   t h e   d e s c r i p t i o n   o f   t h e   o p e r a t i o n . < / T o o l t i p T e x t > + 
+         < / T o o l t i p > + 
+         < T o o l t i p   c o l u m n = " P r o d _ _ O r d e r _ R o u t i n g _ L i n e _ D e s c r i p t i o n _ C o n t r o l 1 1 3 0 5 3 8 "   E l e m e n t I d = " 2 0 5 0 0 9 4 6 2 0 " > + 
+             < T o o l t i p T e x t   l a n g = " e n - U S " > S p e c i f i e s   t h e   d e s c r i p t i o n   o f   t h e   o p e r a t i o n . < / T o o l t i p T e x t > + 
+         < / T o o l t i p > + 
+         < T o o l t i p   c o l u m n = " P r o d _ _ O r d e r _ R o u t i n g _ L i n e _ R o u t i n g _ L i n k _ C o d e "   E l e m e n t I d = " 1 2 4 7 0 8 9 6 6 " > + 
+             < T o o l t i p T e x t   l a n g = " e n - U S " > S p e c i f i e s   a   r o u t i n g   l i n k   c o d e . < / T o o l t i p T e x t > + 
+         < / T o o l t i p > + 
+         < T o o l t i p   c o l u m n = " P r o d _ _ O r d e r _ R o u t i n g _ L i n e _ R o u t i n g _ N o _ "   E l e m e n t I d = " 1 0 6 0 7 5 6 5 4 " > + 
+             < T o o l t i p T e x t   l a n g = " e n - U S " > S p e c i f i e s   t h e   r o u t i n g   n u m b e r . < / T o o l t i p T e x t > + 
+         < / T o o l t i p > + 
+         < T o o l t i p   c o l u m n = " P r o d _ _ O r d e r _ R o u t i n g _ L i n e _ R o u t i n g _ R e f e r e n c e _ N o _ "   E l e m e n t I d = " 2 7 3 1 5 8 7 7 8 " > + 
+             < T o o l t i p T e x t   l a n g = " e n - U S " > S p e c i f i e s   t h a t   t h e   r o u t i n g   r e f e r e n c e   n u m b e r . < / T o o l t i p T e x t > + 
+         < / T o o l t i p > + 
+         < T o o l t i p   c o l u m n = " P r o d _ _ O r d e r _ R o u t i n g _ L i n e _ S t a t u s "   E l e m e n t I d = " 7 9 8 1 7 9 9 1 7 " > + 
+             < T o o l t i p T e x t   l a n g = " e n - U S " > S p e c i f i e s   t h e   s t a t u s   o f   t h e   r o u t i n g   l i n e . < / T o o l t i p T e x t > + 
+         < / T o o l t i p > + 
+         < T o o l t i p   c o l u m n = " P r o d _ _ O r d e r _ C o m p o n e n t _ _ I t e m _ N o _ _ "   E l e m e n t I d = " 6 2 8 6 8 6 0 8 7 " > + 
+             < T o o l t i p T e x t   l a n g = " e n - U S " > S p e c i f i e s   t h e   n u m b e r   o f   t h e   i t e m   t h a t   i s   a   c o m p o n e n t   i n   t h e   p r o d u c t i o n   o r d e r   c o m p o n e n t   l i s t . < / T o o l t i p T e x t > + 
+         < / T o o l t i p > + 
+         < T o o l t i p   c o l u m n = " P r o d _ _ O r d e r _ C o m p o n e n t _ _ Q t y _ _ i n _ T r a n s i t _ _ B a s e _ _ "   E l e m e n t I d = " 1 9 9 5 0 4 3 4 3 6 " > + 
+             < T o o l t i p T e x t   l a n g = " e n - U S " > S p e c i f i e s   t h e   i t e m s   t h a t   a r e   i n   t r a n s i t . < / T o o l t i p T e x t > + 
+         < / T o o l t i p > + 
+         < T o o l t i p   c o l u m n = " P r o d _ _ O r d e r _ C o m p o n e n t _ _ Q t y _ _ t r a n s f _ _ t o _ S u b c o n t r a c t o r _ "   E l e m e n t I d = " 7 7 0 6 9 1 9 7 8 " > + 
+             < T o o l t i p T e x t   l a n g = " e n - U S " > S p e c i f i e s   t h e   i t e m   a m o u n t   t r a n s f e r r e d   t o   t h e   s u b c o n t r a c t o r . < / T o o l t i p T e x t > + 
+         < / T o o l t i p > + 
+         < T o o l t i p   c o l u m n = " P r o d _ _ O r d e r _ C o m p o n e n t _ D e s c r i p t i o n "   E l e m e n t I d = " 1 3 0 9 7 4 4 4 3 " > + 
+             < T o o l t i p T e x t   l a n g = " e n - U S " > S p e c i f i e s   a   d e s c r i p t i o n   o f   t h e   i t e m   o n   t h e   l i n e . < / T o o l t i p T e x t > + 
+         < / T o o l t i p > + 
+         < T o o l t i p   c o l u m n = " P r o d _ _ O r d e r _ C o m p o n e n t _ P r o d _ _ O r d e r _ L i n e _ N o _ "   E l e m e n t I d = " 1 7 2 6 5 5 2 3 1 8 " > + 
+             < T o o l t i p T e x t   l a n g = " e n - U S " > S p e c i f i e s   t h e   n u m b e r   o f   t h e   p r o d u c t i o n   o r d e r   l i n e   t o   w h i c h   t h e   c o m p o n e n t   l i s t   b e l o n g s . < / T o o l t i p T e x t > + 
+         < / T o o l t i p > + 
+         < T o o l t i p   c o l u m n = " P r o d _ _ O r d e r _ C o m p o n e n t _ P r o d _ _ O r d e r _ N o _ "   E l e m e n t I d = " 1 4 6 7 3 5 3 9 2 5 " > + 
+             < T o o l t i p T e x t   l a n g = " e n - U S " > S p e c i f i e s   t h e   n u m b e r   o f   t h e   r e l a t e d   p r o d u c t i o n   o r d e r . < / T o o l t i p T e x t > + 
+         < / T o o l t i p > + 
+         < T o o l t i p   c o l u m n = " P r o d _ _ O r d e r _ C o m p o n e n t _ R o u t i n g _ L i n k _ C o d e "   E l e m e n t I d = " 2 0 6 8 1 8 6 1 8 0 " > + 
+             < T o o l t i p T e x t   l a n g = " e n - U S " > S p e c i f i e s   t h e   r o u t i n g   l i n k   c o d e   w h e n   y o u   c a l c u l a t e   t h e   p r o d u c t i o n   o r d e r . < / T o o l t i p T e x t > + 
+         < / T o o l t i p > + 
+         < T o o l t i p   c o l u m n = " P r o d _ _ O r d e r _ C o m p o n e n t _ S t a t u s "   E l e m e n t I d = " 6 0 3 9 0 9 7 0 3 " > + 
+             < T o o l t i p T e x t   l a n g = " e n - U S " > S p e c i f i e s   t h e   s t a t u s   o f   t h e   p r o d u c t i o n   o r d e r   t o   w h i c h   t h e   c o m p o n e n t   l i s t   b e l o n g s . < / T o o l t i p T e x t > + 
+         < / T o o l t i p > + 
+         < T o o l t i p   c o l u m n = " V A T A m t L i n e I n v D i s c A m t "   E l e m e n t I d = " 1 0 0 7 8 2 8 6 0 " > + 
+             < T o o l t i p T e x t   l a n g = " e n - U S " > S p e c i f i e s   t h e   i n v o i c e   d i s c o u n t   a m o u n t   f o r   a   s p e c i f i c   V A T   i d e n t i f i e r . < / T o o l t i p T e x t > + 
+         < / T o o l t i p > + 
+         < T o o l t i p   c o l u m n = " V A T A m t L i n e I n v D i s c B a s e A m t "   E l e m e n t I d = " 1 6 9 1 0 0 3 4 1 5 " > + 
+             < T o o l t i p T e x t   l a n g = " e n - U S " > S p e c i f i e s   t h e   i n v o i c e   d i s c o u n t   b a s e   a m o u n t . < / T o o l t i p T e x t > + 
+         < / T o o l t i p > + 
+         < T o o l t i p   c o l u m n = " V A T A m t L i n e L i n e A m t "   E l e m e n t I d = " 1 8 8 2 1 0 3 2 6 2 " > + 
+             < T o o l t i p T e x t   l a n g = " e n - U S " > S p e c i f i e s   t h e   t o t a l   a m o u n t   f o r   s a l e s   o r   p u r c h a s e   l i n e s   w i t h   a   s p e c i f i c   V A T   i d e n t i f i e r . < / T o o l t i p T e x t > + 
+         < / T o o l t i p > + 
+         < T o o l t i p   c o l u m n = " V A T A m t L i n e V A T "   E l e m e n t I d = " 2 9 9 0 4 8 9 2 5 " > + 
+             < T o o l t i p T e x t   l a n g = " e n - U S " > S p e c i f i e s   t h e   V A T   %   t h a t   w a s   u s e d   o n   t h e   s a l e s   o r   p u r c h a s e   l i n e s   w i t h   t h i s   V A T   I d e n t i f i e r . < / T o o l t i p T e x t > + 
+         < / T o o l t i p > + 
+         < T o o l t i p   c o l u m n = " V A T A m t L i n e V A T A m t "   E l e m e n t I d = " 8 4 9 9 7 4 3 4 1 " > + 
+             < T o o l t i p T e x t   l a n g = " e n - U S " > S p e c i f i e s   t h e   a m o u n t   o f   V A T   t h a t   i s   i n c l u d e d   i n   t h e   t o t a l   a m o u n t . < / T o o l t i p T e x t > + 
+         < / T o o l t i p > + 
+         < T o o l t i p   c o l u m n = " V A T A m t L i n e V A T B a s e "   E l e m e n t I d = " 1 4 1 9 8 1 6 2 1 8 " > + 
+             < T o o l t i p T e x t   l a n g = " e n - U S " > S p e c i f i e s   t h e   t o t a l   n e t   a m o u n t   ( a m o u n t   e x c l u d i n g   V A T )   f o r   s a l e s   o r   p u r c h a s e   l i n e s   w i t h   a   s p e c i f i c   V A T   I d e n t i f i e r . < / T o o l t i p T e x t > + 
+         < / T o o l t i p > + 
+         < T o o l t i p   c o l u m n = " V A T A m t L i n e V A T I d e n t i f i e r "   E l e m e n t I d = " 4 6 1 3 9 9 7 9 2 " > + 
+             < T o o l t i p T e x t   l a n g = " e n - U S " > S p e c i f i e s   t h e   V A T   I d e n t i f i e r   v a l u e . < / T o o l t i p T e x t > + 
+         < / T o o l t i p > + 
+         < T o o l t i p   c o l u m n = " P r e p m t V A T A m t L i n e L i n e A m t "   E l e m e n t I d = " 4 0 2 6 8 5 8 2 4 " > + 
+             < T o o l t i p T e x t   l a n g = " e n - U S " > S p e c i f i e s   t h e   t o t a l   a m o u n t   f o r   s a l e s   o r   p u r c h a s e   l i n e s   w i t h   a   s p e c i f i c   V A T   i d e n t i f i e r . < / T o o l t i p T e x t > + 
+         < / T o o l t i p > + 
+         < T o o l t i p   c o l u m n = " P r e p m t V A T A m t L i n e V A T "   E l e m e n t I d = " 1 9 1 5 4 9 4 8 5 " > + 
+             < T o o l t i p T e x t   l a n g = " e n - U S " > S p e c i f i e s   t h e   V A T   %   t h a t   w a s   u s e d   o n   t h e   s a l e s   o r   p u r c h a s e   l i n e s   w i t h   t h i s   V A T   I d e n t i f i e r . < / T o o l t i p T e x t > + 
+         < / T o o l t i p > + 
+         < T o o l t i p   c o l u m n = " P r e p m t V A T A m t L i n e V A T A m t "   E l e m e n t I d = " 1 8 7 1 3 0 1 8 2 9 " > + 
+             < T o o l t i p T e x t   l a n g = " e n - U S " > S p e c i f i e s   t h e   a m o u n t   o f   V A T   t h a t   i s   i n c l u d e d   i n   t h e   t o t a l   a m o u n t . < / T o o l t i p T e x t > + 
+         < / T o o l t i p > + 
+         < T o o l t i p   c o l u m n = " P r e p m t V A T A m t L i n e V A T B a s e "   E l e m e n t I d = " 1 2 2 6 9 0 4 6 9 6 " > + 
+             < T o o l t i p T e x t   l a n g = " e n - U S " > S p e c i f i e s   t h e   t o t a l   n e t   a m o u n t   ( a m o u n t   e x c l u d i n g   V A T )   f o r   s a l e s   o r   p u r c h a s e   l i n e s   w i t h   a   s p e c i f i c   V A T   I d e n t i f i e r . < / T o o l t i p T e x t > + 
+         < / T o o l t i p > + 
+         < T o o l t i p   c o l u m n = " P r e p m t V A T A m t L i n e V A T I d "   E l e m e n t I d = " 9 8 2 2 2 4 8 0 0 " > + 
+             < T o o l t i p T e x t   l a n g = " e n - U S " > S p e c i f i e s   t h e   V A T   I d e n t i f i e r   v a l u e . < / T o o l t i p T e x t > + 
+         < / T o o l t i p > + 
+         < T o o l t i p   c o l u m n = " S u b c I n v o i c e D i s c o u n t A m o u n t _ V A T A m o u n t L i n e "   E l e m e n t I d = " 8 7 9 9 1 1 6 2 8 " > + 
+             < T o o l t i p T e x t   l a n g = " e n - U S " > S p e c i f i e s   t h e   i n v o i c e   d i s c o u n t   a m o u n t   f o r   a   s p e c i f i c   V A T   i d e n t i f i e r . < / T o o l t i p T e x t > + 
+         < / T o o l t i p > + 
+         < T o o l t i p   c o l u m n = " S u b c I n v o i c e D i s c o u n t B a s e A m o u n t _ V A T A m o u n t L i n e "   E l e m e n t I d = " 1 2 5 3 7 7 7 4 6 5 " > + 
+             < T o o l t i p T e x t   l a n g = " e n - U S " > S p e c i f i e s   t h e   i n v o i c e   d i s c o u n t   b a s e   a m o u n t . < / T o o l t i p T e x t > + 
+         < / T o o l t i p > + 
+         < T o o l t i p   c o l u m n = " S u b c L i n e A m o u n t _ V a t A m o u n t L i n e "   E l e m e n t I d = " 8 9 2 6 1 3 9 2 2 " > + 
+             < T o o l t i p T e x t   l a n g = " e n - U S " > S p e c i f i e s   t h e   t o t a l   a m o u n t   f o r   s a l e s   o r   p u r c h a s e   l i n e s   w i t h   a   s p e c i f i c   V A T   i d e n t i f i e r . < / T o o l t i p T e x t > + 
+         < / T o o l t i p > + 
+         < T o o l t i p   c o l u m n = " S u b c V A T A m o u n t _ V a t A m o u n t L i n e "   E l e m e n t I d = " 1 1 9 8 7 6 5 5 8 1 " > + 
+             < T o o l t i p T e x t   l a n g = " e n - U S " > S p e c i f i e s   t h e   a m o u n t   o f   V A T   t h a t   i s   i n c l u d e d   i n   t h e   t o t a l   a m o u n t . < / T o o l t i p T e x t > + 
+         < / T o o l t i p > + 
+         < T o o l t i p   c o l u m n = " S u b c V A T B a s e _ V a t A m o u n t L i n e "   E l e m e n t I d = " 1 6 3 9 4 2 6 9 4 " > + 
+             < T o o l t i p T e x t   l a n g = " e n - U S " > S p e c i f i e s   t h e   t o t a l   n e t   a m o u n t   ( a m o u n t   e x c l u d i n g   V A T )   f o r   s a l e s   o r   p u r c h a s e   l i n e s   w i t h   a   s p e c i f i c   V A T   I d e n t i f i e r . < / T o o l t i p T e x t > + 
+         < / T o o l t i p > + 
+         < T o o l t i p   c o l u m n = " S u b c V A T C l a u s e 2 D e s c r i p t i o n "   E l e m e n t I d = " 1 0 7 3 5 6 6 6 1 6 " > + 
+             < T o o l t i p T e x t   l a n g = " e n - U S " > S p e c i f i e s   t h e   d e s c r i p t i v e   t e x t   t h a t   i s   a s s o c i a t e d   w i t h   a   V A T   c l a u s e . < / T o o l t i p T e x t > + 
+         < / T o o l t i p > + 
+         < T o o l t i p   c o l u m n = " S u b c V A T C l a u s e 2 D e s c r i p t i o n 2 "   E l e m e n t I d = " 1 1 4 1 9 2 6 6 7 8 " > + 
+             < T o o l t i p T e x t   l a n g = " e n - U S " > S p e c i f i e s   a n   a d d i t i o n a l   d e s c r i p t i o n   o f   a   V A T   c l a u s e . < / T o o l t i p T e x t > + 
+         < / T o o l t i p > + 
+         < T o o l t i p   c o l u m n = " S u b c V A T I d e n t i f i e r _ V a t A m o u n t L i n e "   E l e m e n t I d = " 1 3 2 9 3 9 5 5 3 2 " > + 
+             < T o o l t i p T e x t   l a n g = " e n - U S " > S p e c i f i e s   t h e   V A T   I d e n t i f i e r   v a l u e . < / T o o l t i p T e x t > + 
+         < / T o o l t i p > + 
+         < T o o l t i p   c o l u m n = " S u b c V A T P c t _ V a t A m o u n t L i n e "   E l e m e n t I d = " 1 8 7 3 8 8 6 8 3 2 " > + 
+             < T o o l t i p T e x t   l a n g = " e n - U S " > S p e c i f i e s   t h e   V A T   %   t h a t   w a s   u s e d   o n   t h e   s a l e s   o r   p u r c h a s e   l i n e s   w i t h   t h i s   V A T   I d e n t i f i e r . < / T o o l t i p T e x t > + 
+         < / T o o l t i p > + 
+         < T o o l t i p   c o l u m n = " T e m p S U B S h i p T o A d d r _ _ A d d r e s s "   E l e m e n t I d = " 7 1 1 0 9 2 3 4 3 " > + 
+             < T o o l t i p T e x t   l a n g = " e n - U S " > S p e c i f i e s   t h e   s h i p - t o   a d d r e s s . < / T o o l t i p T e x t > + 
+         < / T o o l t i p > + 
+     < / T o o l t i p s > + 
+     < P u r c h a s e _ H e a d e r   E l e m e n t T y p e = " D a t a I t e m "   E l e m e n t I d = " 3 0 1 5 4 4 2 5 8 " > + 
+         < A l l o w I n v o i c e D i s c _ L b l   E l e m e n t T y p e = " C o l u m n "   E l e m e n t I d = " 1 4 4 9 1 1 7 7 6 3 "   D a t a T y p e = " L a b e l " > A l l o w I n v o i c e D i s c _ L b l < / A l l o w I n v o i c e D i s c _ L b l > + 
+         < A m o u n t _ L b l   E l e m e n t T y p e = " C o l u m n "   E l e m e n t I d = " 1 8 5 7 4 6 5 8 6 0 "   D a t a T y p e = " L a b e l " > A m o u n t _ L b l < / A m o u n t _ L b l > + 
+         < B u y e r _ L b l   E l e m e n t T y p e = " C o l u m n "   E l e m e n t I d = " 1 7 4 6 3 3 5 4 8 9 "   D a t a T y p e = " L a b e l " > B u y e r _ L b l < / B u y e r _ L b l > + 
+         < B u y F r m V e n d N o _ P u r c h H e a d e r   E l e m e n t T y p e = " C o l u m n "   E l e m e n t I d = " 1 1 4 1 1 5 6 0 2 "   D a t a T y p e = " C o d e " > B u y F r m V e n d N o _ P u r c h H e a d e r < / B u y F r m V e n d N o _ P u r c h H e a d e r > + 
+         < B u y F r m V e n d N o _ P u r c h H e a d e r _ L b l   E l e m e n t T y p e = " C o l u m n "   E l e m e n t I d = " 1 8 5 3 8 7 0 8 5 "   D a t a T y p e = " S t r i n g " > B u y F r m V e n d N o _ P u r c h H e a d e r _ L b l < / B u y F r m V e n d N o _ P u r c h H e a d e r _ L b l > + 
+         < B u y F r o m A d d r 1   E l e m e n t T y p e = " C o l u m n "   E l e m e n t I d = " 9 9 4 5 5 4 4 3 3 "   D a t a T y p e = " T e x t " > B u y F r o m A d d r 1 < / B u y F r o m A d d r 1 > + 
+         < B u y F r o m A d d r 2   E l e m e n t T y p e = " C o l u m n "   E l e m e n t I d = " 1 3 8 7 3 2 3 0 1 2 "   D a t a T y p e = " T e x t " > B u y F r o m A d d r 2 < / B u y F r o m A d d r 2 > + 
+         < B u y F r o m A d d r 3   E l e m e n t T y p e = " C o l u m n "   E l e m e n t I d = " 2 0 2 5 0 1 9 6 2 9 "   D a t a T y p e = " T e x t " > B u y F r o m A d d r 3 < / B u y F r o m A d d r 3 > + 
+         < B u y F r o m A d d r 4   E l e m e n t T y p e = " C o l u m n "   E l e m e n t I d = " 1 1 1 9 2 9 7 7 8 "   D a t a T y p e = " T e x t " > B u y F r o m A d d r 4 < / B u y F r o m A d d r 4 > + 
+         < B u y F r o m A d d r 5   E l e m e n t T y p e = " C o l u m n "   E l e m e n t I d = " 7 4 9 6 2 6 3 9 5 "   D a t a T y p e = " T e x t " > B u y F r o m A d d r 5 < / B u y F r o m A d d r 5 > + 
+         < B u y F r o m A d d r 6   E l e m e n t T y p e = " C o l u m n "   E l e m e n t I d = " 1 1 6 3 4 6 3 4 5 6 "   D a t a T y p e = " T e x t " > B u y F r o m A d d r 6 < / B u y F r o m A d d r 6 > + 
+         < B u y F r o m A d d r 7   E l e m e n t T y p e = " C o l u m n "   E l e m e n t I d = " 5 2 5 7 6 6 8 3 9 "   D a t a T y p e = " T e x t " > B u y F r o m A d d r 7 < / B u y F r o m A d d r 7 > + 
+         < B u y F r o m A d d r 8   E l e m e n t T y p e = " C o l u m n "   E l e m e n t I d = " 8 2 5 6 4 5 4 1 0 "   D a t a T y p e = " T e x t " > B u y F r o m A d d r 8 < / B u y F r o m A d d r 8 > + 
+         < B u y F r o m C o n t a c t E m a i l   E l e m e n t T y p e = " C o l u m n "   E l e m e n t I d = " 1 4 6 0 8 4 1 4 4 9 "   D a t a T y p e = " T e x t " > B u y F r o m C o n t a c t E m a i l < / B u y F r o m C o n t a c t E m a i l > + 
+         < B u y F r o m C o n t a c t E m a i l L b l   E l e m e n t T y p e = " C o l u m n "   E l e m e n t I d = " 4 6 2 0 6 3 8 7 5 "   D a t a T y p e = " L a b e l " > B u y F r o m C o n t a c t E m a i l L b l < / B u y F r o m C o n t a c t E m a i l L b l > + 
+         < B u y F r o m C o n t a c t M o b i l e P h o n e N o   E l e m e n t T y p e = " C o l u m n "   E l e m e n t I d = " 6 8 2 3 8 6 3 9 2 "   D a t a T y p e = " T e x t " > B u y F r o m C o n t a c t M o b i l e P h o n e N o < / B u y F r o m C o n t a c t M o b i l e P h o n e N o > + 
+         < B u y F r o m C o n t a c t M o b i l e P h o n e N o L b l   E l e m e n t T y p e = " C o l u m n "   E l e m e n t I d = " 3 5 0 1 9 3 3 8 "   D a t a T y p e = " L a b e l " > B u y F r o m C o n t a c t M o b i l e P h o n e N o L b l < / B u y F r o m C o n t a c t M o b i l e P h o n e N o L b l > + 
+         < B u y F r o m C o n t a c t P h o n e N o   E l e m e n t T y p e = " C o l u m n "   E l e m e n t I d = " 1 6 2 4 1 1 6 4 9 6 "   D a t a T y p e = " T e x t " > B u y F r o m C o n t a c t P h o n e N o < / B u y F r o m C o n t a c t P h o n e N o > + 
+         < B u y F r o m C o n t a c t P h o n e N o L b l   E l e m e n t T y p e = " C o l u m n "   E l e m e n t I d = " 3 6 1 4 5 0 8 0 2 "   D a t a T y p e = " L a b e l " > B u y F r o m C o n t a c t P h o n e N o L b l < / B u y F r o m C o n t a c t P h o n e N o L b l > + 
+         < C o m p a n y A d d r e s s 1   E l e m e n t T y p e = " C o l u m n "   E l e m e n t I d = " 1 8 8 4 1 6 4 3 2 3 "   D a t a T y p e = " T e x t " > C o m p a n y A d d r e s s 1 < / C o m p a n y A d d r e s s 1 > + 
+         < C o m p a n y A d d r e s s 2   E l e m e n t T y p e = " C o l u m n "   E l e m e n t I d = " 1 2 4 6 4 6 7 7 0 6 "   D a t a T y p e = " T e x t " > C o m p a n y A d d r e s s 2 < / C o m p a n y A d d r e s s 2 > + 
+         < C o m p a n y A d d r e s s 3   E l e m e n t T y p e = " C o l u m n "   E l e m e n t I d = " 6 0 8 7 7 1 0 8 9 "   D a t a T y p e = " T e x t " > C o m p a n y A d d r e s s 3 < / C o m p a n y A d d r e s s 3 > + 
+         < C o m p a n y A d d r e s s 4   E l e m e n t T y p e = " C o l u m n "   E l e m e n t I d = " 7 7 7 6 8 0 1 1 2 "   D a t a T y p e = " T e x t " > C o m p a n y A d d r e s s 4 < / C o m p a n y A d d r e s s 4 > + 
+         < C o m p a n y A d d r e s s 5   E l e m e n t T y p e = " C o l u m n "   E l e m e n t I d = " 1 3 9 9 8 3 4 9 5 "   D a t a T y p e = " T e x t " > C o m p a n y A d d r e s s 5 < / C o m p a n y A d d r e s s 5 > + 
+         < C o m p a n y A d d r e s s 6   E l e m e n t T y p e = " C o l u m n "   E l e m e n t I d = " 4 9 7 7 1 3 1 2 2 "   D a t a T y p e = " T e x t " > C o m p a n y A d d r e s s 6 < / C o m p a n y A d d r e s s 6 > + 
+         < C o m p a n y B a n k A c c o u n t N o   E l e m e n t T y p e = " C o l u m n "   E l e m e n t I d = " 3 0 1 4 0 2 0 4 "   D a t a T y p e = " T e x t " > C o m p a n y B a n k A c c o u n t N o < / C o m p a n y B a n k A c c o u n t N o > + 
+         < C o m p a n y B a n k A c c o u n t N o _ L b l   E l e m e n t T y p e = " C o l u m n "   E l e m e n t I d = " 1 0 9 7 7 4 3 3 4 5 "   D a t a T y p e = " L a b e l " > C o m p a n y B a n k A c c o u n t N o _ L b l < / C o m p a n y B a n k A c c o u n t N o _ L b l > + 
+         < C o m p a n y B a n k B r a n c h N o   E l e m e n t T y p e = " C o l u m n "   E l e m e n t I d = " 7 9 3 1 3 3 0 5 7 "   D a t a T y p e = " T e x t " > C o m p a n y B a n k B r a n c h N o < / C o m p a n y B a n k B r a n c h N o > + 
+         < C o m p a n y B a n k B r a n c h N o _ L b l   E l e m e n t T y p e = " C o l u m n "   E l e m e n t I d = " 3 2 7 9 0 6 6 9 2 "   D a t a T y p e = " S t r i n g " > C o m p a n y B a n k B r a n c h N o _ L b l < / C o m p a n y B a n k B r a n c h N o _ L b l > + 
+         < C o m p a n y B a n k N a m e   E l e m e n t T y p e = " C o l u m n "   E l e m e n t I d = " 1 5 3 4 9 0 5 6 0 5 "   D a t a T y p e = " T e x t " > C o m p a n y B a n k N a m e < / C o m p a n y B a n k N a m e > + 
+         < C o m p a n y B a n k N a m e _ L b l   E l e m e n t T y p e = " C o l u m n "   E l e m e n t I d = " 1 2 0 4 3 0 7 0 1 4 "   D a t a T y p e = " L a b e l " > C o m p a n y B a n k N a m e _ L b l < / C o m p a n y B a n k N a m e _ L b l > + 
+         < C o m p a n y C u s t o m G i r o   E l e m e n t T y p e = " C o l u m n "   E l e m e n t I d = " 1 6 7 0 4 7 5 7 9 8 "   D a t a T y p e = " T e x t " > C o m p a n y C u s t o m G i r o < / C o m p a n y C u s t o m G i r o > + 
+         < C o m p a n y C u s t o m G i r o _ L b l   E l e m e n t T y p e = " C o l u m n "   E l e m e n t I d = " 8 9 1 4 3 9 6 2 5 "   D a t a T y p e = " T e x t " > C o m p a n y C u s t o m G i r o _ L b l < / C o m p a n y C u s t o m G i r o _ L b l > + 
+         < C o m p a n y E M a i l   E l e m e n t T y p e = " C o l u m n "   E l e m e n t I d = " 1 6 7 7 0 7 4 0 5 8 "   D a t a T y p e = " T e x t " > C o m p a n y E M a i l < / C o m p a n y E M a i l > + 
+         < C o m p a n y E m a i l _ L b l   E l e m e n t T y p e = " C o l u m n "   E l e m e n t I d = " 8 0 8 1 5 9 1 7 9 "   D a t a T y p e = " L a b e l " > C o m p a n y E m a i l _ L b l < / C o m p a n y E m a i l _ L b l > + 
+         < C o m p a n y G i r o N o   E l e m e n t T y p e = " C o l u m n "   E l e m e n t I d = " 1 3 6 0 1 9 6 3 2 0 "   D a t a T y p e = " T e x t " > C o m p a n y G i r o N o < / C o m p a n y G i r o N o > + 
+         < C o m p a n y G i r o N o _ L b l   E l e m e n t T y p e = " C o l u m n "   E l e m e n t I d = " 8 6 1 6 0 2 1 1 5 "   D a t a T y p e = " L a b e l " > C o m p a n y G i r o N o _ L b l < / C o m p a n y G i r o N o _ L b l > + 
+         < C o m p a n y H o m e P a g e   E l e m e n t T y p e = " C o l u m n "   E l e m e n t I d = " 1 9 8 9 1 8 8 7 0 "   D a t a T y p e = " T e x t " > C o m p a n y H o m e P a g e < / C o m p a n y H o m e P a g e > + 
+         < C o m p a n y H o m e P a g e _ L b l   E l e m e n t T y p e = " C o l u m n "   E l e m e n t I d = " 1 5 2 9 3 4 8 1 7 1 "   D a t a T y p e = " L a b e l " > C o m p a n y H o m e P a g e _ L b l < / C o m p a n y H o m e P a g e _ L b l > + 
+         < C o m p a n y I B A N   E l e m e n t T y p e = " C o l u m n "   E l e m e n t I d = " 9 0 6 5 4 9 1 8 2 "   D a t a T y p e = " C o d e " > C o m p a n y I B A N < / C o m p a n y I B A N > + 
+         < C o m p a n y I B A N _ L b l   E l e m e n t T y p e = " C o l u m n "   E l e m e n t I d = " 1 2 6 7 9 5 2 2 2 7 "   D a t a T y p e = " S t r i n g " > C o m p a n y I B A N _ L b l < / C o m p a n y I B A N _ L b l > + 
+         < C o m p a n y L e g a l O f f i c e   E l e m e n t T y p e = " C o l u m n "   E l e m e n t I d = " 7 1 4 2 5 8 1 1 1 "   D a t a T y p e = " T e x t " > C o m p a n y L e g a l O f f i c e < / C o m p a n y L e g a l O f f i c e > + 
+         < C o m p a n y L e g a l O f f i c e _ L b l   E l e m e n t T y p e = " C o l u m n "   E l e m e n t I d = " 1 5 3 3 1 7 5 1 0 8 "   D a t a T y p e = " T e x t " > C o m p a n y L e g a l O f f i c e _ L b l < / C o m p a n y L e g a l O f f i c e _ L b l > + 
+         < C o m p a n y L o g o P o s i t i o n   E l e m e n t T y p e = " C o l u m n "   E l e m e n t I d = " 1 4 2 5 2 6 6 6 8 8 "   D a t a T y p e = " I n t e g e r " > C o m p a n y L o g o P o s i t i o n < / C o m p a n y L o g o P o s i t i o n > + 
+         < C o m p a n y P h o n e N o   E l e m e n t T y p e = " C o l u m n "   E l e m e n t I d = " 2 5 0 4 4 0 6 5 5 "   D a t a T y p e = " T e x t " > C o m p a n y P h o n e N o < / C o m p a n y P h o n e N o > + 
+         < C o m p a n y P h o n e N o _ L b l   E l e m e n t T y p e = " C o l u m n "   E l e m e n t I d = " 5 5 8 5 9 3 5 8 6 "   D a t a T y p e = " L a b e l " > C o m p a n y P h o n e N o _ L b l < / C o m p a n y P h o n e N o _ L b l > + 
+         < C o m p a n y P i c t u r e   E l e m e n t T y p e = " C o l u m n "   E l e m e n t I d = " 1 3 9 7 4 1 1 0 7 4 "   D a t a T y p e = " B l o b "   / > + 
+         < C o m p a n y R e g i s t r a t i o n N u m b e r   E l e m e n t T y p e = " C o l u m n "   E l e m e n t I d = " 2 0 2 3 6 3 9 4 2 4 "   D a t a T y p e = " T e x t " > C o m p a n y R e g i s t r a t i o n N u m b e r < / C o m p a n y R e g i s t r a t i o n N u m b e r > + 
+         < C o m p a n y R e g i s t r a t i o n N u m b e r _ L b l   E l e m e n t T y p e = " C o l u m n "   E l e m e n t I d = " 1 8 3 3 1 0 6 6 5 3 "   D a t a T y p e = " T e x t " > C o m p a n y R e g i s t r a t i o n N u m b e r _ L b l < / C o m p a n y R e g i s t r a t i o n N u m b e r _ L b l > + 
+         < C o m p a n y S W I F T   E l e m e n t T y p e = " C o l u m n "   E l e m e n t I d = " 6 6 8 2 5 0 2 4 5 "   D a t a T y p e = " C o d e " > C o m p a n y S W I F T < / C o m p a n y S W I F T > + 
+         < C o m p a n y S W I F T _ L b l   E l e m e n t T y p e = " C o l u m n "   E l e m e n t I d = " 2 0 2 9 5 9 7 3 8 4 "   D a t a T y p e = " S t r i n g " > C o m p a n y S W I F T _ L b l < / C o m p a n y S W I F T _ L b l > + 
+         < C o m p a n y V A T R e g i s t r a t i o n N o   E l e m e n t T y p e = " C o l u m n "   E l e m e n t I d = " 1 9 1 4 0 1 3 6 4 9 "   D a t a T y p e = " T e x t " > C o m p a n y V A T R e g i s t r a t i o n N o < / C o m p a n y V A T R e g i s t r a t i o n N o > + 
+         < C o m p a n y V A T R e g i s t r a t i o n N o _ L b l   E l e m e n t T y p e = " C o l u m n "   E l e m e n t I d = " 9 2 4 5 0 3 1 2 4 "   D a t a T y p e = " T e x t " > C o m p a n y V A T R e g i s t r a t i o n N o _ L b l < / C o m p a n y V A T R e g i s t r a t i o n N o _ L b l > + 
+         < C o m p a n y V A T R e g N o   E l e m e n t T y p e = " C o l u m n "   E l e m e n t I d = " 1 7 1 4 3 1 9 3 6 "   D a t a T y p e = " T e x t " > C o m p a n y V A T R e g N o < / C o m p a n y V A T R e g N o > + 
+         < C o m p a n y V A T R e g N o _ L b l   E l e m e n t T y p e = " C o l u m n "   E l e m e n t I d = " 7 7 3 2 0 1 5 0 1 "   D a t a T y p e = " T e x t " > C o m p a n y V A T R e g N o _ L b l < / C o m p a n y V A T R e g N o _ L b l > + 
+         < C o n f i r m T o C a p t i o n _ L b l   E l e m e n t T y p e = " C o l u m n "   E l e m e n t I d = " 1 7 0 5 6 7 2 8 4 1 "   D a t a T y p e = " L a b e l " > C o n f i r m T o C a p t i o n _ L b l < / C o n f i r m T o C a p t i o n _ L b l > + 
+         < C o n t i n u e d C a p t i o n L b l   E l e m e n t T y p e = " C o l u m n "   E l e m e n t I d = " 1 8 8 9 4 5 4 6 6 8 "   D a t a T y p e = " L a b e l " > C o n t i n u e d C a p t i o n L b l < / C o n t i n u e d C a p t i o n L b l > + 
+         < D i m T e x t   E l e m e n t T y p e = " C o l u m n "   E l e m e n t I d = " 1 7 6 4 8 3 2 3 2 "   D a t a T y p e = " T e x t " > D i m T e x t < / D i m T e x t > + 
+         < D o c T y p e _ P u r c h H e a d e r   E l e m e n t T y p e = " C o l u m n "   E l e m e n t I d = " 1 9 1 3 4 4 6 4 3 3 "   D a t a T y p e = " E n u m " > D o c T y p e _ P u r c h H e a d e r < / D o c T y p e _ P u r c h H e a d e r > + 
+         < D o c u m e n t D a t e   E l e m e n t T y p e = " C o l u m n "   E l e m e n t I d = " 5 5 2 8 7 1 9 1 4 "   D a t a T y p e = " S t r i n g " > D o c u m e n t D a t e < / D o c u m e n t D a t e > + 
+         < D o c u m e n t D a t e _ L b l   E l e m e n t T y p e = " C o l u m n "   E l e m e n t I d = " 1 0 2 6 4 9 4 8 3 "   D a t a T y p e = " L a b e l " > D o c u m e n t D a t e _ L b l < / D o c u m e n t D a t e _ L b l > + 
+         < D o c u m e n t T i t l e _ L b l   E l e m e n t T y p e = " C o l u m n "   E l e m e n t I d = " 8 5 8 4 2 3 9 2 9 "   D a t a T y p e = " L a b e l " > D o c u m e n t T i t l e _ L b l < / D o c u m e n t T i t l e _ L b l > + 
+         < D u e D a t e   E l e m e n t T y p e = " C o l u m n "   E l e m e n t I d = " 7 4 5 1 7 0 2 0 3 "   D a t a T y p e = " S t r i n g " > D u e D a t e < / D u e D a t e > + 
+         < E m a i l I D _ L b l   E l e m e n t T y p e = " C o l u m n "   E l e m e n t I d = " 1 0 8 1 3 5 7 8 8 9 "   D a t a T y p e = " L a b e l " > E m a i l I D _ L b l < / E m a i l I D _ L b l > + 
+         < E x p t R e c p t D t _ P u r c h a s e H e a d e r   E l e m e n t T y p e = " C o l u m n "   E l e m e n t I d = " 7 5 1 5 1 3 9 8 3 "   D a t a T y p e = " S t r i n g " > E x p t R e c p t D t _ P u r c h a s e H e a d e r < / E x p t R e c p t D t _ P u r c h a s e H e a d e r > + 
+         < H o m e P a g e _ L b l   E l e m e n t T y p e = " C o l u m n "   E l e m e n t I d = " 1 4 3 3 5 9 2 3 0 0 "   D a t a T y p e = " L a b e l " > H o m e P a g e _ L b l < / H o m e P a g e _ L b l > + 
+         < I t e m D e s c r i p t i o n _ L b l   E l e m e n t T y p e = " C o l u m n "   E l e m e n t I d = " 8 3 5 8 4 5 8 5 3 "   D a t a T y p e = " L a b e l " > I t e m D e s c r i p t i o n _ L b l < / I t e m D e s c r i p t i o n _ L b l > + 
+         < I t e m L i n e A m o u n t _ L b l   E l e m e n t T y p e = " C o l u m n "   E l e m e n t I d = " 4 8 8 7 0 7 2 7 "   D a t a T y p e = " L a b e l " > I t e m L i n e A m o u n t _ L b l < / I t e m L i n e A m o u n t _ L b l > + 
+         < I t e m N u m b e r _ L b l   E l e m e n t T y p e = " C o l u m n "   E l e m e n t I d = " 1 3 3 2 2 2 5 7 7 4 "   D a t a T y p e = " L a b e l " > I t e m N u m b e r _ L b l < / I t e m N u m b e r _ L b l > + 
+         < I t e m Q u a n t i t y _ L b l   E l e m e n t T y p e = " C o l u m n "   E l e m e n t I d = " 1 8 0 2 5 9 1 7 6 6 "   D a t a T y p e = " L a b e l " > I t e m Q u a n t i t y _ L b l < / I t e m Q u a n t i t y _ L b l > + 
+         < I t e m U n i t P r i c e _ L b l   E l e m e n t T y p e = " C o l u m n "   E l e m e n t I d = " 4 6 6 8 5 2 9 8 "   D a t a T y p e = " L a b e l " > I t e m U n i t P r i c e _ L b l < / I t e m U n i t P r i c e _ L b l > + 
+         < I t e m U n i t _ L b l   E l e m e n t T y p e = " C o l u m n "   E l e m e n t I d = " 1 9 8 1 4 0 3 7 7 3 "   D a t a T y p e = " L a b e l " > I t e m U n i t _ L b l < / I t e m U n i t _ L b l > + 
+         < N o _ P u r c h H e a d e r   E l e m e n t T y p e = " C o l u m n "   E l e m e n t I d = " 5 2 0 3 3 9 3 5 2 "   D a t a T y p e = " C o d e " > N o _ P u r c h H e a d e r < / N o _ P u r c h H e a d e r > + 
+         < O r d e r D a t e n L b l   E l e m e n t T y p e = " C o l u m n "   E l e m e n t I d = " 6 8 6 5 0 6 1 8 9 "   D a t a T y p e = " L a b e l " > O r d e r D a t e n L b l < / O r d e r D a t e n L b l > + 
+         < O r d e r D a t e _ L b l   E l e m e n t T y p e = " C o l u m n "   E l e m e n t I d = " 4 1 7 6 9 0 3 9 8 "   D a t a T y p e = " L a b e l " > O r d e r D a t e _ L b l < / O r d e r D a t e _ L b l > + 
+         < O r d e r D a t e _ P u r c h a s e H e a d e r   E l e m e n t T y p e = " C o l u m n "   E l e m e n t I d = " 1 1 1 9 3 3 8 5 4 0 "   D a t a T y p e = " S t r i n g " > O r d e r D a t e _ P u r c h a s e H e a d e r < / O r d e r D a t e _ P u r c h a s e H e a d e r > + 
+         < O r d e r N o _ L b l   E l e m e n t T y p e = " C o l u m n "   E l e m e n t I d = " 1 9 9 1 0 6 2 5 2 9 "   D a t a T y p e = " L a b e l " > O r d e r N o _ L b l < / O r d e r N o _ L b l > + 
+         < O u t p u t N o   E l e m e n t T y p e = " C o l u m n "   E l e m e n t I d = " 1 5 2 4 6 3 6 1 8 1 "   D a t a T y p e = " I n t e g e r " > O u t p u t N o < / O u t p u t N o > + 
+         < O u t s t a n d i n g L b l   E l e m e n t T y p e = " C o l u m n "   E l e m e n t I d = " 2 1 0 0 6 5 8 0 8 3 "   D a t a T y p e = " L a b e l " > O u t s t a n d i n g L b l < / O u t s t a n d i n g L b l > + 
+         < P a g e L b l   E l e m e n t T y p e = " C o l u m n "   E l e m e n t I d = " 2 7 0 2 9 6 3 3 2 "   D a t a T y p e = " L a b e l " > P a g e L b l < / P a g e L b l > + 
+         < P a g e _ L b l   E l e m e n t T y p e = " C o l u m n "   E l e m e n t I d = " 6 8 0 6 4 8 0 9 1 "   D a t a T y p e = " L a b e l " > P a g e _ L b l < / P a g e _ L b l > + 
+         < P a y m e n t D e t a i l s _ L b l   E l e m e n t T y p e = " C o l u m n "   E l e m e n t I d = " 1 0 2 9 7 4 8 9 9 2 "   D a t a T y p e = " L a b e l " > P a y m e n t D e t a i l s _ L b l < / P a y m e n t D e t a i l s _ L b l > + 
+         < P a y m e n t T e r m s D e s c _ L b l   E l e m e n t T y p e = " C o l u m n "   E l e m e n t I d = " 1 4 3 7 8 0 9 5 6 2 "   D a t a T y p e = " L a b e l " > P a y m e n t T e r m s D e s c _ L b l < / P a y m e n t T e r m s D e s c _ L b l > + 
+         < P a y T o C o n t a c t E m a i l   E l e m e n t T y p e = " C o l u m n "   E l e m e n t I d = " 1 9 8 4 8 9 3 3 1 0 "   D a t a T y p e = " T e x t " > P a y T o C o n t a c t E m a i l < / P a y T o C o n t a c t E m a i l > + 
+         < P a y T o C o n t a c t E m a i l L b l   E l e m e n t T y p e = " C o l u m n "   E l e m e n t I d = " 6 8 4 6 8 8 4 8 "   D a t a T y p e = " L a b e l " > P a y T o C o n t a c t E m a i l L b l < / P a y T o C o n t a c t E m a i l L b l > + 
+         < P a y T o C o n t a c t M o b i l e P h o n e N o   E l e m e n t T y p e = " C o l u m n "   E l e m e n t I d = " 1 9 0 1 4 6 6 0 5 "   D a t a T y p e = " T e x t " > P a y T o C o n t a c t M o b i l e P h o n e N o < / P a y T o C o n t a c t M o b i l e P h o n e N o > + 
+         < P a y T o C o n t a c t M o b i l e P h o n e N o L b l   E l e m e n t T y p e = " C o l u m n "   E l e m e n t I d = " 1 2 5 4 4 4 0 0 8 9 "   D a t a T y p e = " L a b e l " > P a y T o C o n t a c t M o b i l e P h o n e N o L b l < / P a y T o C o n t a c t M o b i l e P h o n e N o L b l > + 
+         < P a y T o C o n t a c t P h o n e N o   E l e m e n t T y p e = " C o l u m n "   E l e m e n t I d = " 1 9 2 3 7 9 6 7 0 9 "   D a t a T y p e = " T e x t " > P a y T o C o n t a c t P h o n e N o < / P a y T o C o n t a c t P h o n e N o > + 
+         < P a y T o C o n t a c t P h o n e N o L b l   E l e m e n t T y p e = " C o l u m n "   E l e m e n t I d = " 2 9 3 4 6 1 0 8 7 "   D a t a T y p e = " L a b e l " > P a y T o C o n t a c t P h o n e N o L b l < / P a y T o C o n t a c t P h o n e N o L b l > + 
+         < P a y T o V e n d N o _ P u r c h H e a d e r   E l e m e n t T y p e = " C o l u m n "   E l e m e n t I d = " 6 3 5 5 6 4 4 9 8 "   D a t a T y p e = " C o d e " > P a y T o V e n d N o _ P u r c h H e a d e r < / P a y T o V e n d N o _ P u r c h H e a d e r > + 
+         < P r e p m t P a y m e n t T e r m s D e s c   E l e m e n t T y p e = " C o l u m n "   E l e m e n t I d = " 4 2 9 7 6 4 9 1 "   D a t a T y p e = " T e x t " > P r e p m t P a y m e n t T e r m s D e s c < / P r e p m t P a y m e n t T e r m s D e s c > + 
+         < P r e p y m t T e r m s D e s c _ L b l   E l e m e n t T y p e = " C o l u m n "   E l e m e n t I d = " 1 8 4 2 9 3 9 4 8 5 "   D a t a T y p e = " L a b e l " > P r e p y m t T e r m s D e s c _ L b l < / P r e p y m t T e r m s D e s c _ L b l > + 
+         < P r i c e s I n c l u d i n g V A T _ L b l   E l e m e n t T y p e = " C o l u m n "   E l e m e n t I d = " 1 3 7 7 9 7 9 4 4 4 "   D a t a T y p e = " L a b e l " > P r i c e s I n c l u d i n g V A T _ L b l < / P r i c e s I n c l u d i n g V A T _ L b l > + 
+         < P r i c e s I n c l V A T t x t   E l e m e n t T y p e = " C o l u m n "   E l e m e n t I d = " 1 1 2 3 7 2 4 4 4 8 "   D a t a T y p e = " L a b e l " > P r i c e s I n c l V A T t x t < / P r i c e s I n c l V A T t x t > + 
+         < P r i c e s I n c l V A T _ P u r c h H e a d e r   E l e m e n t T y p e = " C o l u m n "   E l e m e n t I d = " 1 8 0 5 5 0 7 9 8 0 "   D a t a T y p e = " B o o l e a n " > P r i c e s I n c l V A T _ P u r c h H e a d e r < / P r i c e s I n c l V A T _ P u r c h H e a d e r > + 
+         < P r i c e s I n c l V A T _ P u r c h H e a d e r _ L b l   E l e m e n t T y p e = " C o l u m n "   E l e m e n t I d = " 1 7 9 9 5 0 1 7 4 3 "   D a t a T y p e = " S t r i n g " > P r i c e s I n c l V A T _ P u r c h H e a d e r _ L b l < / P r i c e s I n c l V A T _ P u r c h H e a d e r _ L b l > + 
+         < P u r c h a s e r T e x t   E l e m e n t T y p e = " C o l u m n "   E l e m e n t I d = " 1 2 9 1 4 2 3 8 3 3 "   D a t a T y p e = " T e x t " > P u r c h a s e r T e x t < / P u r c h a s e r T e x t > + 
+         < P u r c h L i n e I n v D i s c A m t _ L b l   E l e m e n t T y p e = " C o l u m n "   E l e m e n t I d = " 9 2 6 7 0 5 4 6 2 "   D a t a T y p e = " L a b e l " > P u r c h L i n e I n v D i s c A m t _ L b l < / P u r c h L i n e I n v D i s c A m t _ L b l > + 
+         < P u r c h O r d e r C a p t i o n _ L b l   E l e m e n t T y p e = " C o l u m n "   E l e m e n t I d = " 6 3 3 7 2 3 3 7 2 "   D a t a T y p e = " L a b e l " > P u r c h O r d e r C a p t i o n _ L b l < / P u r c h O r d e r C a p t i o n _ L b l > + 
+         < P u r c h O r d e r D a t e C a p t i o n _ L b l   E l e m e n t T y p e = " C o l u m n "   E l e m e n t I d = " 1 6 3 4 1 8 6 4 0 "   D a t a T y p e = " L a b e l " > P u r c h O r d e r D a t e C a p t i o n _ L b l < / P u r c h O r d e r D a t e C a p t i o n _ L b l > + 
+         < P u r c h O r d e r N u m C a p t i o n _ L b l   E l e m e n t T y p e = " C o l u m n "   E l e m e n t I d = " 4 6 4 1 4 9 4 5 4 "   D a t a T y p e = " L a b e l " > P u r c h O r d e r N u m C a p t i o n _ L b l < / P u r c h O r d e r N u m C a p t i o n _ L b l > + 
+         < R e c e i v e b y _ L b l   E l e m e n t T y p e = " C o l u m n "   E l e m e n t I d = " 9 4 4 0 6 3 6 8 "   D a t a T y p e = " L a b e l " > R e c e i v e b y _ L b l < / R e c e i v e b y _ L b l > + 
+         < R e f e r e n c e T e x t   E l e m e n t T y p e = " C o l u m n "   E l e m e n t I d = " 4 4 5 3 5 3 4 5 1 "   D a t a T y p e = " T e x t " > R e f e r e n c e T e x t < / R e f e r e n c e T e x t > + 
+         < S a l e s P u r c h P e r s o n N a m e   E l e m e n t T y p e = " C o l u m n "   E l e m e n t I d = " 1 3 7 3 7 6 8 5 5 7 "   D a t a T y p e = " T e x t " > S a l e s P u r c h P e r s o n N a m e < / S a l e s P u r c h P e r s o n N a m e > + 
+         < S e l l T o C u s t N o _ P u r c h H e a d e r   E l e m e n t T y p e = " C o l u m n "   E l e m e n t I d = " 9 6 4 8 7 3 2 0 4 "   D a t a T y p e = " C o d e " > S e l l T o C u s t N o _ P u r c h H e a d e r < / S e l l T o C u s t N o _ P u r c h H e a d e r > + 
+         < S e l l T o C u s t N o _ P u r c h H e a d e r _ L b l   E l e m e n t T y p e = " C o l u m n "   E l e m e n t I d = " 1 9 3 1 5 7 0 8 9 7 "   D a t a T y p e = " S t r i n g " > S e l l T o C u s t N o _ P u r c h H e a d e r _ L b l < / S e l l T o C u s t N o _ P u r c h H e a d e r _ L b l > + 
+         < S h i p m e n t M e t h o d D e s c   E l e m e n t T y p e = " C o l u m n "   E l e m e n t I d = " 6 8 6 3 4 3 1 7 9 "   D a t a T y p e = " T e x t " > S h i p m e n t M e t h o d D e s c < / S h i p m e n t M e t h o d D e s c > + 
+         < S h i p m e n t M e t h o d D e s c _ L b l   E l e m e n t T y p e = " C o l u m n "   E l e m e n t I d = " 5 7 9 9 0 1 3 6 6 "   D a t a T y p e = " L a b e l " > S h i p m e n t M e t h o d D e s c _ L b l < / S h i p m e n t M e t h o d D e s c _ L b l > + 
+         < S h i p T o A d d r 1   E l e m e n t T y p e = " C o l u m n "   E l e m e n t I d = " 5 1 2 9 7 9 8 5 0 "   D a t a T y p e = " T e x t " > S h i p T o A d d r 1 < / S h i p T o A d d r 1 > + 
+         < S h i p T o A d d r 2   E l e m e n t T y p e = " C o l u m n "   E l e m e n t I d = " 1 1 5 0 6 7 6 4 6 7 "   D a t a T y p e = " T e x t " > S h i p T o A d d r 2 < / S h i p T o A d d r 2 > + 
+         < S h i p T o A d d r 3   E l e m e n t T y p e = " C o l u m n "   E l e m e n t I d = " 1 7 8 8 3 7 3 0 8 4 "   D a t a T y p e = " T e x t " > S h i p T o A d d r 3 < / S h i p T o A d d r 3 > + 
+         < S h i p T o A d d r 4   E l e m e n t T y p e = " C o l u m n "   E l e m e n t I d = " 1 8 6 8 8 9 7 5 9 5 "   D a t a T y p e = " T e x t " > S h i p T o A d d r 4 < / S h i p T o A d d r 4 > + 
+         < S h i p T o A d d r 5   E l e m e n t T y p e = " C o l u m n "   E l e m e n t I d = " 1 2 3 1 2 0 0 9 7 8 "   D a t a T y p e = " T e x t " > S h i p T o A d d r 5 < / S h i p T o A d d r 5 > + 
+         < S h i p T o A d d r 6   E l e m e n t T y p e = " C o l u m n "   E l e m e n t I d = " 5 9 3 5 0 4 3 6 1 "   D a t a T y p e = " T e x t " > S h i p T o A d d r 6 < / S h i p T o A d d r 6 > + 
+         < S h i p T o A d d r 7   E l e m e n t T y p e = " C o l u m n "   E l e m e n t I d = " 4 4 1 9 2 2 5 6 "   D a t a T y p e = " T e x t " > S h i p T o A d d r 7 < / S h i p T o A d d r 7 > + 
+         < S h i p T o A d d r 8   E l e m e n t T y p e = " C o l u m n "   E l e m e n t I d = " 9 3 1 3 2 2 4 0 7 "   D a t a T y p e = " T e x t " > S h i p T o A d d r 8 < / S h i p T o A d d r 8 > + 
+         < S h i p t o A d d r e s s _ L b l   E l e m e n t T y p e = " C o l u m n "   E l e m e n t I d = " 1 0 4 3 5 1 9 5 7 7 "   D a t a T y p e = " L a b e l " > S h i p t o A d d r e s s _ L b l < / S h i p t o A d d r e s s _ L b l > + 
+         < S u b c A d d r I n f o L i n e   E l e m e n t T y p e = " C o l u m n "   E l e m e n t I d = " 1 0 0 9 4 5 5 3 8 3 "   D a t a T y p e = " T e x t " > S u b c A d d r I n f o L i n e < / S u b c A d d r I n f o L i n e > + 
+         < S u b c A m o u n t C a p t i o n L b l   E l e m e n t T y p e = " C o l u m n "   E l e m e n t I d = " 1 1 2 8 0 9 4 5 5 8 "   D a t a T y p e = " L a b e l " > S u b c A m o u n t C a p t i o n L b l < / S u b c A m o u n t C a p t i o n L b l > + 
+         < S u b c B a r c o d e B a s e   E l e m e n t T y p e = " C o l u m n "   E l e m e n t I d = " 7 0 5 6 0 9 3 7 1 "   D a t a T y p e = " B l o b "   / > + 
+         < S u b c C o m p a n y A d d r e s s 1   E l e m e n t T y p e = " C o l u m n "   E l e m e n t I d = " 1 8 9 3 8 9 9 8 5 4 "   D a t a T y p e = " T e x t " > S u b c C o m p a n y A d d r e s s 1 < / S u b c C o m p a n y A d d r e s s 1 > + 
+         < S u b c C o m p a n y A d d r e s s 2   E l e m e n t T y p e = " C o l u m n "   E l e m e n t I d = " 1 7 6 3 3 7 0 8 2 5 "   D a t a T y p e = " T e x t " > S u b c C o m p a n y A d d r e s s 2 < / S u b c C o m p a n y A d d r e s s 2 > + 
+         < S u b c C o m p a n y A d d r e s s 3   E l e m e n t T y p e = " C o l u m n "   E l e m e n t I d = " 1 1 2 5 6 7 4 2 0 8 "   D a t a T y p e = " T e x t " > S u b c C o m p a n y A d d r e s s 3 < / S u b c C o m p a n y A d d r e s s 3 > + 
+         < S u b c C o m p a n y A d d r e s s 4   E l e m e n t T y p e = " C o l u m n "   E l e m e n t I d = " 1 2 9 4 5 8 3 2 3 1 "   D a t a T y p e = " T e x t " > S u b c C o m p a n y A d d r e s s 4 < / S u b c C o m p a n y A d d r e s s 4 > + 
+         < S u b c C o m p a n y B a n k N a m e   E l e m e n t T y p e = " C o l u m n "   E l e m e n t I d = " 7 2 9 7 1 5 4 9 2 "   D a t a T y p e = " T e x t " > S u b c C o m p a n y B a n k N a m e < / S u b c C o m p a n y B a n k N a m e > + 
+         < S u b c C o m p a n y B a n k N a m e _ L b l   E l e m e n t T y p e = " C o l u m n "   E l e m e n t I d = " 8 9 7 6 7 7 6 2 5 "   D a t a T y p e = " T e x t " > S u b c C o m p a n y B a n k N a m e _ L b l < / S u b c C o m p a n y B a n k N a m e _ L b l > + 
+         < S u b c C o m p a n y E M a i l   E l e m e n t T y p e = " C o l u m n "   E l e m e n t I d = " 1 8 0 8 6 8 5 5 1 9 "   D a t a T y p e = " T e x t " > S u b c C o m p a n y E M a i l < / S u b c C o m p a n y E M a i l > + 
+         < S u b c C o m p a n y H o m e P a g e   E l e m e n t T y p e = " C o l u m n "   E l e m e n t I d = " 1 1 2 9 4 2 4 5 8 5 "   D a t a T y p e = " T e x t " > S u b c C o m p a n y H o m e P a g e < / S u b c C o m p a n y H o m e P a g e > + 
+         < S u b c C o m p a n y I B A N   E l e m e n t T y p e = " C o l u m n "   E l e m e n t I d = " 5 6 0 0 6 2 7 8 3 "   D a t a T y p e = " T e x t " > S u b c C o m p a n y I B A N < / S u b c C o m p a n y I B A N > + 
+         < S u b c C o m p a n y I B A N _ L b l   E l e m e n t T y p e = " C o l u m n "   E l e m e n t I d = " 1 4 8 7 1 1 8 3 9 6 "   D a t a T y p e = " T e x t " > S u b c C o m p a n y I B A N _ L b l < / S u b c C o m p a n y I B A N _ L b l > + 
+         < S u b c C o m p a n y I n f o 1 P i c t u r e   E l e m e n t T y p e = " C o l u m n "   E l e m e n t I d = " 1 0 5 2 1 8 7 7 9 8 "   D a t a T y p e = " B l o b "   / > + 
+         < S u b c C o m p a n y I n f o 2 P i c t u r e   E l e m e n t T y p e = " C o l u m n "   E l e m e n t I d = " 6 3 9 9 3 6 3 7 "   D a t a T y p e = " B l o b "   / > + 
+         < S u b c C o m p a n y I n f o C o u r t L o c a t i o n   E l e m e n t T y p e = " C o l u m n "   E l e m e n t I d = " 2 8 0 0 6 5 2 3 3 "   D a t a T y p e = " T e x t " > S u b c C o m p a n y I n f o C o u r t L o c a t i o n < / S u b c C o m p a n y I n f o C o u r t L o c a t i o n > + 
+         < S u b c C o m p a n y I n f o E x e c u t i v e D i r e c t o r 1   E l e m e n t T y p e = " C o l u m n "   E l e m e n t I d = " 6 3 0 1 1 2 1 5 8 "   D a t a T y p e = " T e x t " > S u b c C o m p a n y I n f o E x e c u t i v e D i r e c t o r 1 < / S u b c C o m p a n y I n f o E x e c u t i v e D i r e c t o r 1 > + 
+         < S u b c C o m p a n y I n f o E x e c u t i v e D i r e c t o r 2   E l e m e n t T y p e = " C o l u m n "   E l e m e n t I d = " 1 2 6 7 8 0 8 7 7 5 "   D a t a T y p e = " T e x t " > S u b c C o m p a n y I n f o E x e c u t i v e D i r e c t o r 2 < / S u b c C o m p a n y I n f o E x e c u t i v e D i r e c t o r 2 > + 
+         < S u b c C o m p a n y I n f o E x e c u t i v e D i r e c t o r 3   E l e m e n t T y p e = " C o l u m n "   E l e m e n t I d = " 1 9 0 5 5 0 5 3 9 2 "   D a t a T y p e = " T e x t " > S u b c C o m p a n y I n f o E x e c u t i v e D i r e c t o r 3 < / S u b c C o m p a n y I n f o E x e c u t i v e D i r e c t o r 3 > + 
+         < S u b c C o m p a n y I n f o E x e c u t i v e D i r e c t o r 4   E l e m e n t T y p e = " C o l u m n "   E l e m e n t I d = " 1 7 3 6 5 9 6 3 6 9 "   D a t a T y p e = " T e x t " > S u b c C o m p a n y I n f o E x e c u t i v e D i r e c t o r 4 < / S u b c C o m p a n y I n f o E x e c u t i v e D i r e c t o r 4 > + 
+         < S u b c C o m p a n y I n f o F a x L b l   E l e m e n t T y p e = " C o l u m n "   E l e m e n t I d = " 1 6 8 2 9 0 8 1 0 "   D a t a T y p e = " T e x t " > S u b c C o m p a n y I n f o F a x L b l < / S u b c C o m p a n y I n f o F a x L b l > + 
+         < S u b c C o m p a n y I n f o F a x N o   E l e m e n t T y p e = " C o l u m n "   E l e m e n t I d = " 1 2 8 1 1 3 2 1 3 "   D a t a T y p e = " T e x t " > S u b c C o m p a n y I n f o F a x N o < / S u b c C o m p a n y I n f o F a x N o > + 
+         < S u b c C o m p a n y I n f o P h o n e N o L b l   E l e m e n t T y p e = " C o l u m n "   E l e m e n t I d = " 4 5 4 6 4 4 1 8 0 "   D a t a T y p e = " T e x t " > S u b c C o m p a n y I n f o P h o n e N o L b l < / S u b c C o m p a n y I n f o P h o n e N o L b l > + 
+         < S u b c C o m p a n y I n f o P i c t u r e   E l e m e n t T y p e = " C o l u m n "   E l e m e n t I d = " 1 7 1 6 9 3 2 0 4 9 "   D a t a T y p e = " B l o b "   / > + 
+         < S u b c C o m p a n y I n f o R e g i s t e r C o u r t N o   E l e m e n t T y p e = " C o l u m n "   E l e m e n t I d = " 1 7 5 2 9 6 9 6 1 2 "   D a t a T y p e = " T e x t " > S u b c C o m p a n y I n f o R e g i s t e r C o u r t N o < / S u b c C o m p a n y I n f o R e g i s t e r C o u r t N o > + 
+         < S u b c C o m p a n y P h o n e N o   E l e m e n t T y p e = " C o l u m n "   E l e m e n t I d = " 5 5 3 5 7 6 2 1 6 "   D a t a T y p e = " T e x t " > S u b c C o m p a n y P h o n e N o < / S u b c C o m p a n y P h o n e N o > + 
+         < S u b c C o m p a n y P h o n e N o _ L b l   E l e m e n t T y p e = " C o l u m n "   E l e m e n t I d = " 5 7 2 3 2 0 5 "   D a t a T y p e = " T e x t " > S u b c C o m p a n y P h o n e N o _ L b l < / S u b c C o m p a n y P h o n e N o _ L b l > + 
+         < S u b c C o m p a n y S W I F T   E l e m e n t T y p e = " C o l u m n "   E l e m e n t I d = " 2 2 9 7 9 1 8 4 2 "   D a t a T y p e = " T e x t " > S u b c C o m p a n y S W I F T < / S u b c C o m p a n y S W I F T > + 
+         < S u b c C o m p a n y S W I F T _ L b l   E l e m e n t T y p e = " C o l u m n "   E l e m e n t I d = " 9 2 1 2 7 1 8 0 9 "   D a t a T y p e = " T e x t " > S u b c C o m p a n y S W I F T _ L b l < / S u b c C o m p a n y S W I F T _ L b l > + 
+         < S u b c C o m p a n y V A T R e g i s t r a t i o n N o   E l e m e n t T y p e = " C o l u m n "   E l e m e n t I d = " 1 5 3 5 8 1 2 0 6 "   D a t a T y p e = " T e x t " > S u b c C o m p a n y V A T R e g i s t r a t i o n N o < / S u b c C o m p a n y V A T R e g i s t r a t i o n N o > + 
+         < S u b c C o m p a n y V A T R e g i s t r a t i o n N o _ L b l   E l e m e n t T y p e = " C o l u m n "   E l e m e n t I d = " 1 1 0 7 2 4 6 3 4 7 "   D a t a T y p e = " T e x t " > S u b c C o m p a n y V A T R e g i s t r a t i o n N o _ L b l < / S u b c C o m p a n y V A T R e g i s t r a t i o n N o _ L b l > + 
+         < S u b c C o m p a n y V A T R e g N o _ L b l   E l e m e n t T y p e = " C o l u m n "   E l e m e n t I d = " 7 2 5 9 1 4 5 6 2 "   D a t a T y p e = " T e x t " > S u b c C o m p a n y V A T R e g N o _ L b l < / S u b c C o m p a n y V A T R e g N o _ L b l > + 
+         < S u b c C o u r t L o c a t i o n L b l   E l e m e n t T y p e = " C o l u m n "   E l e m e n t I d = " 1 0 9 1 2 0 4 7 4 "   D a t a T y p e = " T e x t " > S u b c C o u r t L o c a t i o n L b l < / S u b c C o u r t L o c a t i o n L b l > + 
+         < S u b c D o c C a p t i o n L b l   E l e m e n t T y p e = " C o l u m n "   E l e m e n t I d = " 7 3 8 7 7 2 6 2 2 "   D a t a T y p e = " L a b e l " > S u b c D o c C a p t i o n L b l < / S u b c D o c C a p t i o n L b l > + 
+         < S u b c D o c u m e n t D a t e   E l e m e n t T y p e = " C o l u m n "   E l e m e n t I d = " 1 1 3 9 5 4 7 1 "   D a t a T y p e = " S t r i n g " > S u b c D o c u m e n t D a t e < / S u b c D o c u m e n t D a t e > + 
+         < S u b c D o c u m e n t D a t e L b l   E l e m e n t T y p e = " C o l u m n "   E l e m e n t I d = " 1 3 6 6 2 2 7 2 1 1 "   D a t a T y p e = " L a b e l " > S u b c D o c u m e n t D a t e L b l < / S u b c D o c u m e n t D a t e L b l > + 
+         < S u b c D u e D a t e   E l e m e n t T y p e = " C o l u m n "   E l e m e n t I d = " 1 2 9 8 7 0 3 2 5 4 "   D a t a T y p e = " S t r i n g " > S u b c D u e D a t e < / S u b c D u e D a t e > + 
+         < S u b c E M a i l _ L b l   E l e m e n t T y p e = " C o l u m n "   E l e m e n t I d = " 1 2 3 2 8 1 2 2 8 5 "   D a t a T y p e = " T e x t " > S u b c E M a i l _ L b l < / S u b c E M a i l _ L b l > + 
+         < S u b c E x e c u t i v e D i r e c t o r s L b l   E l e m e n t T y p e = " C o l u m n "   E l e m e n t I d = " 2 1 0 2 0 0 4 0 4 3 "   D a t a T y p e = " T e x t " > S u b c E x e c u t i v e D i r e c t o r s L b l < / S u b c E x e c u t i v e D i r e c t o r s L b l > + 
+         < S u b c E x t e r n a l D o c u m e n t N o C a p t i o n L b l   E l e m e n t T y p e = " C o l u m n "   E l e m e n t I d = " 1 6 6 9 9 6 1 7 6 5 "   D a t a T y p e = " L a b e l " > S u b c E x t e r n a l D o c u m e n t N o C a p t i o n L b l < / S u b c E x t e r n a l D o c u m e n t N o C a p t i o n L b l > + 
+         < S u b c F o o t e r M a r k   E l e m e n t T y p e = " C o l u m n "   E l e m e n t I d = " 4 9 4 1 4 4 9 0 2 "   D a t a T y p e = " T e x t " > S u b c F o o t e r M a r k < / S u b c F o o t e r M a r k > + 
+         < S u b c H e a d e r M a r k   E l e m e n t T y p e = " C o l u m n "   E l e m e n t I d = " 1 0 2 8 6 5 8 1 2 8 "   D a t a T y p e = " T e x t " > S u b c H e a d e r M a r k < / S u b c H e a d e r M a r k > + 
+         < S u b c H e a d e r P h o n e N o   E l e m e n t T y p e = " C o l u m n "   E l e m e n t I d = " 1 0 8 0 3 7 8 9 2 0 "   D a t a T y p e = " T e x t " > S u b c H e a d e r P h o n e N o < / S u b c H e a d e r P h o n e N o > + 
+         < S u b c H e a d e r P h o n e N o L b l   E l e m e n t T y p e = " C o l u m n "   E l e m e n t I d = " 1 9 1 7 5 3 6 6 9 8 "   D a t a T y p e = " L a b e l " > S u b c H e a d e r P h o n e N o L b l < / S u b c H e a d e r P h o n e N o L b l > + 
+         < S u b c H o m e P a g e _ L b l   E l e m e n t T y p e = " C o l u m n "   E l e m e n t I d = " 1 6 9 1 8 3 9 0 7 5 "   D a t a T y p e = " T e x t " > S u b c H o m e P a g e _ L b l < / S u b c H o m e P a g e _ L b l > + 
+         < S u b c I n v D i s c A m o u n t   E l e m e n t T y p e = " C o l u m n "   E l e m e n t I d = " 3 6 2 0 6 0 3 6 2 "   D a t a T y p e = " T e x t " > S u b c I n v D i s c A m o u n t < / S u b c I n v D i s c A m o u n t > + 
+         < S u b c I n v D i s c A m t C a p t i o n L b l   E l e m e n t T y p e = " C o l u m n "   E l e m e n t I d = " 8 4 7 9 6 3 3 1 8 "   D a t a T y p e = " T e x t " > S u b c I n v D i s c A m t C a p t i o n L b l < / S u b c I n v D i s c A m t C a p t i o n L b l > + 
+         < S u b c O f F o r P a g e L b l   E l e m e n t T y p e = " C o l u m n "   E l e m e n t I d = " 4 8 1 0 1 4 7 3 "   D a t a T y p e = " L a b e l " > S u b c O f F o r P a g e L b l < / S u b c O f F o r P a g e L b l > + 
+         < S u b c o n t r a c t o r D i s p a t c h L i s t L b l   E l e m e n t T y p e = " C o l u m n "   E l e m e n t I d = " 1 0 4 6 4 6 0 7 0 2 "   D a t a T y p e = " L a b e l " > S u b c o n t r a c t o r D i s p a t c h L i s t L b l < / S u b c o n t r a c t o r D i s p a t c h L i s t L b l > + 
+         < S u b c o n t r a c t o r L b l   E l e m e n t T y p e = " C o l u m n "   E l e m e n t I d = " 1 3 9 9 4 5 9 1 2 4 "   D a t a T y p e = " L a b e l " > S u b c o n t r a c t o r L b l < / S u b c o n t r a c t o r L b l > + 
+         < S u b c O r d e r N o C a p t i o n L b l   E l e m e n t T y p e = " C o l u m n "   E l e m e n t I d = " 7 6 3 4 9 9 6 9 5 "   D a t a T y p e = " L a b e l " > S u b c O r d e r N o C a p t i o n L b l < / S u b c O r d e r N o C a p t i o n L b l > + 
+         < S u b c O r d e r _ D a t e   E l e m e n t T y p e = " C o l u m n "   E l e m e n t I d = " 9 9 1 2 1 3 0 1 7 "   D a t a T y p e = " S t r i n g " > S u b c O r d e r _ D a t e < / S u b c O r d e r _ D a t e > + 
+         < S u b c O r d N o L b l   E l e m e n t T y p e = " C o l u m n "   E l e m e n t I d = " 9 0 4 4 0 0 5 0 4 "   D a t a T y p e = " L a b e l " > S u b c O r d N o L b l < / S u b c O r d N o L b l > + 
+         < S u b c P a g e L b l   E l e m e n t T y p e = " C o l u m n "   E l e m e n t I d = " 1 6 2 4 9 6 5 4 4 5 "   D a t a T y p e = " L a b e l " > S u b c P a g e L b l < / S u b c P a g e L b l > + 
+         < S u b c P a y m e n t T e r m s D e s c r i p t i o n L b l   E l e m e n t T y p e = " C o l u m n "   E l e m e n t I d = " 1 9 0 4 6 2 6 2 4 9 "   D a t a T y p e = " T e x t " > S u b c P a y m e n t T e r m s D e s c r i p t i o n L b l < / S u b c P a y m e n t T e r m s D e s c r i p t i o n L b l > + 
+         < S u b c P r i n t A d d r e s s L i n e   E l e m e n t T y p e = " C o l u m n "   E l e m e n t I d = " 1 0 7 3 1 6 2 8 0 3 "   D a t a T y p e = " B o o l e a n " > S u b c P r i n t A d d r e s s L i n e < / S u b c P r i n t A d d r e s s L i n e > + 
+         < S u b c P r i n t B a r C o d e   E l e m e n t T y p e = " C o l u m n "   E l e m e n t I d = " 4 6 3 3 8 1 6 4 9 "   D a t a T y p e = " B o o l e a n " > S u b c P r i n t B a r C o d e < / S u b c P r i n t B a r C o d e > + 
+         < S u b c P r i n t F o o t e r L i n e   E l e m e n t T y p e = " C o l u m n "   E l e m e n t I d = " 9 6 6 7 4 8 3 9 2 "   D a t a T y p e = " B o o l e a n " > S u b c P r i n t F o o t e r L i n e < / S u b c P r i n t F o o t e r L i n e > + 
+         < S u b c P r o m i s e d D e l i v e r y D a t e L b l   E l e m e n t T y p e = " C o l u m n "   E l e m e n t I d = " 1 7 3 6 6 5 5 4 9 9 "   D a t a T y p e = " L a b e l " > S u b c P r o m i s e d D e l i v e r y D a t e L b l < / S u b c P r o m i s e d D e l i v e r y D a t e L b l > + 
+         < S u b c P u r c h D o c N u m   E l e m e n t T y p e = " C o l u m n "   E l e m e n t I d = " 4 6 3 0 2 3 5 6 8 "   D a t a T y p e = " C o d e " > S u b c P u r c h D o c N u m < / S u b c P u r c h D o c N u m > + 
+         < S u b c P u r c h D o c N u m L b l   E l e m e n t T y p e = " C o l u m n "   E l e m e n t I d = " 5 0 2 7 0 4 5 5 8 "   D a t a T y p e = " L a b e l " > S u b c P u r c h D o c N u m L b l < / S u b c P u r c h D o c N u m L b l > + 
+         < S u b c R e g i s t e r C o u r t N o L b l   E l e m e n t T y p e = " C o l u m n "   E l e m e n t I d = " 4 7 4 4 2 9 6 8 1 "   D a t a T y p e = " T e x t " > S u b c R e g i s t e r C o u r t N o L b l < / S u b c R e g i s t e r C o u r t N o L b l > + 
+         < S u b c S a l e s L i n e L i n e D i s c o u n t L b l   E l e m e n t T y p e = " C o l u m n "   E l e m e n t I d = " 1 0 0 9 5 4 9 3 6 5 "   D a t a T y p e = " L a b e l " > S u b c S a l e s L i n e L i n e D i s c o u n t L b l < / S u b c S a l e s L i n e L i n e D i s c o u n t L b l > + 
+         < S u b c S a l e s p e r s o n   E l e m e n t T y p e = " C o l u m n "   E l e m e n t I d = " 1 7 0 8 9 4 8 1 9 1 "   D a t a T y p e = " T e x t " > S u b c S a l e s p e r s o n < / S u b c S a l e s p e r s o n > + 
+         < S u b c S a l e s P e r s o n E m a i l   E l e m e n t T y p e = " C o l u m n "   E l e m e n t I d = " 1 8 6 7 8 0 7 7 9 7 "   D a t a T y p e = " T e x t " > S u b c S a l e s P e r s o n E m a i l < / S u b c S a l e s P e r s o n E m a i l > + 
+         < S u b c S a l e s p e r s o n L b l   E l e m e n t T y p e = " C o l u m n "   E l e m e n t I d = " 1 7 7 0 7 7 5 1 6 3 "   D a t a T y p e = " L a b e l " > S u b c S a l e s p e r s o n L b l < / S u b c S a l e s p e r s o n L b l > + 
+         < S u b c S a l e s P e r s o n P u r c h a s e r E m a i l L b l   E l e m e n t T y p e = " C o l u m n "   E l e m e n t I d = " 2 6 1 6 1 9 0 1 6 "   D a t a T y p e = " L a b e l " > S u b c S a l e s P e r s o n P u r c h a s e r E m a i l L b l < / S u b c S a l e s P e r s o n P u r c h a s e r E m a i l L b l > + 
+         < S u b c S e l l T o C u s t o m e r N o C a p t i o n L b l   E l e m e n t T y p e = " C o l u m n "   E l e m e n t I d = " 1 8 4 6 3 2 6 2 3 8 "   D a t a T y p e = " T e x t " > S u b c S e l l T o C u s t o m e r N o C a p t i o n L b l < / S u b c S e l l T o C u s t o m e r N o C a p t i o n L b l > + 
+         < S u b c S e l l T o C u s t o m e r N o S h i p T o A d d r   E l e m e n t T y p e = " C o l u m n "   E l e m e n t I d = " 1 5 3 0 1 7 9 7 2 8 "   D a t a T y p e = " T e x t " > S u b c S e l l T o C u s t o m e r N o S h i p T o A d d r < / S u b c S e l l T o C u s t o m e r N o S h i p T o A d d r > + 
+         < S u b c S e p e r a t o r 2 L b l   E l e m e n t T y p e = " C o l u m n "   E l e m e n t I d = " 1 9 4 1 7 5 6 9 5 7 "   D a t a T y p e = " T e x t " > S u b c S e p e r a t o r 2 L b l < / S u b c S e p e r a t o r 2 L b l > + 
+         < S u b c S e p e r a t o r 3 L b l   E l e m e n t T y p e = " C o l u m n "   E l e m e n t I d = " 1 8 1 0 2 6 0 5 4 2 "   D a t a T y p e = " T e x t " > S u b c S e p e r a t o r 3 L b l < / S u b c S e p e r a t o r 3 L b l > + 
+         < S u b c S e p e r a t o r L b l   E l e m e n t T y p e = " C o l u m n "   E l e m e n t I d = " 1 0 9 5 5 8 0 1 8 5 "   D a t a T y p e = " T e x t " > S u b c S e p e r a t o r L b l < / S u b c S e p e r a t o r L b l > + 
+         < S u b c S h i p T o A d d r e s s C a p t i o n L b l   E l e m e n t T y p e = " C o l u m n "   E l e m e n t I d = " 1 3 6 5 7 6 4 6 1 7 "   D a t a T y p e = " T e x t " > S u b c S h i p T o A d d r e s s C a p t i o n L b l < / S u b c S h i p T o A d d r e s s C a p t i o n L b l > + 
+         < S u b c S h p t M e t h o d D e s c   E l e m e n t T y p e = " C o l u m n "   E l e m e n t I d = " 1 8 7 7 3 0 1 7 7 1 "   D a t a T y p e = " T e x t " > S u b c S h p t M e t h o d D e s c < / S u b c S h p t M e t h o d D e s c > + 
+         < S u b c S h p t M e t h o d D e s c L b l   E l e m e n t T y p e = " C o l u m n "   E l e m e n t I d = " 1 1 6 9 9 5 4 0 0 1 "   D a t a T y p e = " T e x t " > S u b c S h p t M e t h o d D e s c L b l < / S u b c S h p t M e t h o d D e s c L b l > + 
+         < S u b c T o t a l A m o u n t I n c l V A T   E l e m e n t T y p e = " C o l u m n "   E l e m e n t I d = " 1 8 8 3 5 6 8 5 6 9 "   D a t a T y p e = " S t r i n g " > S u b c T o t a l A m o u n t I n c l V A T < / S u b c T o t a l A m o u n t I n c l V A T > + 
+         < S u b c T o t a l T e x t   E l e m e n t T y p e = " C o l u m n "   E l e m e n t I d = " 7 9 8 5 5 0 8 4 3 "   D a t a T y p e = " T e x t " > S u b c T o t a l T e x t < / S u b c T o t a l T e x t > + 
+         < S u b c U n i t O f M e a s u r e L b l   E l e m e n t T y p e = " C o l u m n "   E l e m e n t I d = " 3 5 0 4 4 8 3 9 3 "   D a t a T y p e = " L a b e l " > S u b c U n i t O f M e a s u r e L b l < / S u b c U n i t O f M e a s u r e L b l > + 
+         < S u b c U n i t _ P r i c e C a p t i o n L b l   E l e m e n t T y p e = " C o l u m n "   E l e m e n t I d = " 1 8 2 0 7 9 6 3 4 2 "   D a t a T y p e = " L a b e l " > S u b c U n i t _ P r i c e C a p t i o n L b l < / S u b c U n i t _ P r i c e C a p t i o n L b l > + 
+         < S u b c V A T A m o u n t   E l e m e n t T y p e = " C o l u m n "   E l e m e n t I d = " 1 9 8 8 8 1 4 0 3 5 "   D a t a T y p e = " S t r i n g " > S u b c V A T A m o u n t < / S u b c V A T A m o u n t > + 
+         < S u b c V A T A m o u n t S p e c i f i c a t i o n C a p t i o n L b l   E l e m e n t T y p e = " C o l u m n "   E l e m e n t I d = " 1 2 5 2 7 6 7 5 8 0 "   D a t a T y p e = " L a b e l " > S u b c V A T A m o u n t S p e c i f i c a t i o n C a p t i o n L b l < / S u b c V A T A m o u n t S p e c i f i c a t i o n C a p t i o n L b l > + 
+         < S u b c V A T B a s e A m o u n t   E l e m e n t T y p e = " C o l u m n "   E l e m e n t I d = " 1 5 9 2 8 9 8 6 0 0 "   D a t a T y p e = " S t r i n g " > S u b c V A T B a s e A m o u n t < / S u b c V A T B a s e A m o u n t > + 
+         < S u b c V A T C l a u s e C a p t i o n L b l   E l e m e n t T y p e = " C o l u m n "   E l e m e n t I d = " 9 3 4 8 8 8 0 1 6 "   D a t a T y p e = " L a b e l " > S u b c V A T C l a u s e C a p t i o n L b l < / S u b c V A T C l a u s e C a p t i o n L b l > + 
+         < S u b c V A T D i s c o u n t A m o u n t   E l e m e n t T y p e = " C o l u m n "   E l e m e n t I d = " 3 4 3 2 3 3 7 8 4 "   D a t a T y p e = " S t r i n g " > S u b c V A T D i s c o u n t A m o u n t < / S u b c V A T D i s c o u n t A m o u n t > + 
+         < S u b c V A T N o   E l e m e n t T y p e = " C o l u m n "   E l e m e n t I d = " 1 5 5 2 1 8 6 2 3 2 "   D a t a T y p e = " T e x t " > S u b c V A T N o < / S u b c V A T N o > + 
+         < S u b c V A T N o L b l   E l e m e n t T y p e = " C o l u m n "   E l e m e n t I d = " 6 1 8 0 8 1 1 9 0 "   D a t a T y p e = " L a b e l " > S u b c V A T N o L b l < / S u b c V A T N o L b l > + 
+         < S u b c V e n d o r N o   E l e m e n t T y p e = " C o l u m n "   E l e m e n t I d = " 1 9 2 8 6 5 0 6 9 5 "   D a t a T y p e = " C o d e " > S u b c V e n d o r N o < / S u b c V e n d o r N o > + 
+         < S u b c V e n d o r N o L b l   E l e m e n t T y p e = " C o l u m n "   E l e m e n t I d = " 9 5 4 8 2 5 9 0 1 "   D a t a T y p e = " L a b e l " > S u b c V e n d o r N o L b l < / S u b c V e n d o r N o L b l > + 
+         < S u b c Y o u r R e f e r e n c e L b l   E l e m e n t T y p e = " C o l u m n "   E l e m e n t I d = " 1 8 4 1 1 9 1 5 6 6 "   D a t a T y p e = " L a b e l " > S u b c Y o u r R e f e r e n c e L b l < / S u b c Y o u r R e f e r e n c e L b l > + 
+         < S u b t o t a l _ L b l   E l e m e n t T y p e = " C o l u m n "   E l e m e n t I d = " 1 9 6 7 7 9 5 1 4 2 "   D a t a T y p e = " L a b e l " > S u b t o t a l _ L b l < / S u b t o t a l _ L b l > + 
+         < T a x I d e n t T y p e C a p t i o n _ L b l   E l e m e n t T y p e = " C o l u m n "   E l e m e n t I d = " 1 2 3 4 9 8 1 3 2 1 "   D a t a T y p e = " L a b e l " > T a x I d e n t T y p e C a p t i o n _ L b l < / T a x I d e n t T y p e C a p t i o n _ L b l > + 
+         < T o C a p t i o n _ L b l   E l e m e n t T y p e = " C o l u m n "   E l e m e n t I d = " 2 0 3 0 5 3 2 2 2 9 "   D a t a T y p e = " L a b e l " > T o C a p t i o n _ L b l < / T o C a p t i o n _ L b l > + 
+         < T o t a l _ L b l   E l e m e n t T y p e = " C o l u m n "   E l e m e n t I d = " 1 2 1 0 1 0 0 8 7 8 "   D a t a T y p e = " L a b e l " > T o t a l _ L b l < / T o t a l _ L b l > + 
+         < V A L V A T B a s e L C Y _ L b l   E l e m e n t T y p e = " C o l u m n "   E l e m e n t I d = " 1 7 0 5 4 3 5 8 1 1 "   D a t a T y p e = " L a b e l " > V A L V A T B a s e L C Y _ L b l < / V A L V A T B a s e L C Y _ L b l > + 
+         < V A T A m t L i n e I n v D i s c B a s e A m t _ L b l   E l e m e n t T y p e = " C o l u m n "   E l e m e n t I d = " 1 6 4 7 3 8 4 9 1 6 "   D a t a T y p e = " L a b e l " > V A T A m t L i n e I n v D i s c B a s e A m t _ L b l < / V A T A m t L i n e I n v D i s c B a s e A m t _ L b l > + 
+         < V A T A m t L i n e L i n e A m t _ L b l   E l e m e n t T y p e = " C o l u m n "   E l e m e n t I d = " 1 1 3 2 2 4 5 2 5 1 "   D a t a T y p e = " L a b e l " > V A T A m t L i n e L i n e A m t _ L b l < / V A T A m t L i n e L i n e A m t _ L b l > + 
+         < V A T A m t L i n e V A T A m t _ L b l   E l e m e n t T y p e = " C o l u m n "   E l e m e n t I d = " 5 0 9 5 8 8 9 9 8 "   D a t a T y p e = " L a b e l " > V A T A m t L i n e V A T A m t _ L b l < / V A T A m t L i n e V A T A m t _ L b l > + 
+         < V A T A m t L i n e V A T _ L b l   E l e m e n t T y p e = " C o l u m n "   E l e m e n t I d = " 1 1 6 2 6 0 3 1 0 2 "   D a t a T y p e = " L a b e l " > V A T A m t L i n e V A T _ L b l < / V A T A m t L i n e V A T _ L b l > + 
+         < V A T A m t S p e c _ L b l   E l e m e n t T y p e = " C o l u m n "   E l e m e n t I d = " 1 5 0 9 9 9 9 3 4 6 "   D a t a T y p e = " L a b e l " > V A T A m t S p e c _ L b l < / V A T A m t S p e c _ L b l > + 
+         < V A T B a s e D i s c _ P u r c h H e a d e r   E l e m e n t T y p e = " C o l u m n "   E l e m e n t I d = " 1 6 3 9 7 3 7 3 5 8 "   D a t a T y p e = " D e c i m a l " > V A T B a s e D i s c _ P u r c h H e a d e r < / V A T B a s e D i s c _ P u r c h H e a d e r > + 
+         < V A T I d e n t i f i e r _ L b l   E l e m e n t T y p e = " C o l u m n "   E l e m e n t I d = " 1 6 8 6 6 2 3 9 8 4 "   D a t a T y p e = " L a b e l " > V A T I d e n t i f i e r _ L b l < / V A T I d e n t i f i e r _ L b l > + 
+         < V A T N o T e x t   E l e m e n t T y p e = " C o l u m n "   E l e m e n t I d = " 1 9 5 9 6 6 3 4 2 6 "   D a t a T y p e = " T e x t " > V A T N o T e x t < / V A T N o T e x t > + 
+         < V A T R e g N o _ P u r c h H e a d e r   E l e m e n t T y p e = " C o l u m n "   E l e m e n t I d = " 9 8 5 0 3 8 1 8 7 "   D a t a T y p e = " T e x t " > V A T R e g N o _ P u r c h H e a d e r < / V A T R e g N o _ P u r c h H e a d e r > + 
+         < V e n d A d d r 1   E l e m e n t T y p e = " C o l u m n "   E l e m e n t I d = " 2 0 3 8 5 3 5 7 8 "   D a t a T y p e = " T e x t " > V e n d A d d r 1 < / V e n d A d d r 1 > + 
+         < V e n d A d d r 2   E l e m e n t T y p e = " C o l u m n "   E l e m e n t I d = " 8 4 1 5 5 0 1 9 5 "   D a t a T y p e = " T e x t " > V e n d A d d r 2 < / V e n d A d d r 2 > + 
+         < V e n d A d d r 3   E l e m e n t T y p e = " C o l u m n "   E l e m e n t I d = " 1 4 7 9 2 4 6 8 1 2 "   D a t a T y p e = " T e x t " > V e n d A d d r 3 < / V e n d A d d r 3 > + 
+         < V e n d A d d r 4   E l e m e n t T y p e = " C o l u m n "   E l e m e n t I d = " 2 1 1 6 9 4 3 4 2 9 "   D a t a T y p e = " T e x t " > V e n d A d d r 4 < / V e n d A d d r 4 > + 
+         < V e n d A d d r 5   E l e m e n t T y p e = " C o l u m n "   E l e m e n t I d = " 1 5 4 0 3 2 7 2 5 0 "   D a t a T y p e = " T e x t " > V e n d A d d r 5 < / V e n d A d d r 5 > + 
+         < V e n d A d d r 6   E l e m e n t T y p e = " C o l u m n "   E l e m e n t I d = " 9 0 2 6 3 0 6 3 3 "   D a t a T y p e = " T e x t " > V e n d A d d r 6 < / V e n d A d d r 6 > + 
+         < V e n d A d d r 7   E l e m e n t T y p e = " C o l u m n "   E l e m e n t I d = " 2 6 4 9 3 4 0 1 6 "   D a t a T y p e = " T e x t " > V e n d A d d r 7 < / V e n d A d d r 7 > + 
+         < V e n d A d d r 8   E l e m e n t T y p e = " C o l u m n "   E l e m e n t I d = " 1 2 4 0 4 4 8 6 7 9 "   D a t a T y p e = " T e x t " > V e n d A d d r 8 < / V e n d A d d r 8 > + 
+         < V e n d N o _ L b l   E l e m e n t T y p e = " C o l u m n "   E l e m e n t I d = " 1 1 9 1 1 1 2 2 4 0 "   D a t a T y p e = " L a b e l " > V e n d N o _ L b l < / V e n d N o _ L b l > + 
+         < V e n d o r I D C a p t i o n _ L b l   E l e m e n t T y p e = " C o l u m n "   E l e m e n t I d = " 1 1 2 9 2 1 9 5 9 3 "   D a t a T y p e = " L a b e l " > V e n d o r I D C a p t i o n _ L b l < / V e n d o r I D C a p t i o n _ L b l > + 
+         < V e n d o r I n v o i c e N o   E l e m e n t T y p e = " C o l u m n "   E l e m e n t I d = " 8 8 7 3 7 6 2 2 5 "   D a t a T y p e = " C o d e " > V e n d o r I n v o i c e N o < / V e n d o r I n v o i c e N o > + 
+         < V e n d o r I n v o i c e N o _ L b l   E l e m e n t T y p e = " C o l u m n "   E l e m e n t I d = " 1 0 3 4 9 0 0 7 0 0 "   D a t a T y p e = " L a b e l " > V e n d o r I n v o i c e N o _ L b l < / V e n d o r I n v o i c e N o _ L b l > + 
+         < V e n d o r O r d e r N o   E l e m e n t T y p e = " C o l u m n "   E l e m e n t I d = " 1 6 4 1 9 6 8 4 4 6 "   D a t a T y p e = " C o d e " > V e n d o r O r d e r N o < / V e n d o r O r d e r N o > + 
+         < V e n d o r O r d e r N o _ L b l   E l e m e n t T y p e = " C o l u m n "   E l e m e n t I d = " 1 5 7 1 7 5 2 4 7 7 "   D a t a T y p e = " L a b e l " > V e n d o r O r d e r N o _ L b l < / V e n d o r O r d e r N o _ L b l > + 
+         < V e n d o r _ _ S u b c o n t r a c t i n g _ L o c a t i o n _ C o d e _   E l e m e n t T y p e = " C o l u m n "   E l e m e n t I d = " 1 3 4 7 4 3 0 9 3 6 "   D a t a T y p e = " C o d e " > V e n d o r _ _ S u b c o n t r a c t i n g _ L o c a t i o n _ C o d e _ < / V e n d o r _ _ S u b c o n t r a c t i n g _ L o c a t i o n _ C o d e _ > + 
+         < V e n d o r _ _ S u b c o n t r a c t i n g _ L o c a t i o n _ C o d e _ C a p t i o n   E l e m e n t T y p e = " C o l u m n "   E l e m e n t I d = " 7 6 3 3 1 5 3 6 6 "   D a t a T y p e = " S t r i n g " > V e n d o r _ _ S u b c o n t r a c t i n g _ L o c a t i o n _ C o d e _ C a p t i o n < / V e n d o r _ _ S u b c o n t r a c t i n g _ L o c a t i o n _ C o d e _ C a p t i o n > + 
+         < Y o u r R e f _ P u r c h H e a d e r   E l e m e n t T y p e = " C o l u m n "   E l e m e n t I d = " 1 9 8 5 3 6 8 6 3 1 "   D a t a T y p e = " T e x t " > Y o u r R e f _ P u r c h H e a d e r < / Y o u r R e f _ P u r c h H e a d e r > + 
+         < P u r c h a s e _ L i n e   E l e m e n t T y p e = " D a t a I t e m "   E l e m e n t I d = " 1 2 9 1 3 1 7 9 1 1 " > + 
+             < A l l o w I n v D i s c t x t   E l e m e n t T y p e = " C o l u m n "   E l e m e n t I d = " 2 0 1 2 9 2 1 6 0 8 "   D a t a T y p e = " T e x t " > A l l o w I n v D i s c t x t < / A l l o w I n v D i s c t x t > + 
+             < A l l o w I n v D i s c _ P u r c h L i n e   E l e m e n t T y p e = " C o l u m n "   E l e m e n t I d = " 9 8 2 2 2 1 3 6 3 "   D a t a T y p e = " B o o l e a n " > A l l o w I n v D i s c _ P u r c h L i n e < / A l l o w I n v D i s c _ P u r c h L i n e > + 
+             < A m o u n t I n c l u d i n g V A T   E l e m e n t T y p e = " C o l u m n "   E l e m e n t I d = " 8 9 1 0 4 9 5 7 1 "   D a t a T y p e = " D e c i m a l " > A m o u n t I n c l u d i n g V A T < / A m o u n t I n c l u d i n g V A T > + 
+             < D e s c _ P u r c h L i n e   E l e m e n t T y p e = " C o l u m n "   E l e m e n t I d = " 1 1 6 1 7 0 2 0 8 9 "   D a t a T y p e = " T e x t " > D e s c _ P u r c h L i n e < / D e s c _ P u r c h L i n e > + 
+             < D e s c _ P u r c h L i n e _ L b l   E l e m e n t T y p e = " C o l u m n "   E l e m e n t I d = " 6 6 5 1 1 3 6 5 2 "   D a t a T y p e = " S t r i n g " > D e s c _ P u r c h L i n e _ L b l < / D e s c _ P u r c h L i n e _ L b l > + 
+             < D i r e c t U n i C o s t _ L b l   E l e m e n t T y p e = " C o l u m n "   E l e m e n t I d = " 7 2 1 4 7 6 6 8 4 "   D a t a T y p e = " L a b e l " > D i r e c t U n i C o s t _ L b l < / D i r e c t U n i C o s t _ L b l > + 
+             < D i r U n i t C o s t _ P u r c h L i n e   E l e m e n t T y p e = " C o l u m n "   E l e m e n t I d = " 9 5 0 9 6 2 5 8 6 "   D a t a T y p e = " T e x t " > D i r U n i t C o s t _ P u r c h L i n e < / D i r U n i t C o s t _ P u r c h L i n e > + 
+             < E x p e c t e d R e c e i p t D a t e   E l e m e n t T y p e = " C o l u m n "   E l e m e n t I d = " 1 9 8 8 0 4 6 2 0 5 "   D a t a T y p e = " S t r i n g " > E x p e c t e d R e c e i p t D a t e < / E x p e c t e d R e c e i p t D a t e > + 
+             < E x p e c t e d R e c e i p t D a t e L b l   E l e m e n t T y p e = " C o l u m n "   E l e m e n t I d = " 1 8 0 6 8 4 1 2 7 1 "   D a t a T y p e = " L a b e l " > E x p e c t e d R e c e i p t D a t e L b l < / E x p e c t e d R e c e i p t D a t e L b l > + 
+             < I n v D i s c A m t _ P u r c h L i n e   E l e m e n t T y p e = " C o l u m n "   E l e m e n t I d = " 1 4 5 3 0 9 9 5 8 0 "   D a t a T y p e = " D e c i m a l " > I n v D i s c A m t _ P u r c h L i n e < / I n v D i s c A m t _ P u r c h L i n e > + 
+             < I n v D i s c C a p t i o n _ L b l   E l e m e n t T y p e = " C o l u m n "   E l e m e n t I d = " 1 9 3 9 0 5 8 9 7 4 "   D a t a T y p e = " L a b e l " > I n v D i s c C a p t i o n _ L b l < / I n v D i s c C a p t i o n _ L b l > + 
+             < I t e m N o _ P u r c h L i n e   E l e m e n t T y p e = " C o l u m n "   E l e m e n t I d = " 1 0 5 7 2 2 4 1 4 0 "   D a t a T y p e = " C o d e " > I t e m N o _ P u r c h L i n e < / I t e m N o _ P u r c h L i n e > + 
+             < I t e m R e f e r e n c e N o _ P u r c h L i n e   E l e m e n t T y p e = " C o l u m n "   E l e m e n t I d = " 1 1 5 8 3 9 2 0 3 1 "   D a t a T y p e = " C o d e " > I t e m R e f e r e n c e N o _ P u r c h L i n e < / I t e m R e f e r e n c e N o _ P u r c h L i n e > + 
+             < J o b N o _ P u r c h L i n e   E l e m e n t T y p e = " C o l u m n "   E l e m e n t I d = " 2 7 7 7 0 3 3 2 6 "   D a t a T y p e = " C o d e " > J o b N o _ P u r c h L i n e < / J o b N o _ P u r c h L i n e > + 
+             < J o b N o _ P u r c h L i n e _ L b l   E l e m e n t T y p e = " C o l u m n "   E l e m e n t I d = " 9 6 0 0 7 3 4 1 1 "   D a t a T y p e = " L a b e l " > J o b N o _ P u r c h L i n e _ L b l < / J o b N o _ P u r c h L i n e _ L b l > + 
+             < J o b T a s k N o _ P u r c h L i n e   E l e m e n t T y p e = " C o l u m n "   E l e m e n t I d = " 7 2 6 6 6 9 0 1 1 "   D a t a T y p e = " C o d e " > J o b T a s k N o _ P u r c h L i n e < / J o b T a s k N o _ P u r c h L i n e > + 
+             < J o b T a s k N o _ P u r c h L i n e _ L b l   E l e m e n t T y p e = " C o l u m n "   E l e m e n t I d = " 2 0 4 9 1 3 1 1 8 2 "   D a t a T y p e = " L a b e l " > J o b T a s k N o _ P u r c h L i n e _ L b l < / J o b T a s k N o _ P u r c h L i n e _ L b l > + 
+             < L i n e A m t _ P u r c h L i n e   E l e m e n t T y p e = " C o l u m n "   E l e m e n t I d = " 1 5 9 3 7 5 8 6 7 4 "   D a t a T y p e = " T e x t " > L i n e A m t _ P u r c h L i n e < / L i n e A m t _ P u r c h L i n e > + 
+             < L i n e D i s c _ P u r c h L i n e   E l e m e n t T y p e = " C o l u m n "   E l e m e n t I d = " 2 1 3 3 2 3 3 9 7 3 "   D a t a T y p e = " D e c i m a l " > L i n e D i s c _ P u r c h L i n e < / L i n e D i s c _ P u r c h L i n e > + 
+             < L i n e N o _ P u r c h L i n e   E l e m e n t T y p e = " C o l u m n "   E l e m e n t I d = " 1 7 4 8 8 4 8 6 5 "   D a t a T y p e = " I n t e g e r " > L i n e N o _ P u r c h L i n e < / L i n e N o _ P u r c h L i n e > + 
+             < N o _ P u r c h L i n e   E l e m e n t T y p e = " C o l u m n "   E l e m e n t I d = " 2 8 8 5 5 1 3 4 3 "   D a t a T y p e = " T e x t " > N o _ P u r c h L i n e < / N o _ P u r c h L i n e > + 
+             < N o _ P u r c h L i n e _ L b l   E l e m e n t T y p e = " C o l u m n "   E l e m e n t I d = " 1 8 4 4 9 0 6 5 4 0 "   D a t a T y p e = " S t r i n g " > N o _ P u r c h L i n e _ L b l < / N o _ P u r c h L i n e _ L b l > + 
+             < P l a n n e d R e c e i p t D a t e   E l e m e n t T y p e = " C o l u m n "   E l e m e n t I d = " 1 1 4 0 0 3 3 3 2 1 "   D a t a T y p e = " S t r i n g " > P l a n n e d R e c e i p t D a t e < / P l a n n e d R e c e i p t D a t e > + 
+             < P l a n n e d R e c e i p t D a t e L b l   E l e m e n t T y p e = " C o l u m n "   E l e m e n t I d = " 1 4 7 8 7 6 7 2 9 9 "   D a t a T y p e = " L a b e l " > P l a n n e d R e c e i p t D a t e L b l < / P l a n n e d R e c e i p t D a t e L b l > + 
+             < P r o m i s e d R e c e i p t D a t e   E l e m e n t T y p e = " C o l u m n "   E l e m e n t I d = " 2 9 4 5 3 0 7 8 "   D a t a T y p e = " S t r i n g " > P r o m i s e d R e c e i p t D a t e < / P r o m i s e d R e c e i p t D a t e > + 
+             < P r o m i s e d R e c e i p t D a t e L b l   E l e m e n t T y p e = " C o l u m n "   E l e m e n t I d = " 2 0 2 4 9 3 8 1 7 2 "   D a t a T y p e = " L a b e l " > P r o m i s e d R e c e i p t D a t e L b l < / P r o m i s e d R e c e i p t D a t e L b l > + 
+             < P u r c h a s e _ L i n e _ O p e r a t i o n _ N o _   E l e m e n t T y p e = " C o l u m n "   E l e m e n t I d = " 9 3 5 5 8 5 3 8 8 "   D a t a T y p e = " C o d e " > P u r c h a s e _ L i n e _ O p e r a t i o n _ N o _ < / P u r c h a s e _ L i n e _ O p e r a t i o n _ N o _ > + 
+             < P u r c h a s e _ L i n e _ O u t s t a n d i n g _ Q t y   E l e m e n t T y p e = " C o l u m n "   E l e m e n t I d = " 2 1 2 3 0 1 5 5 8 3 "   D a t a T y p e = " D e c i m a l " > P u r c h a s e _ L i n e _ O u t s t a n d i n g _ Q t y < / P u r c h a s e _ L i n e _ O u t s t a n d i n g _ Q t y > + 
+             < P u r c h a s e _ L i n e _ P r o d _ _ O r d e r _ L i n e _ N o _   E l e m e n t T y p e = " C o l u m n "   E l e m e n t I d = " 1 3 4 8 1 7 1 5 8 5 "   D a t a T y p e = " I n t e g e r " > P u r c h a s e _ L i n e _ P r o d _ _ O r d e r _ L i n e _ N o _ < / P u r c h a s e _ L i n e _ P r o d _ _ O r d e r _ L i n e _ N o _ > + 
+             < P u r c h a s e _ L i n e _ P r o d _ _ O r d e r _ N o _   E l e m e n t T y p e = " C o l u m n "   E l e m e n t I d = " 4 3 3 0 9 7 7 9 4 "   D a t a T y p e = " C o d e " > P u r c h a s e _ L i n e _ P r o d _ _ O r d e r _ N o _ < / P u r c h a s e _ L i n e _ P r o d _ _ O r d e r _ N o _ > + 
+             < P u r c h a s e _ L i n e _ R o u t i n g _ N o _   E l e m e n t T y p e = " C o l u m n "   E l e m e n t I d = " 7 8 0 1 6 3 6 5 3 "   D a t a T y p e = " C o d e " > P u r c h a s e _ L i n e _ R o u t i n g _ N o _ < / P u r c h a s e _ L i n e _ R o u t i n g _ N o _ > + 
+             < P u r c h a s e _ L i n e _ R o u t i n g _ R e f e r e n c e _ N o _   E l e m e n t T y p e = " C o l u m n "   E l e m e n t I d = " 1 2 0 9 1 3 5 8 4 7 "   D a t a T y p e = " I n t e g e r " > P u r c h a s e _ L i n e _ R o u t i n g _ R e f e r e n c e _ N o _ < / P u r c h a s e _ L i n e _ R o u t i n g _ R e f e r e n c e _ N o _ > + 
+             < P u r c h L i n e L i n e D i s c _ L b l   E l e m e n t T y p e = " C o l u m n "   E l e m e n t I d = " 5 7 3 7 9 3 8 4 1 "   D a t a T y p e = " L a b e l " > P u r c h L i n e L i n e D i s c _ L b l < / P u r c h L i n e L i n e D i s c _ L b l > + 
+             < Q t y _ P u r c h L i n e   E l e m e n t T y p e = " C o l u m n "   E l e m e n t I d = " 7 8 0 8 5 8 6 7 6 "   D a t a T y p e = " T e x t " > Q t y _ P u r c h L i n e < / Q t y _ P u r c h L i n e > + 
+             < Q t y _ P u r c h L i n e _ L b l   E l e m e n t T y p e = " C o l u m n "   E l e m e n t I d = " 6 6 5 5 0 9 2 9 "   D a t a T y p e = " S t r i n g " > Q t y _ P u r c h L i n e _ L b l < / Q t y _ P u r c h L i n e _ L b l > + 
+             < R e q u e s t e d R e c e i p t D a t e   E l e m e n t T y p e = " C o l u m n "   E l e m e n t I d = " 9 3 3 1 1 2 9 3 1 "   D a t a T y p e = " S t r i n g " > R e q u e s t e d R e c e i p t D a t e < / R e q u e s t e d R e c e i p t D a t e > + 
+             < R e q u e s t e d R e c e i p t D a t e L b l   E l e m e n t T y p e = " C o l u m n "   E l e m e n t I d = " 1 4 4 2 7 6 8 2 3 "   D a t a T y p e = " L a b e l " > R e q u e s t e d R e c e i p t D a t e L b l < / R e q u e s t e d R e c e i p t D a t e L b l > + 
+             < S u b c D e s c r i p t i o n C a p t i o n   E l e m e n t T y p e = " C o l u m n "   E l e m e n t I d = " 9 7 9 9 2 9 3 3 4 "   D a t a T y p e = " S t r i n g " > S u b c D e s c r i p t i o n C a p t i o n < / S u b c D e s c r i p t i o n C a p t i o n > + 
+             < S u b c E x p e c t e d R e c e i p t D a t e   E l e m e n t T y p e = " C o l u m n "   E l e m e n t I d = " 2 4 9 0 3 9 1 7 2 "   D a t a T y p e = " S t r i n g " > S u b c E x p e c t e d R e c e i p t D a t e < / S u b c E x p e c t e d R e c e i p t D a t e > + 
+             < S u b c L i n e D e s c r i p t i o n 2   E l e m e n t T y p e = " C o l u m n "   E l e m e n t I d = " 1 3 3 9 9 9 1 1 2 "   D a t a T y p e = " T e x t " > S u b c L i n e D e s c r i p t i o n 2 < / S u b c L i n e D e s c r i p t i o n 2 > + 
+             < S u b c L i n e D i s c   E l e m e n t T y p e = " C o l u m n "   E l e m e n t I d = " 6 5 8 9 8 0 3 1 "   D a t a T y p e = " T e x t " > S u b c L i n e D i s c < / S u b c L i n e D i s c > + 
+             < S u b c L i n e M a r k   E l e m e n t T y p e = " C o l u m n "   E l e m e n t I d = " 2 0 5 3 3 6 4 2 9 7 "   D a t a T y p e = " T e x t " > S u b c L i n e M a r k < / S u b c L i n e M a r k > + 
+             < S u b c N o C a p t i o n   E l e m e n t T y p e = " C o l u m n "   E l e m e n t I d = " 6 2 7 1 3 7 4 2 1 "   D a t a T y p e = " S t r i n g " > S u b c N o C a p t i o n < / S u b c N o C a p t i o n > + 
+             < S u b c P o s N o T e x t   E l e m e n t T y p e = " C o l u m n "   E l e m e n t I d = " 1 5 9 5 3 4 0 1 3 8 "   D a t a T y p e = " T e x t " > S u b c P o s N o T e x t < / S u b c P o s N o T e x t > + 
+             < S u b c P U o M   E l e m e n t T y p e = " C o l u m n "   E l e m e n t I d = " 3 2 6 3 6 9 9 6 3 "   D a t a T y p e = " T e x t " > S u b c P U o M < / S u b c P U o M > + 
+             < S u b c P u r c h Q t y   E l e m e n t T y p e = " C o l u m n "   E l e m e n t I d = " 8 8 0 6 5 5 3 7 4 "   D a t a T y p e = " D e c i m a l " > S u b c P u r c h Q t y < / S u b c P u r c h Q t y > + 
+             < S u b c P U S   E l e m e n t T y p e = " C o l u m n "   E l e m e n t I d = " 1 5 5 6 6 5 5 6 "   D a t a T y p e = " T e x t " > S u b c P U S < / S u b c P U S > + 
+             < S u b c Q u a n t i t y C a p t i o n   E l e m e n t T y p e = " C o l u m n "   E l e m e n t I d = " 2 1 3 5 9 0 4 0 2 5 "   D a t a T y p e = " S t r i n g " > S u b c Q u a n t i t y C a p t i o n < / S u b c Q u a n t i t y C a p t i o n > + 
+             < S u b c S a l e s L i n e L i n e A m o u n t   E l e m e n t T y p e = " C o l u m n "   E l e m e n t I d = " 2 6 3 1 4 5 7 0 2 "   D a t a T y p e = " T e x t " > S u b c S a l e s L i n e L i n e A m o u n t < / S u b c S a l e s L i n e L i n e A m o u n t > + 
+             < S u b c U n i t C o s t   E l e m e n t T y p e = " C o l u m n "   E l e m e n t I d = " 7 7 2 9 2 9 4 9 5 "   D a t a T y p e = " T e x t " > S u b c U n i t C o s t < / S u b c U n i t C o s t > + 
+             < T o t a l I n c l V A T   E l e m e n t T y p e = " C o l u m n "   E l e m e n t I d = " 2 0 6 6 5 7 4 0 8 4 "   D a t a T y p e = " D e c i m a l " > T o t a l I n c l V A T < / T o t a l I n c l V A T > + 
+             < T o t a l P r i c e C a p t i o n _ L b l   E l e m e n t T y p e = " C o l u m n "   E l e m e n t I d = " 1 7 4 8 7 7 2 0 5 5 "   D a t a T y p e = " L a b e l " > T o t a l P r i c e C a p t i o n _ L b l < / T o t a l P r i c e C a p t i o n _ L b l > + 
+             < T y p e _ P u r c h L i n e   E l e m e n t T y p e = " C o l u m n "   E l e m e n t I d = " 8 0 9 4 7 1 0 8 8 "   D a t a T y p e = " S t r i n g " > T y p e _ P u r c h L i n e < / T y p e _ P u r c h L i n e > + 
+             < U n i t P r i c e _ P u r c h L i n e   E l e m e n t T y p e = " C o l u m n "   E l e m e n t I d = " 2 0 6 3 2 5 9 8 1 9 "   D a t a T y p e = " D e c i m a l " > U n i t P r i c e _ P u r c h L i n e < / U n i t P r i c e _ P u r c h L i n e > + 
+             < U n i t P r i c e _ P u r c h L i n e _ L b l   E l e m e n t T y p e = " C o l u m n "   E l e m e n t I d = " 7 0 4 0 2 1 4 6 2 "   D a t a T y p e = " L a b e l " > U n i t P r i c e _ P u r c h L i n e _ L b l < / U n i t P r i c e _ P u r c h L i n e _ L b l > + 
+             < U O M _ P u r c h L i n e   E l e m e n t T y p e = " C o l u m n "   E l e m e n t I d = " 4 4 1 1 3 9 0 4 9 "   D a t a T y p e = " T e x t " > U O M _ P u r c h L i n e < / U O M _ P u r c h L i n e > + 
+             < U O M _ P u r c h L i n e _ L b l   E l e m e n t T y p e = " C o l u m n "   E l e m e n t I d = " 1 8 5 6 1 1 3 1 9 4 "   D a t a T y p e = " L a b e l " > U O M _ P u r c h L i n e _ L b l < / U O M _ P u r c h L i n e _ L b l > + 
+             < V A T D i s c o u n t A m o u n t _ L b l   E l e m e n t T y p e = " C o l u m n "   E l e m e n t I d = " 1 3 5 5 1 2 6 5 3 8 "   D a t a T y p e = " L a b e l " > V A T D i s c o u n t A m o u n t _ L b l < / V A T D i s c o u n t A m o u n t _ L b l > + 
+             < V A T I d e n t i f i e r _ P u r c h L i n e   E l e m e n t T y p e = " C o l u m n "   E l e m e n t I d = " 1 0 5 5 6 1 2 1 2 8 "   D a t a T y p e = " C o d e " > V A T I d e n t i f i e r _ P u r c h L i n e < / V A T I d e n t i f i e r _ P u r c h L i n e > + 
+             < V A T I d e n t i f i e r _ P u r c h L i n e _ L b l   E l e m e n t T y p e = " C o l u m n "   E l e m e n t I d = " 1 4 0 4 1 9 4 8 1 9 "   D a t a T y p e = " S t r i n g " > V A T I d e n t i f i e r _ P u r c h L i n e _ L b l < / V A T I d e n t i f i e r _ P u r c h L i n e _ L b l > + 
+             < V e n d o r I t e m N o _ P u r c h L i n e   E l e m e n t T y p e = " C o l u m n "   E l e m e n t I d = " 1 9 1 8 6 5 6 1 6 0 "   D a t a T y p e = " T e x t " > V e n d o r I t e m N o _ P u r c h L i n e < / V e n d o r I t e m N o _ P u r c h L i n e > + 
+             < P r o d _ O r d e r _ L i n e   E l e m e n t T y p e = " D a t a I t e m "   E l e m e n t I d = " 3 4 3 3 1 8 6 8 "   / > + 
+             < P r o d _ O r d e r _ R o u t i n g _ L i n e   E l e m e n t T y p e = " D a t a I t e m "   E l e m e n t I d = " 9 4 8 4 0 6 1 1 9 " > + 
+                 < C o m p o n e n t s T o S h i p L b l   E l e m e n t T y p e = " C o l u m n "   E l e m e n t I d = " 1 8 3 3 5 4 1 8 1 8 "   D a t a T y p e = " L a b e l " > C o m p o n e n t s T o S h i p L b l < / C o m p o n e n t s T o S h i p L b l > + 
+                 < E n d i n g D a t e L b l   E l e m e n t T y p e = " C o l u m n "   E l e m e n t I d = " 7 2 2 0 5 2 3 8 0 "   D a t a T y p e = " L a b e l " > E n d i n g D a t e L b l < / E n d i n g D a t e L b l > + 
+                 < I t e m L b l   E l e m e n t T y p e = " C o l u m n "   E l e m e n t I d = " 2 1 1 5 2 0 3 3 0 "   D a t a T y p e = " L a b e l " > I t e m L b l < / I t e m L b l > + 
+                 < P r o d O r d e r L b l   E l e m e n t T y p e = " C o l u m n "   E l e m e n t I d = " 3 7 7 4 0 9 6 5 6 "   D a t a T y p e = " L a b e l " > P r o d O r d e r L b l < / P r o d O r d e r L b l > + 
+                 < P r o d _ _ O r d e r _ L i n e _ _ Q u a n t i t y   E l e m e n t T y p e = " C o l u m n "   E l e m e n t I d = " 5 5 7 1 7 6 8 1 6 "   D a t a T y p e = " S t r i n g " > P r o d _ _ O r d e r _ L i n e _ _ Q u a n t i t y < / P r o d _ _ O r d e r _ L i n e _ _ Q u a n t i t y > + 
+                 < P r o d _ _ O r d e r _ L i n e _ _ _ I t e m _ N o _ _   E l e m e n t T y p e = " C o l u m n "   E l e m e n t I d = " 1 4 4 5 8 3 7 4 7 3 "   D a t a T y p e = " C o d e " > P r o d _ _ O r d e r _ L i n e _ _ _ I t e m _ N o _ _ < / P r o d _ _ O r d e r _ L i n e _ _ _ I t e m _ N o _ _ > + 
+                 < P r o d _ _ O r d e r _ L i n e _ _ _ Q u a n t i t y _ _ B a s e _ _   E l e m e n t T y p e = " C o l u m n "   E l e m e n t I d = " 5 4 9 7 6 2 9 4 "   D a t a T y p e = " D e c i m a l " > P r o d _ _ O r d e r _ L i n e _ _ _ Q u a n t i t y _ _ B a s e _ _ < / P r o d _ _ O r d e r _ L i n e _ _ _ Q u a n t i t y _ _ B a s e _ _ > + 
+                 < P r o d _ _ O r d e r _ L i n e _ _ _ R e m a i n i n g _ Q u a n t i t y _   E l e m e n t T y p e = " C o l u m n "   E l e m e n t I d = " 1 6 3 4 3 5 0 7 3 9 "   D a t a T y p e = " S t r i n g " > P r o d _ _ O r d e r _ L i n e _ _ _ R e m a i n i n g _ Q u a n t i t y _ < / P r o d _ _ O r d e r _ L i n e _ _ _ R e m a i n i n g _ Q u a n t i t y _ > + 
+                 < P r o d _ _ O r d e r _ L i n e _ _ _ U n i t _ o f _ M e a s u r e _ C o d e _   E l e m e n t T y p e = " C o l u m n "   E l e m e n t I d = " 9 5 8 0 7 4 5 4 "   D a t a T y p e = " C o d e " > P r o d _ _ O r d e r _ L i n e _ _ _ U n i t _ o f _ M e a s u r e _ C o d e _ < / P r o d _ _ O r d e r _ L i n e _ _ _ U n i t _ o f _ M e a s u r e _ C o d e _ > + 
+                 < P r o d _ _ O r d e r _ R o u t i n g _ L i n e _ D e s c r i p t i o n   E l e m e n t T y p e = " C o l u m n "   E l e m e n t I d = " 1 1 8 5 2 9 4 8 9 7 "   D a t a T y p e = " T e x t " > P r o d _ _ O r d e r _ R o u t i n g _ L i n e _ D e s c r i p t i o n < / P r o d _ _ O r d e r _ R o u t i n g _ L i n e _ D e s c r i p t i o n > + 
+                 < P r o d _ _ O r d e r _ R o u t i n g _ L i n e _ D e s c r i p t i o n _ C o n t r o l 1 1 3 0 5 3 8   E l e m e n t T y p e = " C o l u m n "   E l e m e n t I d = " 2 0 5 0 0 9 4 6 2 0 "   D a t a T y p e = " T e x t " > P r o d _ _ O r d e r _ R o u t i n g _ L i n e _ D e s c r i p t i o n _ C o n t r o l 1 1 3 0 5 3 8 < / P r o d _ _ O r d e r _ R o u t i n g _ L i n e _ D e s c r i p t i o n _ C o n t r o l 1 1 3 0 5 3 8 > + 
+                 < P r o d _ _ O r d e r _ R o u t i n g _ L i n e _ R o u t i n g _ L i n k _ C o d e   E l e m e n t T y p e = " C o l u m n "   E l e m e n t I d = " 1 2 4 7 0 8 9 6 6 "   D a t a T y p e = " C o d e " > P r o d _ _ O r d e r _ R o u t i n g _ L i n e _ R o u t i n g _ L i n k _ C o d e < / P r o d _ _ O r d e r _ R o u t i n g _ L i n e _ R o u t i n g _ L i n k _ C o d e > + 
+                 < P r o d _ _ O r d e r _ R o u t i n g _ L i n e _ R o u t i n g _ N o _   E l e m e n t T y p e = " C o l u m n "   E l e m e n t I d = " 1 0 6 0 7 5 6 5 4 "   D a t a T y p e = " C o d e " > P r o d _ _ O r d e r _ R o u t i n g _ L i n e _ R o u t i n g _ N o _ < / P r o d _ _ O r d e r _ R o u t i n g _ L i n e _ R o u t i n g _ N o _ > + 
+                 < P r o d _ _ O r d e r _ R o u t i n g _ L i n e _ R o u t i n g _ R e f e r e n c e _ N o _   E l e m e n t T y p e = " C o l u m n "   E l e m e n t I d = " 2 7 3 1 5 8 7 7 8 "   D a t a T y p e = " I n t e g e r " > P r o d _ _ O r d e r _ R o u t i n g _ L i n e _ R o u t i n g _ R e f e r e n c e _ N o _ < / P r o d _ _ O r d e r _ R o u t i n g _ L i n e _ R o u t i n g _ R e f e r e n c e _ N o _ > + 
+                 < P r o d _ _ O r d e r _ R o u t i n g _ L i n e _ S t a t u s   E l e m e n t T y p e = " C o l u m n "   E l e m e n t I d = " 7 9 8 1 7 9 9 1 7 "   D a t a T y p e = " E n u m " > P r o d _ _ O r d e r _ R o u t i n g _ L i n e _ S t a t u s < / P r o d _ _ O r d e r _ R o u t i n g _ L i n e _ S t a t u s > + 
+                 < P r o d _ _ O r d e r _ R o u t i n g _ L i n e _ _ E n d i n g _ D a t e _   E l e m e n t T y p e = " C o l u m n "   E l e m e n t I d = " 6 8 7 0 9 4 1 3 1 "   D a t a T y p e = " S t r i n g " > P r o d _ _ O r d e r _ R o u t i n g _ L i n e _ _ E n d i n g _ D a t e _ < / P r o d _ _ O r d e r _ R o u t i n g _ L i n e _ _ E n d i n g _ D a t e _ > + 
+                 < P r o d _ _ O r d e r _ R o u t i n g _ L i n e _ _ O p e r a t i o n _ N o _ _   E l e m e n t T y p e = " C o l u m n "   E l e m e n t I d = " 1 6 4 1 3 6 8 4 3 "   D a t a T y p e = " C o d e " > P r o d _ _ O r d e r _ R o u t i n g _ L i n e _ _ O p e r a t i o n _ N o _ _ < / P r o d _ _ O r d e r _ R o u t i n g _ L i n e _ _ O p e r a t i o n _ N o _ _ > + 
+                 < P r o d _ _ O r d e r _ R o u t i n g _ L i n e _ _ O p e r a t i o n _ N o _ _ C a p t i o n   E l e m e n t T y p e = " C o l u m n "   E l e m e n t I d = " 7 6 3 5 7 3 6 9 9 "   D a t a T y p e = " S t r i n g " > P r o d _ _ O r d e r _ R o u t i n g _ L i n e _ _ O p e r a t i o n _ N o _ _ C a p t i o n < / P r o d _ _ O r d e r _ R o u t i n g _ L i n e _ _ O p e r a t i o n _ N o _ _ C a p t i o n > + 
+                 < P r o d _ _ O r d e r _ R o u t i n g _ L i n e _ _ P r o d _ _ O r d e r _ N o _ _   E l e m e n t T y p e = " C o l u m n "   E l e m e n t I d = " 9 8 1 9 6 1 5 8 5 "   D a t a T y p e = " C o d e " > P r o d _ _ O r d e r _ R o u t i n g _ L i n e _ _ P r o d _ _ O r d e r _ N o _ _ < / P r o d _ _ O r d e r _ R o u t i n g _ L i n e _ _ P r o d _ _ O r d e r _ N o _ _ > + 
+                 < P r o d _ _ O r d e r _ R o u t i n g _ L i n e _ _ S t a r t i n g _ D a t e _   E l e m e n t T y p e = " C o l u m n "   E l e m e n t I d = " 1 1 5 9 6 4 7 6 "   D a t a T y p e = " S t r i n g " > P r o d _ _ O r d e r _ R o u t i n g _ L i n e _ _ S t a r t i n g _ D a t e _ < / P r o d _ _ O r d e r _ R o u t i n g _ L i n e _ _ S t a r t i n g _ D a t e _ > + 
+                 < Q t y T o S h i p L b l   E l e m e n t T y p e = " C o l u m n "   E l e m e n t I d = " 5 1 0 9 0 6 0 8 2 "   D a t a T y p e = " L a b e l " > Q t y T o S h i p L b l < / Q t y T o S h i p L b l > + 
+                 < Q u a n t i t y B a s e L b l   E l e m e n t T y p e = " C o l u m n "   E l e m e n t I d = " 1 8 2 8 0 4 3 4 1 7 "   D a t a T y p e = " L a b e l " > Q u a n t i t y B a s e L b l < / Q u a n t i t y B a s e L b l > + 
+                 < Q u a n t i t y L b l   E l e m e n t T y p e = " C o l u m n "   E l e m e n t I d = " 2 7 2 0 7 7 8 0 "   D a t a T y p e = " L a b e l " > Q u a n t i t y L b l < / Q u a n t i t y L b l > + 
+                 < R e m a i n i n g Q u a n t i t y L b l   E l e m e n t T y p e = " C o l u m n "   E l e m e n t I d = " 1 4 8 4 1 1 8 8 4 8 "   D a t a T y p e = " L a b e l " > R e m a i n i n g Q u a n t i t y L b l < / R e m a i n i n g Q u a n t i t y L b l > + 
+                 < S t a r t i n g D a t e L b l   E l e m e n t T y p e = " C o l u m n "   E l e m e n t I d = " 4 3 9 3 8 1 8 8 3 "   D a t a T y p e = " L a b e l " > S t a r t i n g D a t e L b l < / S t a r t i n g D a t e L b l > + 
+                 < U o M L b l   E l e m e n t T y p e = " C o l u m n "   E l e m e n t I d = " 7 3 6 2 1 6 7 6 0 "   D a t a T y p e = " L a b e l " > U o M L b l < / U o M L b l > + 
+                 < P r o d _ O r d e r _ C o m p o n e n t   E l e m e n t T y p e = " D a t a I t e m "   E l e m e n t I d = " 1 0 0 9 9 9 2 6 7 7 " > + 
+                     < E x p e c t e d _ Q t y _ _ _ B a s e _ _ _ _ _ _ Q t y _ _ t r a n s f _ _ t o _ S u b c o n t r a c t o r _ _ _ _ _ _ Q t y _ _ i n _ T r a n s i t _ _ B a s e _ _   E l e m e n t T y p e = " C o l u m n "   E l e m e n t I d = " 1 2 3 3 3 6 3 3 3 1 "   D a t a T y p e = " D e c i m a l " > E x p e c t e d _ Q t y _ _ _ B a s e _ _ _ _ _ _ Q t y _ _ t r a n s f _ _ t o _ S u b c o n t r a c t o r _ _ _ _ _ _ Q t y _ _ i n _ T r a n s i t _ _ B a s e _ _ < / E x p e c t e d _ Q t y _ _ _ B a s e _ _ _ _ _ _ Q t y _ _ t r a n s f _ _ t o _ S u b c o n t r a c t o r _ _ _ _ _ _ Q t y _ _ i n _ T r a n s i t _ _ B a s e _ _ > + 
+                     < P r o d _ _ O r d e r _ C o m p o n e n t _ D e s c r i p t i o n   E l e m e n t T y p e = " C o l u m n "   E l e m e n t I d = " 1 3 0 9 7 4 4 4 3 "   D a t a T y p e = " T e x t " > P r o d _ _ O r d e r _ C o m p o n e n t _ D e s c r i p t i o n < / P r o d _ _ O r d e r _ C o m p o n e n t _ D e s c r i p t i o n > + 
+                     < P r o d _ _ O r d e r _ C o m p o n e n t _ L i n e _ N o _   E l e m e n t T y p e = " C o l u m n "   E l e m e n t I d = " 1 2 5 8 8 4 1 3 9 0 "   D a t a T y p e = " I n t e g e r " > P r o d _ _ O r d e r _ C o m p o n e n t _ L i n e _ N o _ < / P r o d _ _ O r d e r _ C o m p o n e n t _ L i n e _ N o _ > + 
+                     < P r o d _ _ O r d e r _ C o m p o n e n t _ P r o d _ _ O r d e r _ L i n e _ N o _   E l e m e n t T y p e = " C o l u m n "   E l e m e n t I d = " 1 7 2 6 5 5 2 3 1 8 "   D a t a T y p e = " I n t e g e r " > P r o d _ _ O r d e r _ C o m p o n e n t _ P r o d _ _ O r d e r _ L i n e _ N o _ < / P r o d _ _ O r d e r _ C o m p o n e n t _ P r o d _ _ O r d e r _ L i n e _ N o _ > + 
+                     < P r o d _ _ O r d e r _ C o m p o n e n t _ P r o d _ _ O r d e r _ N o _   E l e m e n t T y p e = " C o l u m n "   E l e m e n t I d = " 1 4 6 7 3 5 3 9 2 5 "   D a t a T y p e = " C o d e " > P r o d _ _ O r d e r _ C o m p o n e n t _ P r o d _ _ O r d e r _ N o _ < / P r o d _ _ O r d e r _ C o m p o n e n t _ P r o d _ _ O r d e r _ N o _ > + 
+                     < P r o d _ _ O r d e r _ C o m p o n e n t _ R o u t i n g _ L i n k _ C o d e   E l e m e n t T y p e = " C o l u m n "   E l e m e n t I d = " 2 0 6 8 1 8 6 1 8 0 "   D a t a T y p e = " C o d e " > P r o d _ _ O r d e r _ C o m p o n e n t _ R o u t i n g _ L i n k _ C o d e < / P r o d _ _ O r d e r _ C o m p o n e n t _ R o u t i n g _ L i n k _ C o d e > + 
+                     < P r o d _ _ O r d e r _ C o m p o n e n t _ S t a t u s   E l e m e n t T y p e = " C o l u m n "   E l e m e n t I d = " 6 0 3 9 0 9 7 0 3 "   D a t a T y p e = " E n u m " > P r o d _ _ O r d e r _ C o m p o n e n t _ S t a t u s < / P r o d _ _ O r d e r _ C o m p o n e n t _ S t a t u s > + 
+                     < P r o d _ _ O r d e r _ C o m p o n e n t _ _ E x p e c t e d _ Q t y _ _ _ B a s e _ _   E l e m e n t T y p e = " C o l u m n "   E l e m e n t I d = " 1 2 7 8 2 8 1 7 1 "   D a t a T y p e = " D e c i m a l " > P r o d _ _ O r d e r _ C o m p o n e n t _ _ E x p e c t e d _ Q t y _ _ _ B a s e _ _ < / P r o d _ _ O r d e r _ C o m p o n e n t _ _ E x p e c t e d _ Q t y _ _ _ B a s e _ _ > + 
+                     < P r o d _ _ O r d e r _ C o m p o n e n t _ _ E x p e c t e d _ Q t y _ _ _ B a s e _ _ C a p t i o n   E l e m e n t T y p e = " C o l u m n "   E l e m e n t I d = " 1 9 4 1 9 0 5 3 0 9 "   D a t a T y p e = " S t r i n g " > P r o d _ _ O r d e r _ C o m p o n e n t _ _ E x p e c t e d _ Q t y _ _ _ B a s e _ _ C a p t i o n < / P r o d _ _ O r d e r _ C o m p o n e n t _ _ E x p e c t e d _ Q t y _ _ _ B a s e _ _ C a p t i o n > + 
+                     < P r o d _ _ O r d e r _ C o m p o n e n t _ _ I t e m _ N o _ _   E l e m e n t T y p e = " C o l u m n "   E l e m e n t I d = " 6 2 8 6 8 6 0 8 7 "   D a t a T y p e = " C o d e " > P r o d _ _ O r d e r _ C o m p o n e n t _ _ I t e m _ N o _ _ < / P r o d _ _ O r d e r _ C o m p o n e n t _ _ I t e m _ N o _ _ > + 
+                     < P r o d _ _ O r d e r _ C o m p o n e n t _ _ Q t y _ _ i n _ T r a n s i t _ _ B a s e _ _   E l e m e n t T y p e = " C o l u m n "   E l e m e n t I d = " 1 9 9 5 0 4 3 4 3 6 "   D a t a T y p e = " D e c i m a l " > P r o d _ _ O r d e r _ C o m p o n e n t _ _ Q t y _ _ i n _ T r a n s i t _ _ B a s e _ _ < / P r o d _ _ O r d e r _ C o m p o n e n t _ _ Q t y _ _ i n _ T r a n s i t _ _ B a s e _ _ > + 
+                     < P r o d _ _ O r d e r _ C o m p o n e n t _ _ Q t y _ _ i n _ T r a n s i t _ _ B a s e _ _ C a p t i o n   E l e m e n t T y p e = " C o l u m n "   E l e m e n t I d = " 1 3 5 0 0 4 1 6 9 0 "   D a t a T y p e = " S t r i n g " > P r o d _ _ O r d e r _ C o m p o n e n t _ _ Q t y _ _ i n _ T r a n s i t _ _ B a s e _ _ C a p t i o n < / P r o d _ _ O r d e r _ C o m p o n e n t _ _ Q t y _ _ i n _ T r a n s i t _ _ B a s e _ _ C a p t i o n > + 
+                     < P r o d _ _ O r d e r _ C o m p o n e n t _ _ Q t y _ _ t r a n s f _ _ t o _ S u b c o n t r a c t o r _   E l e m e n t T y p e = " C o l u m n "   E l e m e n t I d = " 7 7 0 6 9 1 9 7 8 "   D a t a T y p e = " D e c i m a l " > P r o d _ _ O r d e r _ C o m p o n e n t _ _ Q t y _ _ t r a n s f _ _ t o _ S u b c o n t r a c t o r _ < / P r o d _ _ O r d e r _ C o m p o n e n t _ _ Q t y _ _ t r a n s f _ _ t o _ S u b c o n t r a c t o r _ > + 
+                     < P r o d _ _ O r d e r _ C o m p o n e n t _ _ Q t y _ _ t r a n s f _ _ t o _ S u b c o n t r a c t o r _ C a p t i o n   E l e m e n t T y p e = " C o l u m n "   E l e m e n t I d = " 1 8 2 1 5 6 8 9 8 0 "   D a t a T y p e = " S t r i n g " > P r o d _ _ O r d e r _ C o m p o n e n t _ _ Q t y _ _ t r a n s f _ _ t o _ S u b c o n t r a c t o r _ C a p t i o n < / P r o d _ _ O r d e r _ C o m p o n e n t _ _ Q t y _ _ t r a n s f _ _ t o _ S u b c o n t r a c t o r _ C a p t i o n > + 
+                 < / P r o d _ O r d e r _ C o m p o n e n t > + 
+             < / P r o d _ O r d e r _ R o u t i n g _ L i n e > + 
+         < / P u r c h a s e _ L i n e > + 
+         < T o t a l s   E l e m e n t T y p e = " D a t a I t e m "   E l e m e n t I d = " 1 8 2 3 9 5 0 0 4 4 " > + 
+             < S u b c T o t a l A m o u n t I n c l u d i n g V A T   E l e m e n t T y p e = " C o l u m n "   E l e m e n t I d = " 1 4 1 3 5 2 0 2 3 4 "   D a t a T y p e = " T e x t " > S u b c T o t a l A m o u n t I n c l u d i n g V A T < / S u b c T o t a l A m o u n t I n c l u d i n g V A T > + 
+             < S u b c T o t a l I n v o i c e D i s c o u n t A m o u n t   E l e m e n t T y p e = " C o l u m n "   E l e m e n t I d = " 1 6 8 5 2 6 4 1 4 4 "   D a t a T y p e = " S t r i n g " > S u b c T o t a l I n v o i c e D i s c o u n t A m o u n t < / S u b c T o t a l I n v o i c e D i s c o u n t A m o u n t > + 
+             < S u b c T o t a l N e t A m o u n t   E l e m e n t T y p e = " C o l u m n "   E l e m e n t I d = " 2 0 6 9 4 6 4 2 5 3 "   D a t a T y p e = " S t r i n g " > S u b c T o t a l N e t A m o u n t < / S u b c T o t a l N e t A m o u n t > + 
+             < S u b c T o t a l S u b T o t a l   E l e m e n t T y p e = " C o l u m n "   E l e m e n t I d = " 1 1 1 9 0 1 5 6 1 4 "   D a t a T y p e = " S t r i n g " > S u b c T o t a l S u b T o t a l < / S u b c T o t a l S u b T o t a l > + 
+             < S u b c T o t a l V A T A m o u n t   E l e m e n t T y p e = " C o l u m n "   E l e m e n t I d = " 1 5 4 7 1 2 3 5 2 1 "   D a t a T y p e = " S t r i n g " > S u b c T o t a l V A T A m o u n t < / S u b c T o t a l V A T A m o u n t > + 
+             < S u b c T o t a l V A T B a s e L C Y   E l e m e n t T y p e = " C o l u m n "   E l e m e n t I d = " 1 6 1 4 0 0 8 7 6 0 "   D a t a T y p e = " S t r i n g " > S u b c T o t a l V A T B a s e L C Y < / S u b c T o t a l V A T B a s e L C Y > + 
+             < T o t a l A m o u n t   E l e m e n t T y p e = " C o l u m n "   E l e m e n t I d = " 1 5 5 9 1 6 4 8 7 7 "   D a t a T y p e = " D e c i m a l " > T o t a l A m o u n t < / T o t a l A m o u n t > + 
+             < T o t a l A m o u n t I n c l V A T   E l e m e n t T y p e = " C o l u m n "   E l e m e n t I d = " 1 4 2 2 4 2 7 9 5 2 "   D a t a T y p e = " D e c i m a l " > T o t a l A m o u n t I n c l V A T < / T o t a l A m o u n t I n c l V A T > + 
+             < T o t a l E x c l V A T T e x t   E l e m e n t T y p e = " C o l u m n "   E l e m e n t I d = " 1 3 8 4 8 1 6 4 5 "   D a t a T y p e = " T e x t " > T o t a l E x c l V A T T e x t < / T o t a l E x c l V A T T e x t > + 
+             < T o t a l I n c l V A T T e x t   E l e m e n t T y p e = " C o l u m n "   E l e m e n t I d = " 7 6 1 2 0 3 1 7 7 "   D a t a T y p e = " T e x t " > T o t a l I n c l V A T T e x t < / T o t a l I n c l V A T T e x t > + 
+             < T o t a l I n v o i c e D i s c o u n t A m o u n t   E l e m e n t T y p e = " C o l u m n "   E l e m e n t I d = " 4 0 2 1 7 7 5 1 "   D a t a T y p e = " D e c i m a l " > T o t a l I n v o i c e D i s c o u n t A m o u n t < / T o t a l I n v o i c e D i s c o u n t A m o u n t > + 
+             < T o t a l S u b T o t a l   E l e m e n t T y p e = " C o l u m n "   E l e m e n t I d = " 2 0 9 7 8 7 6 8 0 1 "   D a t a T y p e = " D e c i m a l " > T o t a l S u b T o t a l < / T o t a l S u b T o t a l > + 
+             < T o t a l T e x t   E l e m e n t T y p e = " C o l u m n "   E l e m e n t I d = " 2 3 1 9 1 0 5 1 8 "   D a t a T y p e = " T e x t " > T o t a l T e x t < / T o t a l T e x t > + 
+             < T o t a l V A T A m o u n t   E l e m e n t T y p e = " C o l u m n "   E l e m e n t I d = " 1 6 2 7 1 0 2 3 2 8 "   D a t a T y p e = " D e c i m a l " > T o t a l V A T A m o u n t < / T o t a l V A T A m o u n t > + 
+             < T o t a l V A T B a s e A m o u n t   E l e m e n t T y p e = " C o l u m n "   E l e m e n t I d = " 6 6 3 4 5 3 7 0 9 "   D a t a T y p e = " D e c i m a l " > T o t a l V A T B a s e A m o u n t < / T o t a l V A T B a s e A m o u n t > + 
+             < T o t a l V A T D i s c o u n t A m o u n t   E l e m e n t T y p e = " C o l u m n "   E l e m e n t I d = " 6 8 1 2 9 8 4 1 3 "   D a t a T y p e = " D e c i m a l " > T o t a l V A T D i s c o u n t A m o u n t < / T o t a l V A T D i s c o u n t A m o u n t > + 
+             < V A T A m o u n t T e x t   E l e m e n t T y p e = " C o l u m n "   E l e m e n t I d = " 6 5 0 3 5 8 2 4 7 "   D a t a T y p e = " T e x t " > V A T A m o u n t T e x t < / V A T A m o u n t T e x t > + 
+         < / T o t a l s > + 
+         < V A T C o u n t e r   E l e m e n t T y p e = " D a t a I t e m "   E l e m e n t I d = " 5 5 7 1 2 6 5 0 6 " > + 
+             < V A T A m t L i n e I n v D i s c A m t   E l e m e n t T y p e = " C o l u m n "   E l e m e n t I d = " 1 0 0 7 8 2 8 6 0 "   D a t a T y p e = " D e c i m a l " > V A T A m t L i n e I n v D i s c A m t < / V A T A m t L i n e I n v D i s c A m t > + 
+             < V A T A m t L i n e I n v D i s c B a s e A m t   E l e m e n t T y p e = " C o l u m n "   E l e m e n t I d = " 1 6 9 1 0 0 3 4 1 5 "   D a t a T y p e = " D e c i m a l " > V A T A m t L i n e I n v D i s c B a s e A m t < / V A T A m t L i n e I n v D i s c B a s e A m t > + 
+             < V A T A m t L i n e L i n e A m t   E l e m e n t T y p e = " C o l u m n "   E l e m e n t I d = " 1 8 8 2 1 0 3 2 6 2 "   D a t a T y p e = " D e c i m a l " > V A T A m t L i n e L i n e A m t < / V A T A m t L i n e L i n e A m t > + 
+             < V A T A m t L i n e V A T   E l e m e n t T y p e = " C o l u m n "   E l e m e n t I d = " 2 9 9 0 4 8 9 2 5 "   D a t a T y p e = " D e c i m a l " > V A T A m t L i n e V A T < / V A T A m t L i n e V A T > + 
+             < V A T A m t L i n e V A T A m t   E l e m e n t T y p e = " C o l u m n "   E l e m e n t I d = " 8 4 9 9 7 4 3 4 1 "   D a t a T y p e = " D e c i m a l " > V A T A m t L i n e V A T A m t < / V A T A m t L i n e V A T A m t > + 
+             < V A T A m t L i n e V A T B a s e   E l e m e n t T y p e = " C o l u m n "   E l e m e n t I d = " 1 4 1 9 8 1 6 2 1 8 "   D a t a T y p e = " D e c i m a l " > V A T A m t L i n e V A T B a s e < / V A T A m t L i n e V A T B a s e > + 
+             < V A T A m t L i n e V A T I d e n t i f i e r   E l e m e n t T y p e = " C o l u m n "   E l e m e n t I d = " 4 6 1 3 9 9 7 9 2 "   D a t a T y p e = " C o d e " > V A T A m t L i n e V A T I d e n t i f i e r < / V A T A m t L i n e V A T I d e n t i f i e r > + 
+         < / V A T C o u n t e r > + 
+         < V A T C o u n t e r L C Y   E l e m e n t T y p e = " D a t a I t e m "   E l e m e n t I d = " 9 1 0 2 7 8 4 9 2 " > + 
+             < V A L E x c h R a t e   E l e m e n t T y p e = " C o l u m n "   E l e m e n t I d = " 1 8 3 2 0 7 3 1 5 4 "   D a t a T y p e = " T e x t " > V A L E x c h R a t e < / V A L E x c h R a t e > + 
+             < V A L S p e c L C Y H e a d e r   E l e m e n t T y p e = " C o l u m n "   E l e m e n t I d = " 6 9 9 3 5 8 7 5 8 "   D a t a T y p e = " T e x t " > V A L S p e c L C Y H e a d e r < / V A L S p e c L C Y H e a d e r > + 
+             < V A L V A T A m o u n t L C Y   E l e m e n t T y p e = " C o l u m n "   E l e m e n t I d = " 1 4 4 5 9 7 3 0 8 7 "   D a t a T y p e = " D e c i m a l " > V A L V A T A m o u n t L C Y < / V A L V A T A m o u n t L C Y > + 
+             < V A L V A T B a s e L C Y   E l e m e n t T y p e = " C o l u m n "   E l e m e n t I d = " 1 4 3 9 0 5 7 6 6 6 "   D a t a T y p e = " D e c i m a l " > V A L V A T B a s e L C Y < / V A L V A T B a s e L C Y > + 
+         < / V A T C o u n t e r L C Y > + 
+         < P r e p m t L o o p   E l e m e n t T y p e = " D a t a I t e m "   E l e m e n t I d = " 1 1 5 9 7 3 9 4 0 7 " > + 
+             < P r e p a y m e n t S p e c C a p t i o n   E l e m e n t T y p e = " C o l u m n "   E l e m e n t I d = " 1 6 2 3 2 2 2 3 0 1 "   D a t a T y p e = " L a b e l " > P r e p a y m e n t S p e c C a p t i o n < / P r e p a y m e n t S p e c C a p t i o n > + 
+             < P r e p m t I n v B u D e s c C a p t i o n   E l e m e n t T y p e = " C o l u m n "   E l e m e n t I d = " 1 8 0 7 4 4 6 7 8 "   D a t a T y p e = " L a b e l " > P r e p m t I n v B u D e s c C a p t i o n < / P r e p m t I n v B u D e s c C a p t i o n > + 
+             < P r e p m t I n v B u f A m t   E l e m e n t T y p e = " C o l u m n "   E l e m e n t I d = " 1 0 9 6 9 7 6 1 9 5 "   D a t a T y p e = " D e c i m a l " > P r e p m t I n v B u f A m t < / P r e p m t I n v B u f A m t > + 
+             < P r e p m t I n v B u f D e s c   E l e m e n t T y p e = " C o l u m n "   E l e m e n t I d = " 2 2 5 6 0 3 3 1 8 "   D a t a T y p e = " T e x t " > P r e p m t I n v B u f D e s c < / P r e p m t I n v B u f D e s c > + 
+             < P r e p m t I n v B u f G L A c c N o   E l e m e n t T y p e = " C o l u m n "   E l e m e n t I d = " 8 7 1 9 7 7 4 0 0 "   D a t a T y p e = " C o d e " > P r e p m t I n v B u f G L A c c N o < / P r e p m t I n v B u f G L A c c N o > + 
+             < P r e p m t I n v B u f G L A c c N o C a p t i o n   E l e m e n t T y p e = " C o l u m n "   E l e m e n t I d = " 6 6 7 6 9 7 1 8 "   D a t a T y p e = " L a b e l " > P r e p m t I n v B u f G L A c c N o C a p t i o n < / P r e p m t I n v B u f G L A c c N o C a p t i o n > + 
+             < P r e p m t L i n e A m o u n t   E l e m e n t T y p e = " C o l u m n "   E l e m e n t I d = " 1 3 0 2 3 0 2 1 5 "   D a t a T y p e = " D e c i m a l " > P r e p m t L i n e A m o u n t < / P r e p m t L i n e A m o u n t > + 
+             < P r e p m t T o t a l A m o u n t I n c l V A T   E l e m e n t T y p e = " C o l u m n "   E l e m e n t I d = " 3 2 0 0 3 6 5 9 4 "   D a t a T y p e = " D e c i m a l " > P r e p m t T o t a l A m o u n t I n c l V A T < / P r e p m t T o t a l A m o u n t I n c l V A T > + 
+             < P r e p m t V A T A m o u n t   E l e m e n t T y p e = " C o l u m n "   E l e m e n t I d = " 2 1 0 3 3 9 3 6 6 0 "   D a t a T y p e = " D e c i m a l " > P r e p m t V A T A m o u n t < / P r e p m t V A T A m o u n t > + 
+             < P r e p m t V A T A m o u n t T e x t   E l e m e n t T y p e = " C o l u m n "   E l e m e n t I d = " 1 0 3 1 2 5 7 4 9 5 "   D a t a T y p e = " T e x t " > P r e p m t V A T A m o u n t T e x t < / P r e p m t V A T A m o u n t T e x t > + 
+             < P r e p m t V A T B a s e A m o u n t   E l e m e n t T y p e = " C o l u m n "   E l e m e n t I d = " 1 3 9 2 9 6 6 7 9 "   D a t a T y p e = " D e c i m a l " > P r e p m t V A T B a s e A m o u n t < / P r e p m t V A T B a s e A m o u n t > + 
+             < T o t a l E x c l V A T T e x t 2   E l e m e n t T y p e = " C o l u m n "   E l e m e n t I d = " 1 6 4 4 3 1 2 4 5 7 "   D a t a T y p e = " T e x t " > T o t a l E x c l V A T T e x t 2 < / T o t a l E x c l V A T T e x t 2 > + 
+             < T o t a l I n c l V A T T e x t 2   E l e m e n t T y p e = " C o l u m n "   E l e m e n t I d = " 2 0 8 6 8 8 9 6 8 3 "   D a t a T y p e = " T e x t " > T o t a l I n c l V A T T e x t 2 < / T o t a l I n c l V A T T e x t 2 > + 
+         < / P r e p m t L o o p > + 
+         < P r e p m t V A T C o u n t e r   E l e m e n t T y p e = " D a t a I t e m "   E l e m e n t I d = " 1 6 7 7 6 2 3 1 0 8 " > + 
+             < P r e p m t V A T A m t L i n e L i n e A m t   E l e m e n t T y p e = " C o l u m n "   E l e m e n t I d = " 4 0 2 6 8 5 8 2 4 "   D a t a T y p e = " D e c i m a l " > P r e p m t V A T A m t L i n e L i n e A m t < / P r e p m t V A T A m t L i n e L i n e A m t > + 
+             < P r e p m t V A T A m t L i n e V A T   E l e m e n t T y p e = " C o l u m n "   E l e m e n t I d = " 1 9 1 5 4 9 4 8 5 "   D a t a T y p e = " D e c i m a l " > P r e p m t V A T A m t L i n e V A T < / P r e p m t V A T A m t L i n e V A T > + 
+             < P r e p m t V A T A m t L i n e V A T A m t   E l e m e n t T y p e = " C o l u m n "   E l e m e n t I d = " 1 8 7 1 3 0 1 8 2 9 "   D a t a T y p e = " D e c i m a l " > P r e p m t V A T A m t L i n e V A T A m t < / P r e p m t V A T A m t L i n e V A T A m t > + 
+             < P r e p m t V A T A m t L i n e V A T B a s e   E l e m e n t T y p e = " C o l u m n "   E l e m e n t I d = " 1 2 2 6 9 0 4 6 9 6 "   D a t a T y p e = " D e c i m a l " > P r e p m t V A T A m t L i n e V A T B a s e < / P r e p m t V A T A m t L i n e V A T B a s e > + 
+             < P r e p m t V A T A m t L i n e V A T I d   E l e m e n t T y p e = " C o l u m n "   E l e m e n t I d = " 9 8 2 2 2 4 8 0 0 "   D a t a T y p e = " C o d e " > P r e p m t V A T A m t L i n e V A T I d < / P r e p m t V A T A m t L i n e V A T I d > + 
+             < P r e p y m t V A T A m t S p e c C a p t i o n   E l e m e n t T y p e = " C o l u m n "   E l e m e n t I d = " 2 0 0 9 6 4 9 1 3 8 "   D a t a T y p e = " L a b e l " > P r e p y m t V A T A m t S p e c C a p t i o n < / P r e p y m t V A T A m t S p e c C a p t i o n > + 
+         < / P r e p m t V A T C o u n t e r > + 
+         < L e t t e r T e x t   E l e m e n t T y p e = " D a t a I t e m "   E l e m e n t I d = " 1 5 1 0 3 5 3 8 3 4 " > + 
+             < B o d y T e x t   E l e m e n t T y p e = " C o l u m n "   E l e m e n t I d = " 1 4 9 7 5 9 8 0 8 "   D a t a T y p e = " L a b e l " > B o d y T e x t < / B o d y T e x t > + 
+             < C l o s i n g T e x t   E l e m e n t T y p e = " C o l u m n "   E l e m e n t I d = " 5 1 2 1 3 5 9 0 9 "   D a t a T y p e = " L a b e l " > C l o s i n g T e x t < / C l o s i n g T e x t > + 
+             < G r e e t i n g T e x t   E l e m e n t T y p e = " C o l u m n "   E l e m e n t I d = " 1 1 7 5 2 7 9 2 8 9 "   D a t a T y p e = " L a b e l " > G r e e t i n g T e x t < / G r e e t i n g T e x t > + 
+         < / L e t t e r T e x t > + 
+         < S u b c V A T A m o u n t L i n e   E l e m e n t T y p e = " D a t a I t e m "   E l e m e n t I d = " 3 5 6 2 4 0 9 1 5 " > + 
+             < S u b c I n v o i c e D i s c o u n t A m o u n t _ V A T A m o u n t L i n e   E l e m e n t T y p e = " C o l u m n "   E l e m e n t I d = " 8 7 9 9 1 1 6 2 8 "   D a t a T y p e = " D e c i m a l " > S u b c I n v o i c e D i s c o u n t A m o u n t _ V A T A m o u n t L i n e < / S u b c I n v o i c e D i s c o u n t A m o u n t _ V A T A m o u n t L i n e > + 
+             < S u b c I n v o i c e D i s c o u n t A m o u n t _ V A T A m o u n t L i n e _ L b l   E l e m e n t T y p e = " C o l u m n "   E l e m e n t I d = " 5 7 5 1 3 2 8 1 7 "   D a t a T y p e = " S t r i n g " > S u b c I n v o i c e D i s c o u n t A m o u n t _ V A T A m o u n t L i n e _ L b l < / S u b c I n v o i c e D i s c o u n t A m o u n t _ V A T A m o u n t L i n e _ L b l > + 
+             < S u b c I n v o i c e D i s c o u n t B a s e A m o u n t _ V A T A m o u n t L i n e   E l e m e n t T y p e = " C o l u m n "   E l e m e n t I d = " 1 2 5 3 7 7 7 4 6 5 "   D a t a T y p e = " D e c i m a l " > S u b c I n v o i c e D i s c o u n t B a s e A m o u n t _ V A T A m o u n t L i n e < / S u b c I n v o i c e D i s c o u n t B a s e A m o u n t _ V A T A m o u n t L i n e > + 
+             < S u b c I n v o i c e D i s c o u n t B a s e A m o u n t _ V A T A m o u n t L i n e _ L b l   E l e m e n t T y p e = " C o l u m n "   E l e m e n t I d = " 1 3 7 1 0 3 2 1 9 6 "   D a t a T y p e = " S t r i n g " > S u b c I n v o i c e D i s c o u n t B a s e A m o u n t _ V A T A m o u n t L i n e _ L b l < / S u b c I n v o i c e D i s c o u n t B a s e A m o u n t _ V A T A m o u n t L i n e _ L b l > + 
+             < S u b c L i n e A m o u n t _ V a t A m o u n t L i n e   E l e m e n t T y p e = " C o l u m n "   E l e m e n t I d = " 8 9 2 6 1 3 9 2 2 "   D a t a T y p e = " D e c i m a l " > S u b c L i n e A m o u n t _ V a t A m o u n t L i n e < / S u b c L i n e A m o u n t _ V a t A m o u n t L i n e > + 
+             < S u b c L i n e A m o u n t _ V a t A m o u n t L i n e _ L b l   E l e m e n t T y p e = " C o l u m n "   E l e m e n t I d = " 1 3 8 3 2 3 5 0 7 5 "   D a t a T y p e = " S t r i n g " > S u b c L i n e A m o u n t _ V a t A m o u n t L i n e _ L b l < / S u b c L i n e A m o u n t _ V a t A m o u n t L i n e _ L b l > + 
+             < S u b c N o O f V A T I d e n t i f i e r s   E l e m e n t T y p e = " C o l u m n "   E l e m e n t I d = " 2 5 2 1 5 8 7 1 3 "   D a t a T y p e = " I n t e g e r " > S u b c N o O f V A T I d e n t i f i e r s < / S u b c N o O f V A T I d e n t i f i e r s > + 
+             < S u b c O f L b l   E l e m e n t T y p e = " C o l u m n "   E l e m e n t I d = " 1 0 2 1 9 9 1 9 5 3 "   D a t a T y p e = " L a b e l " > S u b c O f L b l < / S u b c O f L b l > + 
+             < S u b c T o t a l E x c l V A T T e x t   E l e m e n t T y p e = " C o l u m n "   E l e m e n t I d = " 5 0 7 9 2 5 7 7 2 "   D a t a T y p e = " T e x t " > S u b c T o t a l E x c l V A T T e x t < / S u b c T o t a l E x c l V A T T e x t > + 
+             < S u b c T o t a l I n c l V A T T e x t   E l e m e n t T y p e = " C o l u m n "   E l e m e n t I d = " 3 4 1 9 5 1 1 7 0 "   D a t a T y p e = " T e x t " > S u b c T o t a l I n c l V A T T e x t < / S u b c T o t a l I n c l V A T T e x t > + 
+             < S u b c V A T A m o u n t _ V a t A m o u n t L i n e   E l e m e n t T y p e = " C o l u m n "   E l e m e n t I d = " 1 1 9 8 7 6 5 5 8 1 "   D a t a T y p e = " D e c i m a l " > S u b c V A T A m o u n t _ V a t A m o u n t L i n e < / S u b c V A T A m o u n t _ V a t A m o u n t L i n e > + 
+             < S u b c V A T A m o u n t _ V a t A m o u n t L i n e _ L b l   E l e m e n t T y p e = " C o l u m n "   E l e m e n t I d = " 1 5 5 9 2 8 9 0 1 0 "   D a t a T y p e = " S t r i n g " > S u b c V A T A m o u n t _ V a t A m o u n t L i n e _ L b l < / S u b c V A T A m o u n t _ V a t A m o u n t L i n e _ L b l > + 
+             < S u b c V A T B a s e _ V a t A m o u n t L i n e   E l e m e n t T y p e = " C o l u m n "   E l e m e n t I d = " 1 6 3 9 4 2 6 9 4 "   D a t a T y p e = " D e c i m a l " > S u b c V A T B a s e _ V a t A m o u n t L i n e < / S u b c V A T B a s e _ V a t A m o u n t L i n e > + 
+             < S u b c V A T B a s e _ V a t A m o u n t L i n e _ L b l   E l e m e n t T y p e = " C o l u m n "   E l e m e n t I d = " 1 9 2 7 9 5 2 1 8 5 "   D a t a T y p e = " S t r i n g " > S u b c V A T B a s e _ V a t A m o u n t L i n e _ L b l < / S u b c V A T B a s e _ V a t A m o u n t L i n e _ L b l > + 
+             < S u b c V A T C l a u s e 2 D e s c r i p t i o n   E l e m e n t T y p e = " C o l u m n "   E l e m e n t I d = " 1 0 7 3 5 6 6 6 1 6 "   D a t a T y p e = " T e x t " > S u b c V A T C l a u s e 2 D e s c r i p t i o n < / S u b c V A T C l a u s e 2 D e s c r i p t i o n > + 
+             < S u b c V A T C l a u s e 2 D e s c r i p t i o n 2   E l e m e n t T y p e = " C o l u m n "   E l e m e n t I d = " 1 1 4 1 9 2 6 6 7 8 "   D a t a T y p e = " T e x t " > S u b c V A T C l a u s e 2 D e s c r i p t i o n 2 < / S u b c V A T C l a u s e 2 D e s c r i p t i o n 2 > + 
+             < S u b c V A T I d e n t i f i e r _ V a t A m o u n t L i n e   E l e m e n t T y p e = " C o l u m n "   E l e m e n t I d = " 1 3 2 9 3 9 5 5 3 2 "   D a t a T y p e = " C o d e " > S u b c V A T I d e n t i f i e r _ V a t A m o u n t L i n e < / S u b c V A T I d e n t i f i e r _ V a t A m o u n t L i n e > + 
+             < S u b c V A T I d e n t i f i e r _ V a t A m o u n t L i n e _ L b l   E l e m e n t T y p e = " C o l u m n "   E l e m e n t I d = " 2 0 1 3 2 3 4 9 2 7 "   D a t a T y p e = " S t r i n g " > S u b c V A T I d e n t i f i e r _ V a t A m o u n t L i n e _ L b l < / S u b c V A T I d e n t i f i e r _ V a t A m o u n t L i n e _ L b l > + 
+             < S u b c V A T P c t _ V a t A m o u n t L i n e   E l e m e n t T y p e = " C o l u m n "   E l e m e n t I d = " 1 8 7 3 8 8 6 8 3 2 "   D a t a T y p e = " D e c i m a l " > S u b c V A T P c t _ V a t A m o u n t L i n e < / S u b c V A T P c t _ V a t A m o u n t L i n e > + 
+             < S u b c V A T P c t _ V a t A m o u n t L i n e _ L b l   E l e m e n t T y p e = " C o l u m n "   E l e m e n t I d = " 1 0 3 2 1 0 7 9 8 7 "   D a t a T y p e = " S t r i n g " > S u b c V A T P c t _ V a t A m o u n t L i n e _ L b l < / S u b c V A T P c t _ V a t A m o u n t L i n e _ L b l > + 
+             < S u b c V A T P e r c e n t C a p t i o n L b l   E l e m e n t T y p e = " C o l u m n "   E l e m e n t I d = " 2 1 2 9 7 1 7 9 9 4 "   D a t a T y p e = " L a b e l " > S u b c V A T P e r c e n t C a p t i o n L b l < / S u b c V A T P e r c e n t C a p t i o n L b l > + 
+         < / S u b c V A T A m o u n t L i n e > + 
+     < / P u r c h a s e _ H e a d e r > + 
+     < S u b c S h i p T o A d d r   E l e m e n t T y p e = " D a t a I t e m "   E l e m e n t I d = " 1 2 6 7 3 3 6 4 3 2 " > + 
+         < T e m p S U B S h i p T o A d d r _ _ A d d r e s s   E l e m e n t T y p e = " C o l u m n "   E l e m e n t I d = " 7 1 1 0 9 2 3 4 3 "   D a t a T y p e = " T e x t " > T e m p S U B S h i p T o A d d r _ _ A d d r e s s < / T e m p S U B S h i p T o A d d r _ _ A d d r e s s > + 
+     < / S u b c S h i p T o A d d r > + 
+ < / N a v W o r d R e p o r t X m l P a r t > 
+</file>
+
 <file path=customXml/itemProps2.xml><?xml version="1.0" encoding="utf-8"?>
 <ds:datastoreItem xmlns:ds="http://schemas.openxmlformats.org/officeDocument/2006/customXml" ds:itemID="{5446FA42-B0AC-4759-9451-580EE46BDE68}">
   <ds:schemaRefs>

</xml_diff>